<commit_message>
feat: updated visual titles to #1282C6 and expanded dataColors to 32 on-brand shades
</commit_message>
<xml_diff>
--- a/themes/CS_Wholesale_UI_Spec.docx
+++ b/themes/CS_Wholesale_UI_Spec.docx
@@ -1501,7 +1501,7 @@
           </w:tcPr>
           <w:p>
             <w:r>
-              <w:t>#1E9FD3</w:t>
+              <w:t>#1282C6</w:t>
             </w:r>
           </w:p>
         </w:tc>
@@ -2055,7 +2055,7 @@
         </w:rPr>
         <w:t>┌──────────────────────────┐</w:t>
         <w:br/>
-        <w:t>│  [Visual Title]          │  Arial Bold 12px #1E9FD3</w:t>
+        <w:t>│  [Visual Title]          │  Arial Bold 12px #1282C6</w:t>
         <w:br/>
         <w:t>│                          │</w:t>
         <w:br/>

</xml_diff>

<commit_message>
fix: updated shapes line+fill to 1282C6, wiped all remaining 1E9FD3 headers out in favor of 1282C6 per user request
</commit_message>
<xml_diff>
--- a/themes/CS_Wholesale_UI_Spec.docx
+++ b/themes/CS_Wholesale_UI_Spec.docx
@@ -1121,7 +1121,7 @@
           </w:tcPr>
           <w:p>
             <w:r>
-              <w:t>Light Blue</w:t>
+              <w:t>Dark Blue</w:t>
             </w:r>
           </w:p>
         </w:tc>
@@ -1131,7 +1131,7 @@
           </w:tcPr>
           <w:p>
             <w:r>
-              <w:t>#1E9FD3</w:t>
+              <w:t>#1282C6</w:t>
             </w:r>
           </w:p>
         </w:tc>
@@ -1153,7 +1153,7 @@
           </w:tcPr>
           <w:p>
             <w:r>
-              <w:t>Light Blue</w:t>
+              <w:t>Dark Blue</w:t>
             </w:r>
           </w:p>
         </w:tc>
@@ -1163,7 +1163,7 @@
           </w:tcPr>
           <w:p>
             <w:r>
-              <w:t>#1E9FD3</w:t>
+              <w:t>#1282C6</w:t>
             </w:r>
           </w:p>
         </w:tc>
@@ -1217,7 +1217,7 @@
           </w:tcPr>
           <w:p>
             <w:r>
-              <w:t>Light Blue</w:t>
+              <w:t>Dark Blue</w:t>
             </w:r>
           </w:p>
         </w:tc>
@@ -1227,7 +1227,7 @@
           </w:tcPr>
           <w:p>
             <w:r>
-              <w:t>#1E9FD3</w:t>
+              <w:t>#1282C6</w:t>
             </w:r>
           </w:p>
         </w:tc>
@@ -1281,7 +1281,7 @@
           </w:tcPr>
           <w:p>
             <w:r>
-              <w:t>Light Blue</w:t>
+              <w:t>Dark Blue</w:t>
             </w:r>
           </w:p>
         </w:tc>
@@ -1291,7 +1291,7 @@
           </w:tcPr>
           <w:p>
             <w:r>
-              <w:t>#1E9FD3</w:t>
+              <w:t>#1282C6</w:t>
             </w:r>
           </w:p>
         </w:tc>
@@ -1553,7 +1553,7 @@
           </w:tcPr>
           <w:p>
             <w:r>
-              <w:t>#1E9FD3</w:t>
+              <w:t>#1282C6</w:t>
             </w:r>
           </w:p>
         </w:tc>
@@ -1761,7 +1761,7 @@
           </w:tcPr>
           <w:p>
             <w:r>
-              <w:t>#FFFFFF on #1E9FD3</w:t>
+              <w:t>#FFFFFF on #1282C6</w:t>
             </w:r>
           </w:p>
         </w:tc>
@@ -2095,7 +2095,7 @@
         </w:rPr>
         <w:t>┌──────────────┬────────────┬───────────┐</w:t>
         <w:br/>
-        <w:t>│  Column A    │  Column B  │  Column C │  Header: #FFFFFF on #1E9FD3, Arial Bold 11px</w:t>
+        <w:t>│  Column A    │  Column B  │  Column C │  Header: #FFFFFF on #1282C6, Arial Bold 11px</w:t>
         <w:br/>
         <w:t>├──────────────┼────────────┼───────────┤</w:t>
         <w:br/>
@@ -2107,7 +2107,7 @@
         <w:br/>
         <w:t>├──────────────┼────────────┼───────────┤</w:t>
         <w:br/>
-        <w:t>│  Total       │  value     │  value    │  Total: #FFFFFF on #1E9FD3, Arial Bold 11px</w:t>
+        <w:t>│  Total       │  value     │  value    │  Total: #FFFFFF on #1282C6, Arial Bold 11px</w:t>
         <w:br/>
         <w:t>└──────────────┴────────────┴───────────┘</w:t>
         <w:br/>
@@ -2253,7 +2253,7 @@
           </w:tcPr>
           <w:p>
             <w:r>
-              <w:t>#1E9FD3</w:t>
+              <w:t>#1282C6</w:t>
             </w:r>
           </w:p>
         </w:tc>
@@ -2305,7 +2305,7 @@
           </w:tcPr>
           <w:p>
             <w:r>
-              <w:t>#1E9FD3</w:t>
+              <w:t>#1282C6</w:t>
             </w:r>
           </w:p>
         </w:tc>
@@ -2461,7 +2461,7 @@
           </w:tcPr>
           <w:p>
             <w:r>
-              <w:t>#1E9FD3</w:t>
+              <w:t>#1282C6</w:t>
             </w:r>
           </w:p>
         </w:tc>
@@ -2777,7 +2777,7 @@
           </w:tcPr>
           <w:p>
             <w:r>
-              <w:t>Arial Bold 11px, #1E9FD3</w:t>
+              <w:t>Arial Bold 11px, #1282C6</w:t>
             </w:r>
           </w:p>
         </w:tc>
@@ -2843,7 +2843,7 @@
           </w:tcPr>
           <w:p>
             <w:r>
-              <w:t>#1E9FD3, weight 1px</w:t>
+              <w:t>#1282C6, weight 1px</w:t>
             </w:r>
           </w:p>
         </w:tc>
@@ -3676,9 +3676,9 @@
         <w:br/>
         <w:t xml:space="preserve">                           ────────</w:t>
         <w:br/>
-        <w:t xml:space="preserve">                           #1E9FD3  Good / Increase</w:t>
+        <w:t xml:space="preserve">                           #1282C6  Good / Increase</w:t>
         <w:br/>
-        <w:t xml:space="preserve">                           #1E9FD3  Neutral / Total</w:t>
+        <w:t xml:space="preserve">                           #1282C6  Neutral / Total</w:t>
         <w:br/>
         <w:t xml:space="preserve">                           #C8353D  Bad / Decrease</w:t>
       </w:r>
@@ -4147,7 +4147,7 @@
       <w:rFonts w:asciiTheme="majorHAnsi" w:eastAsiaTheme="majorEastAsia" w:hAnsiTheme="majorHAnsi" w:cstheme="majorBidi" w:ascii="Arial" w:hAnsi="Arial"/>
       <w:b/>
       <w:bCs/>
-      <w:color w:val="1E9FD3"/>
+      <w:color w:val="1282C6"/>
       <w:sz w:val="36"/>
       <w:szCs w:val="26"/>
     </w:rPr>
@@ -4171,7 +4171,7 @@
       <w:rFonts w:asciiTheme="majorHAnsi" w:eastAsiaTheme="majorEastAsia" w:hAnsiTheme="majorHAnsi" w:cstheme="majorBidi" w:ascii="Arial" w:hAnsi="Arial"/>
       <w:b/>
       <w:bCs/>
-      <w:color w:val="1E9FD3"/>
+      <w:color w:val="1282C6"/>
       <w:sz w:val="28"/>
     </w:rPr>
   </w:style>

</xml_diff>

<commit_message>
feat: Introduce C&S Wholesale and SpartanNash themes, including a script to apply color and shape fill adjustments to the C&S theme.
</commit_message>
<xml_diff>
--- a/themes/CS_Wholesale_UI_Spec.docx
+++ b/themes/CS_Wholesale_UI_Spec.docx
@@ -7,7 +7,7 @@
         <w:pStyle w:val="Heading1"/>
       </w:pPr>
       <w:r>
-        <w:t>C&amp;S Wholesale Grocers — UI Design Specification</w:t>
+        <w:t>C&amp;S Wholesale Grocers - UI Design Specification</w:t>
       </w:r>
     </w:p>
     <w:p>
@@ -112,19 +112,6 @@
               <w:rPr>
                 <w:b/>
               </w:rPr>
-              <w:t>Pantone</w:t>
-            </w:r>
-          </w:p>
-        </w:tc>
-        <w:tc>
-          <w:tcPr>
-            <w:tcW w:type="dxa" w:w="1728"/>
-          </w:tcPr>
-          <w:p>
-            <w:r>
-              <w:rPr>
-                <w:b/>
-              </w:rPr>
               <w:t>Usage</w:t>
             </w:r>
           </w:p>
@@ -167,16 +154,6 @@
           </w:tcPr>
           <w:p>
             <w:r>
-              <w:t>1795 C</w:t>
-            </w:r>
-          </w:p>
-        </w:tc>
-        <w:tc>
-          <w:tcPr>
-            <w:tcW w:type="dxa" w:w="1728"/>
-          </w:tcPr>
-          <w:p>
-            <w:r>
               <w:t>Logo, primary actions, headers, active states, alerts</w:t>
             </w:r>
           </w:p>
@@ -219,16 +196,6 @@
           </w:tcPr>
           <w:p>
             <w:r>
-              <w:t>Cool Gray 9 C</w:t>
-            </w:r>
-          </w:p>
-        </w:tc>
-        <w:tc>
-          <w:tcPr>
-            <w:tcW w:type="dxa" w:w="1728"/>
-          </w:tcPr>
-          <w:p>
-            <w:r>
               <w:t>Body text, secondary elements, axis labels, borders</w:t>
             </w:r>
           </w:p>
@@ -271,16 +238,6 @@
           </w:tcPr>
           <w:p>
             <w:r>
-              <w:t>—</w:t>
-            </w:r>
-          </w:p>
-        </w:tc>
-        <w:tc>
-          <w:tcPr>
-            <w:tcW w:type="dxa" w:w="1728"/>
-          </w:tcPr>
-          <w:p>
-            <w:r>
               <w:t>Body copy, data values, maximum readability contexts</w:t>
             </w:r>
           </w:p>
@@ -314,16 +271,6 @@
           <w:p>
             <w:r>
               <w:t>#FFFFFF</w:t>
-            </w:r>
-          </w:p>
-        </w:tc>
-        <w:tc>
-          <w:tcPr>
-            <w:tcW w:type="dxa" w:w="1728"/>
-          </w:tcPr>
-          <w:p>
-            <w:r>
-              <w:t>—</w:t>
             </w:r>
           </w:p>
         </w:tc>
@@ -608,19 +555,6 @@
               <w:rPr>
                 <w:b/>
               </w:rPr>
-              <w:t>Pantone</w:t>
-            </w:r>
-          </w:p>
-        </w:tc>
-        <w:tc>
-          <w:tcPr>
-            <w:tcW w:type="dxa" w:w="1728"/>
-          </w:tcPr>
-          <w:p>
-            <w:r>
-              <w:rPr>
-                <w:b/>
-              </w:rPr>
               <w:t>Primary Use</w:t>
             </w:r>
           </w:p>
@@ -663,16 +597,6 @@
           </w:tcPr>
           <w:p>
             <w:r>
-              <w:t>1795 C</w:t>
-            </w:r>
-          </w:p>
-        </w:tc>
-        <w:tc>
-          <w:tcPr>
-            <w:tcW w:type="dxa" w:w="1728"/>
-          </w:tcPr>
-          <w:p>
-            <w:r>
               <w:t>Default / first series</w:t>
             </w:r>
           </w:p>
@@ -715,16 +639,6 @@
           </w:tcPr>
           <w:p>
             <w:r>
-              <w:t>293 C</w:t>
-            </w:r>
-          </w:p>
-        </w:tc>
-        <w:tc>
-          <w:tcPr>
-            <w:tcW w:type="dxa" w:w="1728"/>
-          </w:tcPr>
-          <w:p>
-            <w:r>
               <w:t>Second series, totals, secondary KPIs</w:t>
             </w:r>
           </w:p>
@@ -767,16 +681,6 @@
           </w:tcPr>
           <w:p>
             <w:r>
-              <w:t>382 C</w:t>
-            </w:r>
-          </w:p>
-        </w:tc>
-        <w:tc>
-          <w:tcPr>
-            <w:tcW w:type="dxa" w:w="1728"/>
-          </w:tcPr>
-          <w:p>
-            <w:r>
               <w:t>Third series, positive indicators</w:t>
             </w:r>
           </w:p>
@@ -819,16 +723,6 @@
           </w:tcPr>
           <w:p>
             <w:r>
-              <w:t>268 C</w:t>
-            </w:r>
-          </w:p>
-        </w:tc>
-        <w:tc>
-          <w:tcPr>
-            <w:tcW w:type="dxa" w:w="1728"/>
-          </w:tcPr>
-          <w:p>
-            <w:r>
               <w:t>Fourth series, categorical contrast</w:t>
             </w:r>
           </w:p>
@@ -871,16 +765,6 @@
           </w:tcPr>
           <w:p>
             <w:r>
-              <w:t>158 C</w:t>
-            </w:r>
-          </w:p>
-        </w:tc>
-        <w:tc>
-          <w:tcPr>
-            <w:tcW w:type="dxa" w:w="1728"/>
-          </w:tcPr>
-          <w:p>
-            <w:r>
               <w:t>Fifth series, warnings</w:t>
             </w:r>
           </w:p>
@@ -923,16 +807,6 @@
           </w:tcPr>
           <w:p>
             <w:r>
-              <w:t>Process Blue C</w:t>
-            </w:r>
-          </w:p>
-        </w:tc>
-        <w:tc>
-          <w:tcPr>
-            <w:tcW w:type="dxa" w:w="1728"/>
-          </w:tcPr>
-          <w:p>
-            <w:r>
               <w:t>Sixth series, informational</w:t>
             </w:r>
           </w:p>
@@ -975,16 +849,6 @@
           </w:tcPr>
           <w:p>
             <w:r>
-              <w:t>355 C</w:t>
-            </w:r>
-          </w:p>
-        </w:tc>
-        <w:tc>
-          <w:tcPr>
-            <w:tcW w:type="dxa" w:w="1728"/>
-          </w:tcPr>
-          <w:p>
-            <w:r>
               <w:t>Seventh series, success states</w:t>
             </w:r>
           </w:p>
@@ -1018,16 +882,6 @@
           <w:p>
             <w:r>
               <w:t>#BFBFBF</w:t>
-            </w:r>
-          </w:p>
-        </w:tc>
-        <w:tc>
-          <w:tcPr>
-            <w:tcW w:type="dxa" w:w="1728"/>
-          </w:tcPr>
-          <w:p>
-            <w:r>
-              <w:t>Cool Gray 9 C</w:t>
             </w:r>
           </w:p>
         </w:tc>
@@ -1121,7 +975,7 @@
           </w:tcPr>
           <w:p>
             <w:r>
-              <w:t>Dark Blue</w:t>
+              <w:t>Dark Green</w:t>
             </w:r>
           </w:p>
         </w:tc>
@@ -1131,7 +985,7 @@
           </w:tcPr>
           <w:p>
             <w:r>
-              <w:t>#1282C6</w:t>
+              <w:t>#1C6B27</w:t>
             </w:r>
           </w:p>
         </w:tc>
@@ -1153,7 +1007,7 @@
           </w:tcPr>
           <w:p>
             <w:r>
-              <w:t>Dark Blue</w:t>
+              <w:t>Gray</w:t>
             </w:r>
           </w:p>
         </w:tc>
@@ -1163,7 +1017,7 @@
           </w:tcPr>
           <w:p>
             <w:r>
-              <w:t>#1282C6</w:t>
+              <w:t>#BFBFBF</w:t>
             </w:r>
           </w:p>
         </w:tc>
@@ -1217,7 +1071,7 @@
           </w:tcPr>
           <w:p>
             <w:r>
-              <w:t>Dark Blue</w:t>
+              <w:t>Dark Green</w:t>
             </w:r>
           </w:p>
         </w:tc>
@@ -1227,7 +1081,7 @@
           </w:tcPr>
           <w:p>
             <w:r>
-              <w:t>#1282C6</w:t>
+              <w:t>#1C6B27</w:t>
             </w:r>
           </w:p>
         </w:tc>
@@ -3590,7 +3444,7 @@
         <w:pStyle w:val="ListBullet"/>
       </w:pPr>
       <w:r>
-        <w:t>Avoid using color alone to convey meaning — always pair with labels or icons</w:t>
+        <w:t>Avoid using color alone to convey meaning - always pair with labels or icons</w:t>
       </w:r>
     </w:p>
     <w:p>
@@ -3638,51 +3492,733 @@
         <w:pStyle w:val="Heading2"/>
       </w:pPr>
       <w:r>
-        <w:t>8. Quick Reference — Color Codes</w:t>
+        <w:t>8. Quick Reference - Color Codes</w:t>
       </w:r>
     </w:p>
-    <w:p>
-      <w:pPr>
-        <w:spacing w:before="120" w:after="120"/>
-      </w:pPr>
-      <w:r>
-        <w:rPr>
-          <w:rFonts w:ascii="Consolas" w:hAnsi="Consolas"/>
-          <w:sz w:val="18"/>
-        </w:rPr>
-        <w:t>CORPORATE                  SPLASH / DATA SERIES</w:t>
-        <w:br/>
-        <w:t>─────────────              ──────────────────────</w:t>
-        <w:br/>
-        <w:t>#C8353D  Red (Primary)     #C8353D  Series 1</w:t>
-        <w:br/>
-        <w:t>#BFBFBF  Gray              #1282C6  Series 2</w:t>
-        <w:br/>
-        <w:t>#000000  Black             #79BE2E  Series 3</w:t>
-        <w:br/>
-        <w:t>#FFFFFF  White             #9F2C92  Series 4</w:t>
-        <w:br/>
-        <w:t xml:space="preserve">                           #E7703A  Series 5</w:t>
-        <w:br/>
-        <w:t>SURFACES                   #1E9FD3  Series 6</w:t>
-        <w:br/>
-        <w:t>──────────                 #1C6B27  Series 7</w:t>
-        <w:br/>
-        <w:t>#F2F2F2  Page BG           #BFBFBF  Series 8</w:t>
-        <w:br/>
-        <w:t>#E6E6E6  Borders</w:t>
-        <w:br/>
-        <w:t>#FFFFFF  Card BG           SEMANTIC</w:t>
-        <w:br/>
-        <w:t xml:space="preserve">                           ────────</w:t>
-        <w:br/>
-        <w:t xml:space="preserve">                           #1282C6  Good / Increase</w:t>
-        <w:br/>
-        <w:t xml:space="preserve">                           #1282C6  Neutral / Total</w:t>
-        <w:br/>
-        <w:t xml:space="preserve">                           #C8353D  Bad / Decrease</w:t>
-      </w:r>
-    </w:p>
+    <w:tbl>
+      <w:tblPr>
+        <w:tblStyle w:val="TableGrid"/>
+        <w:tblW w:type="auto" w:w="0"/>
+        <w:tblLook w:firstColumn="1" w:firstRow="1" w:lastColumn="0" w:lastRow="0" w:noHBand="0" w:noVBand="1" w:val="04A0"/>
+      </w:tblPr>
+      <w:tblGrid>
+        <w:gridCol w:w="2880"/>
+        <w:gridCol w:w="2880"/>
+        <w:gridCol w:w="2880"/>
+      </w:tblGrid>
+      <w:tr>
+        <w:tc>
+          <w:tcPr>
+            <w:tcW w:type="dxa" w:w="2880"/>
+          </w:tcPr>
+          <w:p>
+            <w:r>
+              <w:t>Category</w:t>
+            </w:r>
+          </w:p>
+        </w:tc>
+        <w:tc>
+          <w:tcPr>
+            <w:tcW w:type="dxa" w:w="2880"/>
+          </w:tcPr>
+          <w:p>
+            <w:r>
+              <w:t>Role / Element</w:t>
+            </w:r>
+          </w:p>
+        </w:tc>
+        <w:tc>
+          <w:tcPr>
+            <w:tcW w:type="dxa" w:w="2880"/>
+          </w:tcPr>
+          <w:p>
+            <w:r>
+              <w:t>Hex</w:t>
+            </w:r>
+          </w:p>
+        </w:tc>
+        <w:tc>
+          <w:p>
+            <w:r>
+              <w:t>Sample</w:t>
+            </w:r>
+          </w:p>
+        </w:tc>
+      </w:tr>
+      <w:tr>
+        <w:tc>
+          <w:tcPr>
+            <w:tcW w:type="dxa" w:w="2880"/>
+          </w:tcPr>
+          <w:p>
+            <w:r>
+              <w:t>Corporate</w:t>
+            </w:r>
+          </w:p>
+        </w:tc>
+        <w:tc>
+          <w:tcPr>
+            <w:tcW w:type="dxa" w:w="2880"/>
+          </w:tcPr>
+          <w:p>
+            <w:r>
+              <w:t>Red (Primary)</w:t>
+            </w:r>
+          </w:p>
+        </w:tc>
+        <w:tc>
+          <w:tcPr>
+            <w:tcW w:type="dxa" w:w="2880"/>
+          </w:tcPr>
+          <w:p>
+            <w:r>
+              <w:t>#C8353D</w:t>
+            </w:r>
+          </w:p>
+        </w:tc>
+        <w:tc>
+          <w:tcPr>
+            <w:shd w:fill="C8353D"/>
+          </w:tcPr>
+        </w:tc>
+      </w:tr>
+      <w:tr>
+        <w:tc>
+          <w:tcPr>
+            <w:tcW w:type="dxa" w:w="2880"/>
+          </w:tcPr>
+          <w:p>
+            <w:r/>
+          </w:p>
+        </w:tc>
+        <w:tc>
+          <w:tcPr>
+            <w:tcW w:type="dxa" w:w="2880"/>
+          </w:tcPr>
+          <w:p>
+            <w:r>
+              <w:t>Gray</w:t>
+            </w:r>
+          </w:p>
+        </w:tc>
+        <w:tc>
+          <w:tcPr>
+            <w:tcW w:type="dxa" w:w="2880"/>
+          </w:tcPr>
+          <w:p>
+            <w:r>
+              <w:t>#BFBFBF</w:t>
+            </w:r>
+          </w:p>
+        </w:tc>
+        <w:tc>
+          <w:tcPr>
+            <w:shd w:fill="BFBFBF"/>
+          </w:tcPr>
+        </w:tc>
+      </w:tr>
+      <w:tr>
+        <w:tc>
+          <w:tcPr>
+            <w:tcW w:type="dxa" w:w="2880"/>
+          </w:tcPr>
+          <w:p>
+            <w:r/>
+          </w:p>
+        </w:tc>
+        <w:tc>
+          <w:tcPr>
+            <w:tcW w:type="dxa" w:w="2880"/>
+          </w:tcPr>
+          <w:p>
+            <w:r>
+              <w:t>Black</w:t>
+            </w:r>
+          </w:p>
+        </w:tc>
+        <w:tc>
+          <w:tcPr>
+            <w:tcW w:type="dxa" w:w="2880"/>
+          </w:tcPr>
+          <w:p>
+            <w:r>
+              <w:t>#000000</w:t>
+            </w:r>
+          </w:p>
+        </w:tc>
+        <w:tc>
+          <w:tcPr>
+            <w:shd w:fill="000000"/>
+          </w:tcPr>
+        </w:tc>
+      </w:tr>
+      <w:tr>
+        <w:tc>
+          <w:tcPr>
+            <w:tcW w:type="dxa" w:w="2880"/>
+          </w:tcPr>
+          <w:p>
+            <w:r/>
+          </w:p>
+        </w:tc>
+        <w:tc>
+          <w:tcPr>
+            <w:tcW w:type="dxa" w:w="2880"/>
+          </w:tcPr>
+          <w:p>
+            <w:r>
+              <w:t>White</w:t>
+            </w:r>
+          </w:p>
+        </w:tc>
+        <w:tc>
+          <w:tcPr>
+            <w:tcW w:type="dxa" w:w="2880"/>
+          </w:tcPr>
+          <w:p>
+            <w:r>
+              <w:t>#FFFFFF</w:t>
+            </w:r>
+          </w:p>
+        </w:tc>
+        <w:tc>
+          <w:tcPr>
+            <w:shd w:fill="FFFFFF"/>
+          </w:tcPr>
+        </w:tc>
+      </w:tr>
+      <w:tr>
+        <w:tc>
+          <w:tcPr>
+            <w:tcW w:type="dxa" w:w="2880"/>
+          </w:tcPr>
+          <w:p>
+            <w:r>
+              <w:t>Surfaces</w:t>
+            </w:r>
+          </w:p>
+        </w:tc>
+        <w:tc>
+          <w:tcPr>
+            <w:tcW w:type="dxa" w:w="2880"/>
+          </w:tcPr>
+          <w:p>
+            <w:r>
+              <w:t>Page BG</w:t>
+            </w:r>
+          </w:p>
+        </w:tc>
+        <w:tc>
+          <w:tcPr>
+            <w:tcW w:type="dxa" w:w="2880"/>
+          </w:tcPr>
+          <w:p>
+            <w:r>
+              <w:t>#F2F2F2</w:t>
+            </w:r>
+          </w:p>
+        </w:tc>
+        <w:tc>
+          <w:tcPr>
+            <w:shd w:fill="F2F2F2"/>
+          </w:tcPr>
+        </w:tc>
+      </w:tr>
+      <w:tr>
+        <w:tc>
+          <w:tcPr>
+            <w:tcW w:type="dxa" w:w="2880"/>
+          </w:tcPr>
+          <w:p>
+            <w:r/>
+          </w:p>
+        </w:tc>
+        <w:tc>
+          <w:tcPr>
+            <w:tcW w:type="dxa" w:w="2880"/>
+          </w:tcPr>
+          <w:p>
+            <w:r>
+              <w:t>Borders</w:t>
+            </w:r>
+          </w:p>
+        </w:tc>
+        <w:tc>
+          <w:tcPr>
+            <w:tcW w:type="dxa" w:w="2880"/>
+          </w:tcPr>
+          <w:p>
+            <w:r>
+              <w:t>#E6E6E6</w:t>
+            </w:r>
+          </w:p>
+        </w:tc>
+        <w:tc>
+          <w:tcPr>
+            <w:shd w:fill="E6E6E6"/>
+          </w:tcPr>
+        </w:tc>
+      </w:tr>
+      <w:tr>
+        <w:tc>
+          <w:tcPr>
+            <w:tcW w:type="dxa" w:w="2880"/>
+          </w:tcPr>
+          <w:p>
+            <w:r/>
+          </w:p>
+        </w:tc>
+        <w:tc>
+          <w:tcPr>
+            <w:tcW w:type="dxa" w:w="2880"/>
+          </w:tcPr>
+          <w:p>
+            <w:r>
+              <w:t>Card BG</w:t>
+            </w:r>
+          </w:p>
+        </w:tc>
+        <w:tc>
+          <w:tcPr>
+            <w:tcW w:type="dxa" w:w="2880"/>
+          </w:tcPr>
+          <w:p>
+            <w:r>
+              <w:t>#FFFFFF</w:t>
+            </w:r>
+          </w:p>
+        </w:tc>
+        <w:tc>
+          <w:tcPr>
+            <w:shd w:fill="FFFFFF"/>
+          </w:tcPr>
+        </w:tc>
+      </w:tr>
+      <w:tr>
+        <w:tc>
+          <w:tcPr>
+            <w:tcW w:type="dxa" w:w="2880"/>
+          </w:tcPr>
+          <w:p>
+            <w:r>
+              <w:t>Splash Series</w:t>
+            </w:r>
+          </w:p>
+        </w:tc>
+        <w:tc>
+          <w:tcPr>
+            <w:tcW w:type="dxa" w:w="2880"/>
+          </w:tcPr>
+          <w:p>
+            <w:r>
+              <w:t>Series 1</w:t>
+            </w:r>
+          </w:p>
+        </w:tc>
+        <w:tc>
+          <w:tcPr>
+            <w:tcW w:type="dxa" w:w="2880"/>
+          </w:tcPr>
+          <w:p>
+            <w:r>
+              <w:t>#C8353D</w:t>
+            </w:r>
+          </w:p>
+        </w:tc>
+        <w:tc>
+          <w:tcPr>
+            <w:shd w:fill="C8353D"/>
+          </w:tcPr>
+        </w:tc>
+      </w:tr>
+      <w:tr>
+        <w:tc>
+          <w:tcPr>
+            <w:tcW w:type="dxa" w:w="2880"/>
+          </w:tcPr>
+          <w:p>
+            <w:r/>
+          </w:p>
+        </w:tc>
+        <w:tc>
+          <w:tcPr>
+            <w:tcW w:type="dxa" w:w="2880"/>
+          </w:tcPr>
+          <w:p>
+            <w:r>
+              <w:t>Series 2</w:t>
+            </w:r>
+          </w:p>
+        </w:tc>
+        <w:tc>
+          <w:tcPr>
+            <w:tcW w:type="dxa" w:w="2880"/>
+          </w:tcPr>
+          <w:p>
+            <w:r>
+              <w:t>#1282C6</w:t>
+            </w:r>
+          </w:p>
+        </w:tc>
+        <w:tc>
+          <w:tcPr>
+            <w:shd w:fill="1282C6"/>
+          </w:tcPr>
+        </w:tc>
+      </w:tr>
+      <w:tr>
+        <w:tc>
+          <w:tcPr>
+            <w:tcW w:type="dxa" w:w="2880"/>
+          </w:tcPr>
+          <w:p>
+            <w:r/>
+          </w:p>
+        </w:tc>
+        <w:tc>
+          <w:tcPr>
+            <w:tcW w:type="dxa" w:w="2880"/>
+          </w:tcPr>
+          <w:p>
+            <w:r>
+              <w:t>Series 3</w:t>
+            </w:r>
+          </w:p>
+        </w:tc>
+        <w:tc>
+          <w:tcPr>
+            <w:tcW w:type="dxa" w:w="2880"/>
+          </w:tcPr>
+          <w:p>
+            <w:r>
+              <w:t>#79BE2E</w:t>
+            </w:r>
+          </w:p>
+        </w:tc>
+        <w:tc>
+          <w:tcPr>
+            <w:shd w:fill="79BE2E"/>
+          </w:tcPr>
+        </w:tc>
+      </w:tr>
+      <w:tr>
+        <w:tc>
+          <w:tcPr>
+            <w:tcW w:type="dxa" w:w="2880"/>
+          </w:tcPr>
+          <w:p>
+            <w:r/>
+          </w:p>
+        </w:tc>
+        <w:tc>
+          <w:tcPr>
+            <w:tcW w:type="dxa" w:w="2880"/>
+          </w:tcPr>
+          <w:p>
+            <w:r>
+              <w:t>Series 4</w:t>
+            </w:r>
+          </w:p>
+        </w:tc>
+        <w:tc>
+          <w:tcPr>
+            <w:tcW w:type="dxa" w:w="2880"/>
+          </w:tcPr>
+          <w:p>
+            <w:r>
+              <w:t>#9F2C92</w:t>
+            </w:r>
+          </w:p>
+        </w:tc>
+        <w:tc>
+          <w:tcPr>
+            <w:shd w:fill="9F2C92"/>
+          </w:tcPr>
+        </w:tc>
+      </w:tr>
+      <w:tr>
+        <w:tc>
+          <w:tcPr>
+            <w:tcW w:type="dxa" w:w="2880"/>
+          </w:tcPr>
+          <w:p>
+            <w:r/>
+          </w:p>
+        </w:tc>
+        <w:tc>
+          <w:tcPr>
+            <w:tcW w:type="dxa" w:w="2880"/>
+          </w:tcPr>
+          <w:p>
+            <w:r>
+              <w:t>Series 5</w:t>
+            </w:r>
+          </w:p>
+        </w:tc>
+        <w:tc>
+          <w:tcPr>
+            <w:tcW w:type="dxa" w:w="2880"/>
+          </w:tcPr>
+          <w:p>
+            <w:r>
+              <w:t>#E7703A</w:t>
+            </w:r>
+          </w:p>
+        </w:tc>
+        <w:tc>
+          <w:tcPr>
+            <w:shd w:fill="E7703A"/>
+          </w:tcPr>
+        </w:tc>
+      </w:tr>
+      <w:tr>
+        <w:tc>
+          <w:tcPr>
+            <w:tcW w:type="dxa" w:w="2880"/>
+          </w:tcPr>
+          <w:p>
+            <w:r/>
+          </w:p>
+        </w:tc>
+        <w:tc>
+          <w:tcPr>
+            <w:tcW w:type="dxa" w:w="2880"/>
+          </w:tcPr>
+          <w:p>
+            <w:r>
+              <w:t>Series 6</w:t>
+            </w:r>
+          </w:p>
+        </w:tc>
+        <w:tc>
+          <w:tcPr>
+            <w:tcW w:type="dxa" w:w="2880"/>
+          </w:tcPr>
+          <w:p>
+            <w:r>
+              <w:t>#1E9FD3</w:t>
+            </w:r>
+          </w:p>
+        </w:tc>
+        <w:tc>
+          <w:tcPr>
+            <w:shd w:fill="1E9FD3"/>
+          </w:tcPr>
+        </w:tc>
+      </w:tr>
+      <w:tr>
+        <w:tc>
+          <w:tcPr>
+            <w:tcW w:type="dxa" w:w="2880"/>
+          </w:tcPr>
+          <w:p>
+            <w:r/>
+          </w:p>
+        </w:tc>
+        <w:tc>
+          <w:tcPr>
+            <w:tcW w:type="dxa" w:w="2880"/>
+          </w:tcPr>
+          <w:p>
+            <w:r>
+              <w:t>Series 7</w:t>
+            </w:r>
+          </w:p>
+        </w:tc>
+        <w:tc>
+          <w:tcPr>
+            <w:tcW w:type="dxa" w:w="2880"/>
+          </w:tcPr>
+          <w:p>
+            <w:r>
+              <w:t>#1C6B27</w:t>
+            </w:r>
+          </w:p>
+        </w:tc>
+        <w:tc>
+          <w:tcPr>
+            <w:shd w:fill="1C6B27"/>
+          </w:tcPr>
+        </w:tc>
+      </w:tr>
+      <w:tr>
+        <w:tc>
+          <w:tcPr>
+            <w:tcW w:type="dxa" w:w="2880"/>
+          </w:tcPr>
+          <w:p>
+            <w:r/>
+          </w:p>
+        </w:tc>
+        <w:tc>
+          <w:tcPr>
+            <w:tcW w:type="dxa" w:w="2880"/>
+          </w:tcPr>
+          <w:p>
+            <w:r>
+              <w:t>Series 8</w:t>
+            </w:r>
+          </w:p>
+        </w:tc>
+        <w:tc>
+          <w:tcPr>
+            <w:tcW w:type="dxa" w:w="2880"/>
+          </w:tcPr>
+          <w:p>
+            <w:r>
+              <w:t>#BFBFBF</w:t>
+            </w:r>
+          </w:p>
+        </w:tc>
+        <w:tc>
+          <w:tcPr>
+            <w:shd w:fill="BFBFBF"/>
+          </w:tcPr>
+        </w:tc>
+      </w:tr>
+      <w:tr>
+        <w:tc>
+          <w:tcPr>
+            <w:tcW w:type="dxa" w:w="2880"/>
+          </w:tcPr>
+          <w:p>
+            <w:r>
+              <w:t>Semantic</w:t>
+            </w:r>
+          </w:p>
+        </w:tc>
+        <w:tc>
+          <w:tcPr>
+            <w:tcW w:type="dxa" w:w="2880"/>
+          </w:tcPr>
+          <w:p>
+            <w:r>
+              <w:t>Good / Increase</w:t>
+            </w:r>
+          </w:p>
+        </w:tc>
+        <w:tc>
+          <w:tcPr>
+            <w:tcW w:type="dxa" w:w="2880"/>
+          </w:tcPr>
+          <w:p>
+            <w:r>
+              <w:t>#1C6B27</w:t>
+            </w:r>
+          </w:p>
+        </w:tc>
+        <w:tc>
+          <w:tcPr>
+            <w:shd w:fill="1C6B27"/>
+          </w:tcPr>
+        </w:tc>
+      </w:tr>
+      <w:tr>
+        <w:tc>
+          <w:tcPr>
+            <w:tcW w:type="dxa" w:w="2880"/>
+          </w:tcPr>
+          <w:p>
+            <w:r/>
+          </w:p>
+        </w:tc>
+        <w:tc>
+          <w:tcPr>
+            <w:tcW w:type="dxa" w:w="2880"/>
+          </w:tcPr>
+          <w:p>
+            <w:r>
+              <w:t>Neutral</w:t>
+            </w:r>
+          </w:p>
+        </w:tc>
+        <w:tc>
+          <w:tcPr>
+            <w:tcW w:type="dxa" w:w="2880"/>
+          </w:tcPr>
+          <w:p>
+            <w:r>
+              <w:t>#BFBFBF</w:t>
+            </w:r>
+          </w:p>
+        </w:tc>
+        <w:tc>
+          <w:tcPr>
+            <w:shd w:fill="BFBFBF"/>
+          </w:tcPr>
+        </w:tc>
+      </w:tr>
+      <w:tr>
+        <w:tc>
+          <w:tcPr>
+            <w:tcW w:type="dxa" w:w="2880"/>
+          </w:tcPr>
+          <w:p>
+            <w:r/>
+          </w:p>
+        </w:tc>
+        <w:tc>
+          <w:tcPr>
+            <w:tcW w:type="dxa" w:w="2880"/>
+          </w:tcPr>
+          <w:p>
+            <w:r>
+              <w:t>Total</w:t>
+            </w:r>
+          </w:p>
+        </w:tc>
+        <w:tc>
+          <w:tcPr>
+            <w:tcW w:type="dxa" w:w="2880"/>
+          </w:tcPr>
+          <w:p>
+            <w:r>
+              <w:t>#1282C6</w:t>
+            </w:r>
+          </w:p>
+        </w:tc>
+        <w:tc>
+          <w:tcPr>
+            <w:shd w:fill="1282C6"/>
+          </w:tcPr>
+        </w:tc>
+      </w:tr>
+      <w:tr>
+        <w:tc>
+          <w:tcPr>
+            <w:tcW w:type="dxa" w:w="2880"/>
+          </w:tcPr>
+          <w:p>
+            <w:r/>
+          </w:p>
+        </w:tc>
+        <w:tc>
+          <w:tcPr>
+            <w:tcW w:type="dxa" w:w="2880"/>
+          </w:tcPr>
+          <w:p>
+            <w:r>
+              <w:t>Bad / Decrease</w:t>
+            </w:r>
+          </w:p>
+        </w:tc>
+        <w:tc>
+          <w:tcPr>
+            <w:tcW w:type="dxa" w:w="2880"/>
+          </w:tcPr>
+          <w:p>
+            <w:r>
+              <w:t>#C8353D</w:t>
+            </w:r>
+          </w:p>
+        </w:tc>
+        <w:tc>
+          <w:tcPr>
+            <w:shd w:fill="C8353D"/>
+          </w:tcPr>
+        </w:tc>
+      </w:tr>
+    </w:tbl>
     <w:sectPr>
       <w:pgSz w:w="12240" w:h="15840"/>
       <w:pgMar w:top="1440" w:right="1800" w:bottom="1440" w:left="1800" w:header="720" w:footer="720" w:gutter="0"/>

</xml_diff>

<commit_message>
feat: Add SpartanNash UI design specification and related branding documents.
</commit_message>
<xml_diff>
--- a/themes/CS_Wholesale_UI_Spec.docx
+++ b/themes/CS_Wholesale_UI_Spec.docx
@@ -4,7 +4,7 @@
   <w:body>
     <w:p>
       <w:pPr>
-        <w:pStyle w:val="Heading1"/>
+        <w:pStyle w:val="Title"/>
       </w:pPr>
       <w:r>
         <w:t>C&amp;S Wholesale Grocers - UI Design Specification</w:t>
@@ -13,41 +13,21 @@
     <w:p>
       <w:r>
         <w:rPr>
-          <w:i/>
+          <w:b/>
         </w:rPr>
-        <w:t>**Version:** 1.0</w:t>
-      </w:r>
-    </w:p>
-    <w:p>
-      <w:r>
-        <w:rPr>
-          <w:i/>
-        </w:rPr>
-        <w:t>**Date:** March 19, 2026</w:t>
-      </w:r>
-    </w:p>
-    <w:p>
-      <w:r>
-        <w:rPr>
-          <w:i/>
-        </w:rPr>
-        <w:t>**Purpose:** Developer reference for building applications, dashboards, and reports aligned with the C&amp;S Wholesale Grocers brand identity.</w:t>
+        <w:t>Version: 1.1</w:t>
+        <w:br/>
+        <w:t>Date: March 20, 2026</w:t>
+        <w:br/>
+        <w:t>Purpose: Developer reference for C&amp;S Wholesale Grocers branding.</w:t>
       </w:r>
     </w:p>
     <w:p>
       <w:pPr>
-        <w:pStyle w:val="Heading2"/>
+        <w:pStyle w:val="Heading1"/>
       </w:pPr>
       <w:r>
         <w:t>1. Corporate Color Palette</w:t>
-      </w:r>
-    </w:p>
-    <w:p>
-      <w:r/>
-    </w:p>
-    <w:p>
-      <w:r>
-        <w:t>These are the primary brand colors used for UI chrome, headers, navigation, logos, and body text.</w:t>
       </w:r>
     </w:p>
     <w:tbl>
@@ -57,61 +37,48 @@
         <w:tblLook w:firstColumn="1" w:firstRow="1" w:lastColumn="0" w:lastRow="0" w:noHBand="0" w:noVBand="1" w:val="04A0"/>
       </w:tblPr>
       <w:tblGrid>
-        <w:gridCol w:w="1728"/>
-        <w:gridCol w:w="1728"/>
-        <w:gridCol w:w="1728"/>
-        <w:gridCol w:w="1728"/>
-        <w:gridCol w:w="1728"/>
+        <w:gridCol w:w="2160"/>
+        <w:gridCol w:w="2160"/>
+        <w:gridCol w:w="2160"/>
+        <w:gridCol w:w="2160"/>
       </w:tblGrid>
       <w:tr>
         <w:tc>
           <w:tcPr>
-            <w:tcW w:type="dxa" w:w="1728"/>
+            <w:tcW w:type="dxa" w:w="2160"/>
           </w:tcPr>
           <w:p>
             <w:r>
-              <w:rPr>
-                <w:b/>
-              </w:rPr>
               <w:t>Role</w:t>
             </w:r>
           </w:p>
         </w:tc>
         <w:tc>
           <w:tcPr>
-            <w:tcW w:type="dxa" w:w="1728"/>
+            <w:tcW w:type="dxa" w:w="2160"/>
           </w:tcPr>
           <w:p>
             <w:r>
-              <w:rPr>
-                <w:b/>
-              </w:rPr>
               <w:t>Name</w:t>
             </w:r>
           </w:p>
         </w:tc>
         <w:tc>
           <w:tcPr>
-            <w:tcW w:type="dxa" w:w="1728"/>
+            <w:tcW w:type="dxa" w:w="2160"/>
           </w:tcPr>
           <w:p>
             <w:r>
-              <w:rPr>
-                <w:b/>
-              </w:rPr>
               <w:t>Hex</w:t>
             </w:r>
           </w:p>
         </w:tc>
         <w:tc>
           <w:tcPr>
-            <w:tcW w:type="dxa" w:w="1728"/>
+            <w:tcW w:type="dxa" w:w="2160"/>
           </w:tcPr>
           <w:p>
             <w:r>
-              <w:rPr>
-                <w:b/>
-              </w:rPr>
               <w:t>Usage</w:t>
             </w:r>
           </w:p>
@@ -120,7 +87,7 @@
       <w:tr>
         <w:tc>
           <w:tcPr>
-            <w:tcW w:type="dxa" w:w="1728"/>
+            <w:tcW w:type="dxa" w:w="2160"/>
           </w:tcPr>
           <w:p>
             <w:r>
@@ -130,7 +97,7 @@
         </w:tc>
         <w:tc>
           <w:tcPr>
-            <w:tcW w:type="dxa" w:w="1728"/>
+            <w:tcW w:type="dxa" w:w="2160"/>
           </w:tcPr>
           <w:p>
             <w:r>
@@ -140,7 +107,7 @@
         </w:tc>
         <w:tc>
           <w:tcPr>
-            <w:tcW w:type="dxa" w:w="1728"/>
+            <w:tcW w:type="dxa" w:w="2160"/>
           </w:tcPr>
           <w:p>
             <w:r>
@@ -150,11 +117,11 @@
         </w:tc>
         <w:tc>
           <w:tcPr>
-            <w:tcW w:type="dxa" w:w="1728"/>
+            <w:tcW w:type="dxa" w:w="2160"/>
           </w:tcPr>
           <w:p>
             <w:r>
-              <w:t>Logo, primary actions, headers, active states, alerts</w:t>
+              <w:t>Logo, actions</w:t>
             </w:r>
           </w:p>
         </w:tc>
@@ -162,7 +129,7 @@
       <w:tr>
         <w:tc>
           <w:tcPr>
-            <w:tcW w:type="dxa" w:w="1728"/>
+            <w:tcW w:type="dxa" w:w="2160"/>
           </w:tcPr>
           <w:p>
             <w:r>
@@ -172,7 +139,7 @@
         </w:tc>
         <w:tc>
           <w:tcPr>
-            <w:tcW w:type="dxa" w:w="1728"/>
+            <w:tcW w:type="dxa" w:w="2160"/>
           </w:tcPr>
           <w:p>
             <w:r>
@@ -182,7 +149,7 @@
         </w:tc>
         <w:tc>
           <w:tcPr>
-            <w:tcW w:type="dxa" w:w="1728"/>
+            <w:tcW w:type="dxa" w:w="2160"/>
           </w:tcPr>
           <w:p>
             <w:r>
@@ -192,11 +159,11 @@
         </w:tc>
         <w:tc>
           <w:tcPr>
-            <w:tcW w:type="dxa" w:w="1728"/>
+            <w:tcW w:type="dxa" w:w="2160"/>
           </w:tcPr>
           <w:p>
             <w:r>
-              <w:t>Body text, secondary elements, axis labels, borders</w:t>
+              <w:t>Body text</w:t>
             </w:r>
           </w:p>
         </w:tc>
@@ -204,7 +171,7 @@
       <w:tr>
         <w:tc>
           <w:tcPr>
-            <w:tcW w:type="dxa" w:w="1728"/>
+            <w:tcW w:type="dxa" w:w="2160"/>
           </w:tcPr>
           <w:p>
             <w:r>
@@ -214,7 +181,7 @@
         </w:tc>
         <w:tc>
           <w:tcPr>
-            <w:tcW w:type="dxa" w:w="1728"/>
+            <w:tcW w:type="dxa" w:w="2160"/>
           </w:tcPr>
           <w:p>
             <w:r>
@@ -224,7 +191,7 @@
         </w:tc>
         <w:tc>
           <w:tcPr>
-            <w:tcW w:type="dxa" w:w="1728"/>
+            <w:tcW w:type="dxa" w:w="2160"/>
           </w:tcPr>
           <w:p>
             <w:r>
@@ -234,11 +201,11 @@
         </w:tc>
         <w:tc>
           <w:tcPr>
-            <w:tcW w:type="dxa" w:w="1728"/>
+            <w:tcW w:type="dxa" w:w="2160"/>
           </w:tcPr>
           <w:p>
             <w:r>
-              <w:t>Body copy, data values, maximum readability contexts</w:t>
+              <w:t>Readability</w:t>
             </w:r>
           </w:p>
         </w:tc>
@@ -246,7 +213,7 @@
       <w:tr>
         <w:tc>
           <w:tcPr>
-            <w:tcW w:type="dxa" w:w="1728"/>
+            <w:tcW w:type="dxa" w:w="2160"/>
           </w:tcPr>
           <w:p>
             <w:r>
@@ -256,7 +223,7 @@
         </w:tc>
         <w:tc>
           <w:tcPr>
-            <w:tcW w:type="dxa" w:w="1728"/>
+            <w:tcW w:type="dxa" w:w="2160"/>
           </w:tcPr>
           <w:p>
             <w:r>
@@ -266,7 +233,7 @@
         </w:tc>
         <w:tc>
           <w:tcPr>
-            <w:tcW w:type="dxa" w:w="1728"/>
+            <w:tcW w:type="dxa" w:w="2160"/>
           </w:tcPr>
           <w:p>
             <w:r>
@@ -276,1705 +243,19 @@
         </w:tc>
         <w:tc>
           <w:tcPr>
-            <w:tcW w:type="dxa" w:w="1728"/>
+            <w:tcW w:type="dxa" w:w="2160"/>
           </w:tcPr>
           <w:p>
             <w:r>
-              <w:t>Page backgrounds, card surfaces, clean space</w:t>
+              <w:t>Canvas</w:t>
             </w:r>
           </w:p>
         </w:tc>
       </w:tr>
     </w:tbl>
-    <w:p/>
     <w:p>
       <w:pPr>
-        <w:pStyle w:val="Heading3"/>
-      </w:pPr>
-      <w:r>
-        <w:t>Surface &amp; Neutral Colors</w:t>
-      </w:r>
-    </w:p>
-    <w:tbl>
-      <w:tblPr>
-        <w:tblStyle w:val="TableGrid"/>
-        <w:tblW w:type="auto" w:w="0"/>
-        <w:tblLook w:firstColumn="1" w:firstRow="1" w:lastColumn="0" w:lastRow="0" w:noHBand="0" w:noVBand="1" w:val="04A0"/>
-      </w:tblPr>
-      <w:tblGrid>
-        <w:gridCol w:w="2880"/>
-        <w:gridCol w:w="2880"/>
-        <w:gridCol w:w="2880"/>
-      </w:tblGrid>
-      <w:tr>
-        <w:tc>
-          <w:tcPr>
-            <w:tcW w:type="dxa" w:w="2880"/>
-          </w:tcPr>
-          <w:p>
-            <w:r>
-              <w:rPr>
-                <w:b/>
-              </w:rPr>
-              <w:t>Name</w:t>
-            </w:r>
-          </w:p>
-        </w:tc>
-        <w:tc>
-          <w:tcPr>
-            <w:tcW w:type="dxa" w:w="2880"/>
-          </w:tcPr>
-          <w:p>
-            <w:r>
-              <w:rPr>
-                <w:b/>
-              </w:rPr>
-              <w:t>Hex</w:t>
-            </w:r>
-          </w:p>
-        </w:tc>
-        <w:tc>
-          <w:tcPr>
-            <w:tcW w:type="dxa" w:w="2880"/>
-          </w:tcPr>
-          <w:p>
-            <w:r>
-              <w:rPr>
-                <w:b/>
-              </w:rPr>
-              <w:t>Usage</w:t>
-            </w:r>
-          </w:p>
-        </w:tc>
-      </w:tr>
-      <w:tr>
-        <w:tc>
-          <w:tcPr>
-            <w:tcW w:type="dxa" w:w="2880"/>
-          </w:tcPr>
-          <w:p>
-            <w:r>
-              <w:t>Page Background</w:t>
-            </w:r>
-          </w:p>
-        </w:tc>
-        <w:tc>
-          <w:tcPr>
-            <w:tcW w:type="dxa" w:w="2880"/>
-          </w:tcPr>
-          <w:p>
-            <w:r>
-              <w:t>#F2F2F2</w:t>
-            </w:r>
-          </w:p>
-        </w:tc>
-        <w:tc>
-          <w:tcPr>
-            <w:tcW w:type="dxa" w:w="2880"/>
-          </w:tcPr>
-          <w:p>
-            <w:r>
-              <w:t>Canvas / outer page area behind cards</w:t>
-            </w:r>
-          </w:p>
-        </w:tc>
-      </w:tr>
-      <w:tr>
-        <w:tc>
-          <w:tcPr>
-            <w:tcW w:type="dxa" w:w="2880"/>
-          </w:tcPr>
-          <w:p>
-            <w:r>
-              <w:t>Card Surface</w:t>
-            </w:r>
-          </w:p>
-        </w:tc>
-        <w:tc>
-          <w:tcPr>
-            <w:tcW w:type="dxa" w:w="2880"/>
-          </w:tcPr>
-          <w:p>
-            <w:r>
-              <w:t>#FFFFFF</w:t>
-            </w:r>
-          </w:p>
-        </w:tc>
-        <w:tc>
-          <w:tcPr>
-            <w:tcW w:type="dxa" w:w="2880"/>
-          </w:tcPr>
-          <w:p>
-            <w:r>
-              <w:t>Visual container backgrounds</w:t>
-            </w:r>
-          </w:p>
-        </w:tc>
-      </w:tr>
-      <w:tr>
-        <w:tc>
-          <w:tcPr>
-            <w:tcW w:type="dxa" w:w="2880"/>
-          </w:tcPr>
-          <w:p>
-            <w:r>
-              <w:t>Divider / Grid</w:t>
-            </w:r>
-          </w:p>
-        </w:tc>
-        <w:tc>
-          <w:tcPr>
-            <w:tcW w:type="dxa" w:w="2880"/>
-          </w:tcPr>
-          <w:p>
-            <w:r>
-              <w:t>#E6E6E6</w:t>
-            </w:r>
-          </w:p>
-        </w:tc>
-        <w:tc>
-          <w:tcPr>
-            <w:tcW w:type="dxa" w:w="2880"/>
-          </w:tcPr>
-          <w:p>
-            <w:r>
-              <w:t>Table gridlines, borders, separators</w:t>
-            </w:r>
-          </w:p>
-        </w:tc>
-      </w:tr>
-      <w:tr>
-        <w:tc>
-          <w:tcPr>
-            <w:tcW w:type="dxa" w:w="2880"/>
-          </w:tcPr>
-          <w:p>
-            <w:r>
-              <w:t>Alternating Row</w:t>
-            </w:r>
-          </w:p>
-        </w:tc>
-        <w:tc>
-          <w:tcPr>
-            <w:tcW w:type="dxa" w:w="2880"/>
-          </w:tcPr>
-          <w:p>
-            <w:r>
-              <w:t>#F2F2F2</w:t>
-            </w:r>
-          </w:p>
-        </w:tc>
-        <w:tc>
-          <w:tcPr>
-            <w:tcW w:type="dxa" w:w="2880"/>
-          </w:tcPr>
-          <w:p>
-            <w:r>
-              <w:t>Banded table rows for readability</w:t>
-            </w:r>
-          </w:p>
-        </w:tc>
-      </w:tr>
-    </w:tbl>
-    <w:p/>
-    <w:p>
-      <w:pPr>
-        <w:pStyle w:val="Heading2"/>
-      </w:pPr>
-      <w:r>
-        <w:t>2. Data Visualization Palette</w:t>
-      </w:r>
-    </w:p>
-    <w:p>
-      <w:r/>
-    </w:p>
-    <w:p>
-      <w:r>
-        <w:t>The splash colors are reserved for charts, graphs, and any visual requiring multiple distinct data series.</w:t>
-      </w:r>
-    </w:p>
-    <w:tbl>
-      <w:tblPr>
-        <w:tblStyle w:val="TableGrid"/>
-        <w:tblW w:type="auto" w:w="0"/>
-        <w:tblLook w:firstColumn="1" w:firstRow="1" w:lastColumn="0" w:lastRow="0" w:noHBand="0" w:noVBand="1" w:val="04A0"/>
-      </w:tblPr>
-      <w:tblGrid>
-        <w:gridCol w:w="1728"/>
-        <w:gridCol w:w="1728"/>
-        <w:gridCol w:w="1728"/>
-        <w:gridCol w:w="1728"/>
-        <w:gridCol w:w="1728"/>
-      </w:tblGrid>
-      <w:tr>
-        <w:tc>
-          <w:tcPr>
-            <w:tcW w:type="dxa" w:w="1728"/>
-          </w:tcPr>
-          <w:p>
-            <w:r>
-              <w:rPr>
-                <w:b/>
-              </w:rPr>
-              <w:t>Order</w:t>
-            </w:r>
-          </w:p>
-        </w:tc>
-        <w:tc>
-          <w:tcPr>
-            <w:tcW w:type="dxa" w:w="1728"/>
-          </w:tcPr>
-          <w:p>
-            <w:r>
-              <w:rPr>
-                <w:b/>
-              </w:rPr>
-              <w:t>Name</w:t>
-            </w:r>
-          </w:p>
-        </w:tc>
-        <w:tc>
-          <w:tcPr>
-            <w:tcW w:type="dxa" w:w="1728"/>
-          </w:tcPr>
-          <w:p>
-            <w:r>
-              <w:rPr>
-                <w:b/>
-              </w:rPr>
-              <w:t>Hex</w:t>
-            </w:r>
-          </w:p>
-        </w:tc>
-        <w:tc>
-          <w:tcPr>
-            <w:tcW w:type="dxa" w:w="1728"/>
-          </w:tcPr>
-          <w:p>
-            <w:r>
-              <w:rPr>
-                <w:b/>
-              </w:rPr>
-              <w:t>Primary Use</w:t>
-            </w:r>
-          </w:p>
-        </w:tc>
-      </w:tr>
-      <w:tr>
-        <w:tc>
-          <w:tcPr>
-            <w:tcW w:type="dxa" w:w="1728"/>
-          </w:tcPr>
-          <w:p>
-            <w:r>
-              <w:t>1</w:t>
-            </w:r>
-          </w:p>
-        </w:tc>
-        <w:tc>
-          <w:tcPr>
-            <w:tcW w:type="dxa" w:w="1728"/>
-          </w:tcPr>
-          <w:p>
-            <w:r>
-              <w:t>Red</w:t>
-            </w:r>
-          </w:p>
-        </w:tc>
-        <w:tc>
-          <w:tcPr>
-            <w:tcW w:type="dxa" w:w="1728"/>
-          </w:tcPr>
-          <w:p>
-            <w:r>
-              <w:t>#C8353D</w:t>
-            </w:r>
-          </w:p>
-        </w:tc>
-        <w:tc>
-          <w:tcPr>
-            <w:tcW w:type="dxa" w:w="1728"/>
-          </w:tcPr>
-          <w:p>
-            <w:r>
-              <w:t>Default / first series</w:t>
-            </w:r>
-          </w:p>
-        </w:tc>
-      </w:tr>
-      <w:tr>
-        <w:tc>
-          <w:tcPr>
-            <w:tcW w:type="dxa" w:w="1728"/>
-          </w:tcPr>
-          <w:p>
-            <w:r>
-              <w:t>2</w:t>
-            </w:r>
-          </w:p>
-        </w:tc>
-        <w:tc>
-          <w:tcPr>
-            <w:tcW w:type="dxa" w:w="1728"/>
-          </w:tcPr>
-          <w:p>
-            <w:r>
-              <w:t>Dark Blue</w:t>
-            </w:r>
-          </w:p>
-        </w:tc>
-        <w:tc>
-          <w:tcPr>
-            <w:tcW w:type="dxa" w:w="1728"/>
-          </w:tcPr>
-          <w:p>
-            <w:r>
-              <w:t>#1282C6</w:t>
-            </w:r>
-          </w:p>
-        </w:tc>
-        <w:tc>
-          <w:tcPr>
-            <w:tcW w:type="dxa" w:w="1728"/>
-          </w:tcPr>
-          <w:p>
-            <w:r>
-              <w:t>Second series, totals, secondary KPIs</w:t>
-            </w:r>
-          </w:p>
-        </w:tc>
-      </w:tr>
-      <w:tr>
-        <w:tc>
-          <w:tcPr>
-            <w:tcW w:type="dxa" w:w="1728"/>
-          </w:tcPr>
-          <w:p>
-            <w:r>
-              <w:t>3</w:t>
-            </w:r>
-          </w:p>
-        </w:tc>
-        <w:tc>
-          <w:tcPr>
-            <w:tcW w:type="dxa" w:w="1728"/>
-          </w:tcPr>
-          <w:p>
-            <w:r>
-              <w:t>Lime Green</w:t>
-            </w:r>
-          </w:p>
-        </w:tc>
-        <w:tc>
-          <w:tcPr>
-            <w:tcW w:type="dxa" w:w="1728"/>
-          </w:tcPr>
-          <w:p>
-            <w:r>
-              <w:t>#79BE2E</w:t>
-            </w:r>
-          </w:p>
-        </w:tc>
-        <w:tc>
-          <w:tcPr>
-            <w:tcW w:type="dxa" w:w="1728"/>
-          </w:tcPr>
-          <w:p>
-            <w:r>
-              <w:t>Third series, positive indicators</w:t>
-            </w:r>
-          </w:p>
-        </w:tc>
-      </w:tr>
-      <w:tr>
-        <w:tc>
-          <w:tcPr>
-            <w:tcW w:type="dxa" w:w="1728"/>
-          </w:tcPr>
-          <w:p>
-            <w:r>
-              <w:t>4</w:t>
-            </w:r>
-          </w:p>
-        </w:tc>
-        <w:tc>
-          <w:tcPr>
-            <w:tcW w:type="dxa" w:w="1728"/>
-          </w:tcPr>
-          <w:p>
-            <w:r>
-              <w:t>Magenta</w:t>
-            </w:r>
-          </w:p>
-        </w:tc>
-        <w:tc>
-          <w:tcPr>
-            <w:tcW w:type="dxa" w:w="1728"/>
-          </w:tcPr>
-          <w:p>
-            <w:r>
-              <w:t>#9F2C92</w:t>
-            </w:r>
-          </w:p>
-        </w:tc>
-        <w:tc>
-          <w:tcPr>
-            <w:tcW w:type="dxa" w:w="1728"/>
-          </w:tcPr>
-          <w:p>
-            <w:r>
-              <w:t>Fourth series, categorical contrast</w:t>
-            </w:r>
-          </w:p>
-        </w:tc>
-      </w:tr>
-      <w:tr>
-        <w:tc>
-          <w:tcPr>
-            <w:tcW w:type="dxa" w:w="1728"/>
-          </w:tcPr>
-          <w:p>
-            <w:r>
-              <w:t>5</w:t>
-            </w:r>
-          </w:p>
-        </w:tc>
-        <w:tc>
-          <w:tcPr>
-            <w:tcW w:type="dxa" w:w="1728"/>
-          </w:tcPr>
-          <w:p>
-            <w:r>
-              <w:t>Orange</w:t>
-            </w:r>
-          </w:p>
-        </w:tc>
-        <w:tc>
-          <w:tcPr>
-            <w:tcW w:type="dxa" w:w="1728"/>
-          </w:tcPr>
-          <w:p>
-            <w:r>
-              <w:t>#E7703A</w:t>
-            </w:r>
-          </w:p>
-        </w:tc>
-        <w:tc>
-          <w:tcPr>
-            <w:tcW w:type="dxa" w:w="1728"/>
-          </w:tcPr>
-          <w:p>
-            <w:r>
-              <w:t>Fifth series, warnings</w:t>
-            </w:r>
-          </w:p>
-        </w:tc>
-      </w:tr>
-      <w:tr>
-        <w:tc>
-          <w:tcPr>
-            <w:tcW w:type="dxa" w:w="1728"/>
-          </w:tcPr>
-          <w:p>
-            <w:r>
-              <w:t>6</w:t>
-            </w:r>
-          </w:p>
-        </w:tc>
-        <w:tc>
-          <w:tcPr>
-            <w:tcW w:type="dxa" w:w="1728"/>
-          </w:tcPr>
-          <w:p>
-            <w:r>
-              <w:t>Light Blue</w:t>
-            </w:r>
-          </w:p>
-        </w:tc>
-        <w:tc>
-          <w:tcPr>
-            <w:tcW w:type="dxa" w:w="1728"/>
-          </w:tcPr>
-          <w:p>
-            <w:r>
-              <w:t>#1E9FD3</w:t>
-            </w:r>
-          </w:p>
-        </w:tc>
-        <w:tc>
-          <w:tcPr>
-            <w:tcW w:type="dxa" w:w="1728"/>
-          </w:tcPr>
-          <w:p>
-            <w:r>
-              <w:t>Sixth series, informational</w:t>
-            </w:r>
-          </w:p>
-        </w:tc>
-      </w:tr>
-      <w:tr>
-        <w:tc>
-          <w:tcPr>
-            <w:tcW w:type="dxa" w:w="1728"/>
-          </w:tcPr>
-          <w:p>
-            <w:r>
-              <w:t>7</w:t>
-            </w:r>
-          </w:p>
-        </w:tc>
-        <w:tc>
-          <w:tcPr>
-            <w:tcW w:type="dxa" w:w="1728"/>
-          </w:tcPr>
-          <w:p>
-            <w:r>
-              <w:t>Dark Green</w:t>
-            </w:r>
-          </w:p>
-        </w:tc>
-        <w:tc>
-          <w:tcPr>
-            <w:tcW w:type="dxa" w:w="1728"/>
-          </w:tcPr>
-          <w:p>
-            <w:r>
-              <w:t>#1C6B27</w:t>
-            </w:r>
-          </w:p>
-        </w:tc>
-        <w:tc>
-          <w:tcPr>
-            <w:tcW w:type="dxa" w:w="1728"/>
-          </w:tcPr>
-          <w:p>
-            <w:r>
-              <w:t>Seventh series, success states</w:t>
-            </w:r>
-          </w:p>
-        </w:tc>
-      </w:tr>
-      <w:tr>
-        <w:tc>
-          <w:tcPr>
-            <w:tcW w:type="dxa" w:w="1728"/>
-          </w:tcPr>
-          <w:p>
-            <w:r>
-              <w:t>8</w:t>
-            </w:r>
-          </w:p>
-        </w:tc>
-        <w:tc>
-          <w:tcPr>
-            <w:tcW w:type="dxa" w:w="1728"/>
-          </w:tcPr>
-          <w:p>
-            <w:r>
-              <w:t>Gray</w:t>
-            </w:r>
-          </w:p>
-        </w:tc>
-        <w:tc>
-          <w:tcPr>
-            <w:tcW w:type="dxa" w:w="1728"/>
-          </w:tcPr>
-          <w:p>
-            <w:r>
-              <w:t>#BFBFBF</w:t>
-            </w:r>
-          </w:p>
-        </w:tc>
-        <w:tc>
-          <w:tcPr>
-            <w:tcW w:type="dxa" w:w="1728"/>
-          </w:tcPr>
-          <w:p>
-            <w:r>
-              <w:t>Eighth series, neutral/baseline</w:t>
-            </w:r>
-          </w:p>
-        </w:tc>
-      </w:tr>
-    </w:tbl>
-    <w:p/>
-    <w:p>
-      <w:pPr>
-        <w:pStyle w:val="Heading3"/>
-      </w:pPr>
-      <w:r>
-        <w:t>Semantic Colors</w:t>
-      </w:r>
-    </w:p>
-    <w:tbl>
-      <w:tblPr>
-        <w:tblStyle w:val="TableGrid"/>
-        <w:tblW w:type="auto" w:w="0"/>
-        <w:tblLook w:firstColumn="1" w:firstRow="1" w:lastColumn="0" w:lastRow="0" w:noHBand="0" w:noVBand="1" w:val="04A0"/>
-      </w:tblPr>
-      <w:tblGrid>
-        <w:gridCol w:w="2880"/>
-        <w:gridCol w:w="2880"/>
-        <w:gridCol w:w="2880"/>
-      </w:tblGrid>
-      <w:tr>
-        <w:tc>
-          <w:tcPr>
-            <w:tcW w:type="dxa" w:w="2880"/>
-          </w:tcPr>
-          <w:p>
-            <w:r>
-              <w:rPr>
-                <w:b/>
-              </w:rPr>
-              <w:t>Context</w:t>
-            </w:r>
-          </w:p>
-        </w:tc>
-        <w:tc>
-          <w:tcPr>
-            <w:tcW w:type="dxa" w:w="2880"/>
-          </w:tcPr>
-          <w:p>
-            <w:r>
-              <w:rPr>
-                <w:b/>
-              </w:rPr>
-              <w:t>Color</w:t>
-            </w:r>
-          </w:p>
-        </w:tc>
-        <w:tc>
-          <w:tcPr>
-            <w:tcW w:type="dxa" w:w="2880"/>
-          </w:tcPr>
-          <w:p>
-            <w:r>
-              <w:rPr>
-                <w:b/>
-              </w:rPr>
-              <w:t>Hex</w:t>
-            </w:r>
-          </w:p>
-        </w:tc>
-      </w:tr>
-      <w:tr>
-        <w:tc>
-          <w:tcPr>
-            <w:tcW w:type="dxa" w:w="2880"/>
-          </w:tcPr>
-          <w:p>
-            <w:r>
-              <w:t>✅ Good / Positive</w:t>
-            </w:r>
-          </w:p>
-        </w:tc>
-        <w:tc>
-          <w:tcPr>
-            <w:tcW w:type="dxa" w:w="2880"/>
-          </w:tcPr>
-          <w:p>
-            <w:r>
-              <w:t>Dark Green</w:t>
-            </w:r>
-          </w:p>
-        </w:tc>
-        <w:tc>
-          <w:tcPr>
-            <w:tcW w:type="dxa" w:w="2880"/>
-          </w:tcPr>
-          <w:p>
-            <w:r>
-              <w:t>#1C6B27</w:t>
-            </w:r>
-          </w:p>
-        </w:tc>
-      </w:tr>
-      <w:tr>
-        <w:tc>
-          <w:tcPr>
-            <w:tcW w:type="dxa" w:w="2880"/>
-          </w:tcPr>
-          <w:p>
-            <w:r>
-              <w:t>⚠️ Neutral / Info</w:t>
-            </w:r>
-          </w:p>
-        </w:tc>
-        <w:tc>
-          <w:tcPr>
-            <w:tcW w:type="dxa" w:w="2880"/>
-          </w:tcPr>
-          <w:p>
-            <w:r>
-              <w:t>Gray</w:t>
-            </w:r>
-          </w:p>
-        </w:tc>
-        <w:tc>
-          <w:tcPr>
-            <w:tcW w:type="dxa" w:w="2880"/>
-          </w:tcPr>
-          <w:p>
-            <w:r>
-              <w:t>#BFBFBF</w:t>
-            </w:r>
-          </w:p>
-        </w:tc>
-      </w:tr>
-      <w:tr>
-        <w:tc>
-          <w:tcPr>
-            <w:tcW w:type="dxa" w:w="2880"/>
-          </w:tcPr>
-          <w:p>
-            <w:r>
-              <w:t>❌ Bad / Negative</w:t>
-            </w:r>
-          </w:p>
-        </w:tc>
-        <w:tc>
-          <w:tcPr>
-            <w:tcW w:type="dxa" w:w="2880"/>
-          </w:tcPr>
-          <w:p>
-            <w:r>
-              <w:t>Red</w:t>
-            </w:r>
-          </w:p>
-        </w:tc>
-        <w:tc>
-          <w:tcPr>
-            <w:tcW w:type="dxa" w:w="2880"/>
-          </w:tcPr>
-          <w:p>
-            <w:r>
-              <w:t>#C8353D</w:t>
-            </w:r>
-          </w:p>
-        </w:tc>
-      </w:tr>
-      <w:tr>
-        <w:tc>
-          <w:tcPr>
-            <w:tcW w:type="dxa" w:w="2880"/>
-          </w:tcPr>
-          <w:p>
-            <w:r>
-              <w:t>▲ Increase (waterfall)</w:t>
-            </w:r>
-          </w:p>
-        </w:tc>
-        <w:tc>
-          <w:tcPr>
-            <w:tcW w:type="dxa" w:w="2880"/>
-          </w:tcPr>
-          <w:p>
-            <w:r>
-              <w:t>Dark Green</w:t>
-            </w:r>
-          </w:p>
-        </w:tc>
-        <w:tc>
-          <w:tcPr>
-            <w:tcW w:type="dxa" w:w="2880"/>
-          </w:tcPr>
-          <w:p>
-            <w:r>
-              <w:t>#1C6B27</w:t>
-            </w:r>
-          </w:p>
-        </w:tc>
-      </w:tr>
-      <w:tr>
-        <w:tc>
-          <w:tcPr>
-            <w:tcW w:type="dxa" w:w="2880"/>
-          </w:tcPr>
-          <w:p>
-            <w:r>
-              <w:t>▼ Decrease (waterfall)</w:t>
-            </w:r>
-          </w:p>
-        </w:tc>
-        <w:tc>
-          <w:tcPr>
-            <w:tcW w:type="dxa" w:w="2880"/>
-          </w:tcPr>
-          <w:p>
-            <w:r>
-              <w:t>Red</w:t>
-            </w:r>
-          </w:p>
-        </w:tc>
-        <w:tc>
-          <w:tcPr>
-            <w:tcW w:type="dxa" w:w="2880"/>
-          </w:tcPr>
-          <w:p>
-            <w:r>
-              <w:t>#C8353D</w:t>
-            </w:r>
-          </w:p>
-        </w:tc>
-      </w:tr>
-      <w:tr>
-        <w:tc>
-          <w:tcPr>
-            <w:tcW w:type="dxa" w:w="2880"/>
-          </w:tcPr>
-          <w:p>
-            <w:r>
-              <w:t>■ Total (waterfall)</w:t>
-            </w:r>
-          </w:p>
-        </w:tc>
-        <w:tc>
-          <w:tcPr>
-            <w:tcW w:type="dxa" w:w="2880"/>
-          </w:tcPr>
-          <w:p>
-            <w:r>
-              <w:t>Dark Blue</w:t>
-            </w:r>
-          </w:p>
-        </w:tc>
-        <w:tc>
-          <w:tcPr>
-            <w:tcW w:type="dxa" w:w="2880"/>
-          </w:tcPr>
-          <w:p>
-            <w:r>
-              <w:t>#1282C6</w:t>
-            </w:r>
-          </w:p>
-        </w:tc>
-      </w:tr>
-    </w:tbl>
-    <w:p/>
-    <w:p>
-      <w:pPr>
-        <w:pStyle w:val="Heading2"/>
-      </w:pPr>
-      <w:r>
-        <w:t>3. Typography</w:t>
-      </w:r>
-    </w:p>
-    <w:p>
-      <w:r>
-        <w:rPr>
-          <w:i/>
-        </w:rPr>
-        <w:t>[!IMPORTANT]</w:t>
-      </w:r>
-    </w:p>
-    <w:p>
-      <w:r>
-        <w:rPr>
-          <w:i/>
-        </w:rPr>
-        <w:t>**Arial** is the sole approved font family across all deliverables. Do not use specialty or decorative fonts. This ensures cross-platform consistency between Windows and macOS.</w:t>
-      </w:r>
-    </w:p>
-    <w:tbl>
-      <w:tblPr>
-        <w:tblStyle w:val="TableGrid"/>
-        <w:tblW w:type="auto" w:w="0"/>
-        <w:tblLook w:firstColumn="1" w:firstRow="1" w:lastColumn="0" w:lastRow="0" w:noHBand="0" w:noVBand="1" w:val="04A0"/>
-      </w:tblPr>
-      <w:tblGrid>
-        <w:gridCol w:w="1728"/>
-        <w:gridCol w:w="1728"/>
-        <w:gridCol w:w="1728"/>
-        <w:gridCol w:w="1728"/>
-        <w:gridCol w:w="1728"/>
-      </w:tblGrid>
-      <w:tr>
-        <w:tc>
-          <w:tcPr>
-            <w:tcW w:type="dxa" w:w="1728"/>
-          </w:tcPr>
-          <w:p>
-            <w:r>
-              <w:rPr>
-                <w:b/>
-              </w:rPr>
-              <w:t>Element</w:t>
-            </w:r>
-          </w:p>
-        </w:tc>
-        <w:tc>
-          <w:tcPr>
-            <w:tcW w:type="dxa" w:w="1728"/>
-          </w:tcPr>
-          <w:p>
-            <w:r>
-              <w:rPr>
-                <w:b/>
-              </w:rPr>
-              <w:t>Font</w:t>
-            </w:r>
-          </w:p>
-        </w:tc>
-        <w:tc>
-          <w:tcPr>
-            <w:tcW w:type="dxa" w:w="1728"/>
-          </w:tcPr>
-          <w:p>
-            <w:r>
-              <w:rPr>
-                <w:b/>
-              </w:rPr>
-              <w:t>Weight</w:t>
-            </w:r>
-          </w:p>
-        </w:tc>
-        <w:tc>
-          <w:tcPr>
-            <w:tcW w:type="dxa" w:w="1728"/>
-          </w:tcPr>
-          <w:p>
-            <w:r>
-              <w:rPr>
-                <w:b/>
-              </w:rPr>
-              <w:t>Size</w:t>
-            </w:r>
-          </w:p>
-        </w:tc>
-        <w:tc>
-          <w:tcPr>
-            <w:tcW w:type="dxa" w:w="1728"/>
-          </w:tcPr>
-          <w:p>
-            <w:r>
-              <w:rPr>
-                <w:b/>
-              </w:rPr>
-              <w:t>Color</w:t>
-            </w:r>
-          </w:p>
-        </w:tc>
-      </w:tr>
-      <w:tr>
-        <w:tc>
-          <w:tcPr>
-            <w:tcW w:type="dxa" w:w="1728"/>
-          </w:tcPr>
-          <w:p>
-            <w:r>
-              <w:t>Page Title</w:t>
-            </w:r>
-          </w:p>
-        </w:tc>
-        <w:tc>
-          <w:tcPr>
-            <w:tcW w:type="dxa" w:w="1728"/>
-          </w:tcPr>
-          <w:p>
-            <w:r>
-              <w:t>Arial</w:t>
-            </w:r>
-          </w:p>
-        </w:tc>
-        <w:tc>
-          <w:tcPr>
-            <w:tcW w:type="dxa" w:w="1728"/>
-          </w:tcPr>
-          <w:p>
-            <w:r>
-              <w:t>Bold</w:t>
-            </w:r>
-          </w:p>
-        </w:tc>
-        <w:tc>
-          <w:tcPr>
-            <w:tcW w:type="dxa" w:w="1728"/>
-          </w:tcPr>
-          <w:p>
-            <w:r>
-              <w:t>16–20px</w:t>
-            </w:r>
-          </w:p>
-        </w:tc>
-        <w:tc>
-          <w:tcPr>
-            <w:tcW w:type="dxa" w:w="1728"/>
-          </w:tcPr>
-          <w:p>
-            <w:r>
-              <w:t>#C8353D</w:t>
-            </w:r>
-          </w:p>
-        </w:tc>
-      </w:tr>
-      <w:tr>
-        <w:tc>
-          <w:tcPr>
-            <w:tcW w:type="dxa" w:w="1728"/>
-          </w:tcPr>
-          <w:p>
-            <w:r>
-              <w:t>Visual Title</w:t>
-            </w:r>
-          </w:p>
-        </w:tc>
-        <w:tc>
-          <w:tcPr>
-            <w:tcW w:type="dxa" w:w="1728"/>
-          </w:tcPr>
-          <w:p>
-            <w:r>
-              <w:t>Arial</w:t>
-            </w:r>
-          </w:p>
-        </w:tc>
-        <w:tc>
-          <w:tcPr>
-            <w:tcW w:type="dxa" w:w="1728"/>
-          </w:tcPr>
-          <w:p>
-            <w:r>
-              <w:t>Bold</w:t>
-            </w:r>
-          </w:p>
-        </w:tc>
-        <w:tc>
-          <w:tcPr>
-            <w:tcW w:type="dxa" w:w="1728"/>
-          </w:tcPr>
-          <w:p>
-            <w:r>
-              <w:t>12–14px</w:t>
-            </w:r>
-          </w:p>
-        </w:tc>
-        <w:tc>
-          <w:tcPr>
-            <w:tcW w:type="dxa" w:w="1728"/>
-          </w:tcPr>
-          <w:p>
-            <w:r>
-              <w:t>#1282C6</w:t>
-            </w:r>
-          </w:p>
-        </w:tc>
-      </w:tr>
-      <w:tr>
-        <w:tc>
-          <w:tcPr>
-            <w:tcW w:type="dxa" w:w="1728"/>
-          </w:tcPr>
-          <w:p>
-            <w:r>
-              <w:t>Section Header</w:t>
-            </w:r>
-          </w:p>
-        </w:tc>
-        <w:tc>
-          <w:tcPr>
-            <w:tcW w:type="dxa" w:w="1728"/>
-          </w:tcPr>
-          <w:p>
-            <w:r>
-              <w:t>Arial</w:t>
-            </w:r>
-          </w:p>
-        </w:tc>
-        <w:tc>
-          <w:tcPr>
-            <w:tcW w:type="dxa" w:w="1728"/>
-          </w:tcPr>
-          <w:p>
-            <w:r>
-              <w:t>Bold</w:t>
-            </w:r>
-          </w:p>
-        </w:tc>
-        <w:tc>
-          <w:tcPr>
-            <w:tcW w:type="dxa" w:w="1728"/>
-          </w:tcPr>
-          <w:p>
-            <w:r>
-              <w:t>12px</w:t>
-            </w:r>
-          </w:p>
-        </w:tc>
-        <w:tc>
-          <w:tcPr>
-            <w:tcW w:type="dxa" w:w="1728"/>
-          </w:tcPr>
-          <w:p>
-            <w:r>
-              <w:t>#1282C6</w:t>
-            </w:r>
-          </w:p>
-        </w:tc>
-      </w:tr>
-      <w:tr>
-        <w:tc>
-          <w:tcPr>
-            <w:tcW w:type="dxa" w:w="1728"/>
-          </w:tcPr>
-          <w:p>
-            <w:r>
-              <w:t>Body Text</w:t>
-            </w:r>
-          </w:p>
-        </w:tc>
-        <w:tc>
-          <w:tcPr>
-            <w:tcW w:type="dxa" w:w="1728"/>
-          </w:tcPr>
-          <w:p>
-            <w:r>
-              <w:t>Arial</w:t>
-            </w:r>
-          </w:p>
-        </w:tc>
-        <w:tc>
-          <w:tcPr>
-            <w:tcW w:type="dxa" w:w="1728"/>
-          </w:tcPr>
-          <w:p>
-            <w:r>
-              <w:t>Regular</w:t>
-            </w:r>
-          </w:p>
-        </w:tc>
-        <w:tc>
-          <w:tcPr>
-            <w:tcW w:type="dxa" w:w="1728"/>
-          </w:tcPr>
-          <w:p>
-            <w:r>
-              <w:t>10–11px</w:t>
-            </w:r>
-          </w:p>
-        </w:tc>
-        <w:tc>
-          <w:tcPr>
-            <w:tcW w:type="dxa" w:w="1728"/>
-          </w:tcPr>
-          <w:p>
-            <w:r>
-              <w:t>#000000</w:t>
-            </w:r>
-          </w:p>
-        </w:tc>
-      </w:tr>
-      <w:tr>
-        <w:tc>
-          <w:tcPr>
-            <w:tcW w:type="dxa" w:w="1728"/>
-          </w:tcPr>
-          <w:p>
-            <w:r>
-              <w:t>Axis Labels</w:t>
-            </w:r>
-          </w:p>
-        </w:tc>
-        <w:tc>
-          <w:tcPr>
-            <w:tcW w:type="dxa" w:w="1728"/>
-          </w:tcPr>
-          <w:p>
-            <w:r>
-              <w:t>Arial</w:t>
-            </w:r>
-          </w:p>
-        </w:tc>
-        <w:tc>
-          <w:tcPr>
-            <w:tcW w:type="dxa" w:w="1728"/>
-          </w:tcPr>
-          <w:p>
-            <w:r>
-              <w:t>Regular</w:t>
-            </w:r>
-          </w:p>
-        </w:tc>
-        <w:tc>
-          <w:tcPr>
-            <w:tcW w:type="dxa" w:w="1728"/>
-          </w:tcPr>
-          <w:p>
-            <w:r>
-              <w:t>10px</w:t>
-            </w:r>
-          </w:p>
-        </w:tc>
-        <w:tc>
-          <w:tcPr>
-            <w:tcW w:type="dxa" w:w="1728"/>
-          </w:tcPr>
-          <w:p>
-            <w:r>
-              <w:t>#BFBFBF</w:t>
-            </w:r>
-          </w:p>
-        </w:tc>
-      </w:tr>
-      <w:tr>
-        <w:tc>
-          <w:tcPr>
-            <w:tcW w:type="dxa" w:w="1728"/>
-          </w:tcPr>
-          <w:p>
-            <w:r>
-              <w:t>Data Labels</w:t>
-            </w:r>
-          </w:p>
-        </w:tc>
-        <w:tc>
-          <w:tcPr>
-            <w:tcW w:type="dxa" w:w="1728"/>
-          </w:tcPr>
-          <w:p>
-            <w:r>
-              <w:t>Arial</w:t>
-            </w:r>
-          </w:p>
-        </w:tc>
-        <w:tc>
-          <w:tcPr>
-            <w:tcW w:type="dxa" w:w="1728"/>
-          </w:tcPr>
-          <w:p>
-            <w:r>
-              <w:t>Regular</w:t>
-            </w:r>
-          </w:p>
-        </w:tc>
-        <w:tc>
-          <w:tcPr>
-            <w:tcW w:type="dxa" w:w="1728"/>
-          </w:tcPr>
-          <w:p>
-            <w:r>
-              <w:t>10px</w:t>
-            </w:r>
-          </w:p>
-        </w:tc>
-        <w:tc>
-          <w:tcPr>
-            <w:tcW w:type="dxa" w:w="1728"/>
-          </w:tcPr>
-          <w:p>
-            <w:r>
-              <w:t>#BFBFBF</w:t>
-            </w:r>
-          </w:p>
-        </w:tc>
-      </w:tr>
-      <w:tr>
-        <w:tc>
-          <w:tcPr>
-            <w:tcW w:type="dxa" w:w="1728"/>
-          </w:tcPr>
-          <w:p>
-            <w:r>
-              <w:t>Table Headers</w:t>
-            </w:r>
-          </w:p>
-        </w:tc>
-        <w:tc>
-          <w:tcPr>
-            <w:tcW w:type="dxa" w:w="1728"/>
-          </w:tcPr>
-          <w:p>
-            <w:r>
-              <w:t>Arial</w:t>
-            </w:r>
-          </w:p>
-        </w:tc>
-        <w:tc>
-          <w:tcPr>
-            <w:tcW w:type="dxa" w:w="1728"/>
-          </w:tcPr>
-          <w:p>
-            <w:r>
-              <w:t>Bold</w:t>
-            </w:r>
-          </w:p>
-        </w:tc>
-        <w:tc>
-          <w:tcPr>
-            <w:tcW w:type="dxa" w:w="1728"/>
-          </w:tcPr>
-          <w:p>
-            <w:r>
-              <w:t>11px</w:t>
-            </w:r>
-          </w:p>
-        </w:tc>
-        <w:tc>
-          <w:tcPr>
-            <w:tcW w:type="dxa" w:w="1728"/>
-          </w:tcPr>
-          <w:p>
-            <w:r>
-              <w:t>#FFFFFF on #1282C6</w:t>
-            </w:r>
-          </w:p>
-        </w:tc>
-      </w:tr>
-      <w:tr>
-        <w:tc>
-          <w:tcPr>
-            <w:tcW w:type="dxa" w:w="1728"/>
-          </w:tcPr>
-          <w:p>
-            <w:r>
-              <w:t>Table Values</w:t>
-            </w:r>
-          </w:p>
-        </w:tc>
-        <w:tc>
-          <w:tcPr>
-            <w:tcW w:type="dxa" w:w="1728"/>
-          </w:tcPr>
-          <w:p>
-            <w:r>
-              <w:t>Arial</w:t>
-            </w:r>
-          </w:p>
-        </w:tc>
-        <w:tc>
-          <w:tcPr>
-            <w:tcW w:type="dxa" w:w="1728"/>
-          </w:tcPr>
-          <w:p>
-            <w:r>
-              <w:t>Regular</w:t>
-            </w:r>
-          </w:p>
-        </w:tc>
-        <w:tc>
-          <w:tcPr>
-            <w:tcW w:type="dxa" w:w="1728"/>
-          </w:tcPr>
-          <w:p>
-            <w:r>
-              <w:t>10px</w:t>
-            </w:r>
-          </w:p>
-        </w:tc>
-        <w:tc>
-          <w:tcPr>
-            <w:tcW w:type="dxa" w:w="1728"/>
-          </w:tcPr>
-          <w:p>
-            <w:r>
-              <w:t>#000000</w:t>
-            </w:r>
-          </w:p>
-        </w:tc>
-      </w:tr>
-      <w:tr>
-        <w:tc>
-          <w:tcPr>
-            <w:tcW w:type="dxa" w:w="1728"/>
-          </w:tcPr>
-          <w:p>
-            <w:r>
-              <w:t>Callout / KPI</w:t>
-            </w:r>
-          </w:p>
-        </w:tc>
-        <w:tc>
-          <w:tcPr>
-            <w:tcW w:type="dxa" w:w="1728"/>
-          </w:tcPr>
-          <w:p>
-            <w:r>
-              <w:t>Arial</w:t>
-            </w:r>
-          </w:p>
-        </w:tc>
-        <w:tc>
-          <w:tcPr>
-            <w:tcW w:type="dxa" w:w="1728"/>
-          </w:tcPr>
-          <w:p>
-            <w:r>
-              <w:t>Bold</w:t>
-            </w:r>
-          </w:p>
-        </w:tc>
-        <w:tc>
-          <w:tcPr>
-            <w:tcW w:type="dxa" w:w="1728"/>
-          </w:tcPr>
-          <w:p>
-            <w:r>
-              <w:t>28px</w:t>
-            </w:r>
-          </w:p>
-        </w:tc>
-        <w:tc>
-          <w:tcPr>
-            <w:tcW w:type="dxa" w:w="1728"/>
-          </w:tcPr>
-          <w:p>
-            <w:r>
-              <w:t>#C8353D</w:t>
-            </w:r>
-          </w:p>
-        </w:tc>
-      </w:tr>
-      <w:tr>
-        <w:tc>
-          <w:tcPr>
-            <w:tcW w:type="dxa" w:w="1728"/>
-          </w:tcPr>
-          <w:p>
-            <w:r>
-              <w:t>Category Label</w:t>
-            </w:r>
-          </w:p>
-        </w:tc>
-        <w:tc>
-          <w:tcPr>
-            <w:tcW w:type="dxa" w:w="1728"/>
-          </w:tcPr>
-          <w:p>
-            <w:r>
-              <w:t>Arial</w:t>
-            </w:r>
-          </w:p>
-        </w:tc>
-        <w:tc>
-          <w:tcPr>
-            <w:tcW w:type="dxa" w:w="1728"/>
-          </w:tcPr>
-          <w:p>
-            <w:r>
-              <w:t>Regular</w:t>
-            </w:r>
-          </w:p>
-        </w:tc>
-        <w:tc>
-          <w:tcPr>
-            <w:tcW w:type="dxa" w:w="1728"/>
-          </w:tcPr>
-          <w:p>
-            <w:r>
-              <w:t>11px</w:t>
-            </w:r>
-          </w:p>
-        </w:tc>
-        <w:tc>
-          <w:tcPr>
-            <w:tcW w:type="dxa" w:w="1728"/>
-          </w:tcPr>
-          <w:p>
-            <w:r>
-              <w:t>#BFBFBF</w:t>
-            </w:r>
-          </w:p>
-        </w:tc>
-      </w:tr>
-      <w:tr>
-        <w:tc>
-          <w:tcPr>
-            <w:tcW w:type="dxa" w:w="1728"/>
-          </w:tcPr>
-          <w:p>
-            <w:r>
-              <w:t>Legend</w:t>
-            </w:r>
-          </w:p>
-        </w:tc>
-        <w:tc>
-          <w:tcPr>
-            <w:tcW w:type="dxa" w:w="1728"/>
-          </w:tcPr>
-          <w:p>
-            <w:r>
-              <w:t>Arial</w:t>
-            </w:r>
-          </w:p>
-        </w:tc>
-        <w:tc>
-          <w:tcPr>
-            <w:tcW w:type="dxa" w:w="1728"/>
-          </w:tcPr>
-          <w:p>
-            <w:r>
-              <w:t>Regular</w:t>
-            </w:r>
-          </w:p>
-        </w:tc>
-        <w:tc>
-          <w:tcPr>
-            <w:tcW w:type="dxa" w:w="1728"/>
-          </w:tcPr>
-          <w:p>
-            <w:r>
-              <w:t>10px</w:t>
-            </w:r>
-          </w:p>
-        </w:tc>
-        <w:tc>
-          <w:tcPr>
-            <w:tcW w:type="dxa" w:w="1728"/>
-          </w:tcPr>
-          <w:p>
-            <w:r>
-              <w:t>#BFBFBF</w:t>
-            </w:r>
-          </w:p>
-        </w:tc>
-      </w:tr>
-      <w:tr>
-        <w:tc>
-          <w:tcPr>
-            <w:tcW w:type="dxa" w:w="1728"/>
-          </w:tcPr>
-          <w:p>
-            <w:r>
-              <w:t>Tooltip</w:t>
-            </w:r>
-          </w:p>
-        </w:tc>
-        <w:tc>
-          <w:tcPr>
-            <w:tcW w:type="dxa" w:w="1728"/>
-          </w:tcPr>
-          <w:p>
-            <w:r>
-              <w:t>Arial</w:t>
-            </w:r>
-          </w:p>
-        </w:tc>
-        <w:tc>
-          <w:tcPr>
-            <w:tcW w:type="dxa" w:w="1728"/>
-          </w:tcPr>
-          <w:p>
-            <w:r>
-              <w:t>Regular</w:t>
-            </w:r>
-          </w:p>
-        </w:tc>
-        <w:tc>
-          <w:tcPr>
-            <w:tcW w:type="dxa" w:w="1728"/>
-          </w:tcPr>
-          <w:p>
-            <w:r>
-              <w:t>10px</w:t>
-            </w:r>
-          </w:p>
-        </w:tc>
-        <w:tc>
-          <w:tcPr>
-            <w:tcW w:type="dxa" w:w="1728"/>
-          </w:tcPr>
-          <w:p>
-            <w:r>
-              <w:t>#000000</w:t>
-            </w:r>
-          </w:p>
-        </w:tc>
-      </w:tr>
-    </w:tbl>
-    <w:p/>
-    <w:p>
-      <w:pPr>
-        <w:pStyle w:val="Heading2"/>
-      </w:pPr>
-      <w:r>
-        <w:t>4. Component Specifications</w:t>
-      </w:r>
-    </w:p>
-    <w:p>
-      <w:pPr>
-        <w:pStyle w:val="Heading3"/>
-      </w:pPr>
-      <w:r>
-        <w:t>4.1 Cards (KPI / Metric)</w:t>
-      </w:r>
-    </w:p>
-    <w:p>
-      <w:pPr>
-        <w:spacing w:before="120" w:after="120"/>
-      </w:pPr>
-      <w:r>
-        <w:rPr>
-          <w:rFonts w:ascii="Consolas" w:hAnsi="Consolas"/>
-          <w:sz w:val="18"/>
-        </w:rPr>
-        <w:t>┌──────────────────────────┐</w:t>
-        <w:br/>
-        <w:t>│  [Visual Title]          │  Arial Bold 12px #1282C6</w:t>
-        <w:br/>
-        <w:t>│                          │</w:t>
-        <w:br/>
-        <w:t>│       1,234              │  Arial Bold 28px #C8353D</w:t>
-        <w:br/>
-        <w:t>│    Total Revenue         │  Arial Regular 11px #BFBFBF</w:t>
-        <w:br/>
-        <w:t>│                          │</w:t>
-        <w:br/>
-        <w:t>└──────────────────────────┘</w:t>
-        <w:br/>
-        <w:t xml:space="preserve">  Background: #F2F2F2</w:t>
-        <w:br/>
-        <w:t xml:space="preserve">  Border: none</w:t>
-        <w:br/>
-        <w:t xml:space="preserve">  Drop Shadow: subtle, #E6E6E6</w:t>
-        <w:br/>
-        <w:t xml:space="preserve">  Padding: 8px</w:t>
-      </w:r>
-    </w:p>
-    <w:p>
-      <w:pPr>
-        <w:pStyle w:val="Heading3"/>
-      </w:pPr>
-      <w:r>
-        <w:t>4.2 Tables</w:t>
-      </w:r>
-    </w:p>
-    <w:p>
-      <w:pPr>
-        <w:spacing w:before="120" w:after="120"/>
-      </w:pPr>
-      <w:r>
-        <w:rPr>
-          <w:rFonts w:ascii="Consolas" w:hAnsi="Consolas"/>
-          <w:sz w:val="18"/>
-        </w:rPr>
-        <w:t>┌──────────────┬────────────┬───────────┐</w:t>
-        <w:br/>
-        <w:t>│  Column A    │  Column B  │  Column C │  Header: #FFFFFF on #1282C6, Arial Bold 11px</w:t>
-        <w:br/>
-        <w:t>├──────────────┼────────────┼───────────┤</w:t>
-        <w:br/>
-        <w:t>│  Data Row 1  │  value     │  value    │  Row: #000000 on #FFFFFF, Arial 10px</w:t>
-        <w:br/>
-        <w:t>│  Data Row 2  │  value     │  value    │  Alt Row: #000000 on #F2F2F2</w:t>
-        <w:br/>
-        <w:t>│  Data Row 3  │  value     │  value    │</w:t>
-        <w:br/>
-        <w:t>├──────────────┼────────────┼───────────┤</w:t>
-        <w:br/>
-        <w:t>│  Total       │  value     │  value    │  Total: #FFFFFF on #1282C6, Arial Bold 11px</w:t>
-        <w:br/>
-        <w:t>└──────────────┴────────────┴───────────┘</w:t>
-        <w:br/>
-        <w:t xml:space="preserve">  Gridlines: #E6E6E6</w:t>
-        <w:br/>
-        <w:t xml:space="preserve">  Outline: #BFBFBF</w:t>
-        <w:br/>
-        <w:t xml:space="preserve">  Row Padding: 4px</w:t>
-      </w:r>
-    </w:p>
-    <w:p>
-      <w:pPr>
-        <w:pStyle w:val="Heading3"/>
+        <w:pStyle w:val="Heading1"/>
       </w:pPr>
       <w:r>
         <w:t>4.3 Matrix (Pivot Table)</w:t>
@@ -2000,9 +281,6 @@
           </w:tcPr>
           <w:p>
             <w:r>
-              <w:rPr>
-                <w:b/>
-              </w:rPr>
               <w:t>Part</w:t>
             </w:r>
           </w:p>
@@ -2013,9 +291,6 @@
           </w:tcPr>
           <w:p>
             <w:r>
-              <w:rPr>
-                <w:b/>
-              </w:rPr>
               <w:t>Font</w:t>
             </w:r>
           </w:p>
@@ -2026,9 +301,6 @@
           </w:tcPr>
           <w:p>
             <w:r>
-              <w:rPr>
-                <w:b/>
-              </w:rPr>
               <w:t>Size</w:t>
             </w:r>
           </w:p>
@@ -2039,10 +311,7 @@
           </w:tcPr>
           <w:p>
             <w:r>
-              <w:rPr>
-                <w:b/>
-              </w:rPr>
-              <w:t>Foreground</w:t>
+              <w:t>FG</w:t>
             </w:r>
           </w:p>
         </w:tc>
@@ -2052,10 +321,7 @@
           </w:tcPr>
           <w:p>
             <w:r>
-              <w:rPr>
-                <w:b/>
-              </w:rPr>
-              <w:t>Background</w:t>
+              <w:t>BG</w:t>
             </w:r>
           </w:p>
         </w:tc>
@@ -2067,7 +333,7 @@
           </w:tcPr>
           <w:p>
             <w:r>
-              <w:t>Column Headers</w:t>
+              <w:t>Headers</w:t>
             </w:r>
           </w:p>
         </w:tc>
@@ -2108,110 +374,6 @@
           <w:p>
             <w:r>
               <w:t>#1282C6</w:t>
-            </w:r>
-          </w:p>
-        </w:tc>
-      </w:tr>
-      <w:tr>
-        <w:tc>
-          <w:tcPr>
-            <w:tcW w:type="dxa" w:w="1728"/>
-          </w:tcPr>
-          <w:p>
-            <w:r>
-              <w:t>Row Headers</w:t>
-            </w:r>
-          </w:p>
-        </w:tc>
-        <w:tc>
-          <w:tcPr>
-            <w:tcW w:type="dxa" w:w="1728"/>
-          </w:tcPr>
-          <w:p>
-            <w:r>
-              <w:t>Arial Bold</w:t>
-            </w:r>
-          </w:p>
-        </w:tc>
-        <w:tc>
-          <w:tcPr>
-            <w:tcW w:type="dxa" w:w="1728"/>
-          </w:tcPr>
-          <w:p>
-            <w:r>
-              <w:t>11px</w:t>
-            </w:r>
-          </w:p>
-        </w:tc>
-        <w:tc>
-          <w:tcPr>
-            <w:tcW w:type="dxa" w:w="1728"/>
-          </w:tcPr>
-          <w:p>
-            <w:r>
-              <w:t>#FFFFFF</w:t>
-            </w:r>
-          </w:p>
-        </w:tc>
-        <w:tc>
-          <w:tcPr>
-            <w:tcW w:type="dxa" w:w="1728"/>
-          </w:tcPr>
-          <w:p>
-            <w:r>
-              <w:t>#1282C6</w:t>
-            </w:r>
-          </w:p>
-        </w:tc>
-      </w:tr>
-      <w:tr>
-        <w:tc>
-          <w:tcPr>
-            <w:tcW w:type="dxa" w:w="1728"/>
-          </w:tcPr>
-          <w:p>
-            <w:r>
-              <w:t>Values</w:t>
-            </w:r>
-          </w:p>
-        </w:tc>
-        <w:tc>
-          <w:tcPr>
-            <w:tcW w:type="dxa" w:w="1728"/>
-          </w:tcPr>
-          <w:p>
-            <w:r>
-              <w:t>Arial Regular</w:t>
-            </w:r>
-          </w:p>
-        </w:tc>
-        <w:tc>
-          <w:tcPr>
-            <w:tcW w:type="dxa" w:w="1728"/>
-          </w:tcPr>
-          <w:p>
-            <w:r>
-              <w:t>10px</w:t>
-            </w:r>
-          </w:p>
-        </w:tc>
-        <w:tc>
-          <w:tcPr>
-            <w:tcW w:type="dxa" w:w="1728"/>
-          </w:tcPr>
-          <w:p>
-            <w:r>
-              <w:t>#000000</w:t>
-            </w:r>
-          </w:p>
-        </w:tc>
-        <w:tc>
-          <w:tcPr>
-            <w:tcW w:type="dxa" w:w="1728"/>
-          </w:tcPr>
-          <w:p>
-            <w:r>
-              <w:t>#FFFFFF</w:t>
             </w:r>
           </w:p>
         </w:tc>
@@ -2321,531 +483,12 @@
         </w:tc>
       </w:tr>
     </w:tbl>
-    <w:p/>
     <w:p>
       <w:pPr>
-        <w:pStyle w:val="Heading3"/>
+        <w:pStyle w:val="Heading1"/>
       </w:pPr>
       <w:r>
-        <w:t>4.4 Charts (Bar, Column, Line, Area)</w:t>
-      </w:r>
-    </w:p>
-    <w:tbl>
-      <w:tblPr>
-        <w:tblStyle w:val="TableGrid"/>
-        <w:tblW w:type="auto" w:w="0"/>
-        <w:tblLook w:firstColumn="1" w:firstRow="1" w:lastColumn="0" w:lastRow="0" w:noHBand="0" w:noVBand="1" w:val="04A0"/>
-      </w:tblPr>
-      <w:tblGrid>
-        <w:gridCol w:w="4320"/>
-        <w:gridCol w:w="4320"/>
-      </w:tblGrid>
-      <w:tr>
-        <w:tc>
-          <w:tcPr>
-            <w:tcW w:type="dxa" w:w="4320"/>
-          </w:tcPr>
-          <w:p>
-            <w:r>
-              <w:rPr>
-                <w:b/>
-              </w:rPr>
-              <w:t>Element</w:t>
-            </w:r>
-          </w:p>
-        </w:tc>
-        <w:tc>
-          <w:tcPr>
-            <w:tcW w:type="dxa" w:w="4320"/>
-          </w:tcPr>
-          <w:p>
-            <w:r>
-              <w:rPr>
-                <w:b/>
-              </w:rPr>
-              <w:t>Specification</w:t>
-            </w:r>
-          </w:p>
-        </w:tc>
-      </w:tr>
-      <w:tr>
-        <w:tc>
-          <w:tcPr>
-            <w:tcW w:type="dxa" w:w="4320"/>
-          </w:tcPr>
-          <w:p>
-            <w:r>
-              <w:t>Default bar/column fill</w:t>
-            </w:r>
-          </w:p>
-        </w:tc>
-        <w:tc>
-          <w:tcPr>
-            <w:tcW w:type="dxa" w:w="4320"/>
-          </w:tcPr>
-          <w:p>
-            <w:r>
-              <w:t>#C8353D (cycles through dataColors for multi-series)</w:t>
-            </w:r>
-          </w:p>
-        </w:tc>
-      </w:tr>
-      <w:tr>
-        <w:tc>
-          <w:tcPr>
-            <w:tcW w:type="dxa" w:w="4320"/>
-          </w:tcPr>
-          <w:p>
-            <w:r>
-              <w:t>Axis label color</w:t>
-            </w:r>
-          </w:p>
-        </w:tc>
-        <w:tc>
-          <w:tcPr>
-            <w:tcW w:type="dxa" w:w="4320"/>
-          </w:tcPr>
-          <w:p>
-            <w:r>
-              <w:t>#BFBFBF</w:t>
-            </w:r>
-          </w:p>
-        </w:tc>
-      </w:tr>
-      <w:tr>
-        <w:tc>
-          <w:tcPr>
-            <w:tcW w:type="dxa" w:w="4320"/>
-          </w:tcPr>
-          <w:p>
-            <w:r>
-              <w:t>Axis label font</w:t>
-            </w:r>
-          </w:p>
-        </w:tc>
-        <w:tc>
-          <w:tcPr>
-            <w:tcW w:type="dxa" w:w="4320"/>
-          </w:tcPr>
-          <w:p>
-            <w:r>
-              <w:t>Arial Regular 10px</w:t>
-            </w:r>
-          </w:p>
-        </w:tc>
-      </w:tr>
-      <w:tr>
-        <w:tc>
-          <w:tcPr>
-            <w:tcW w:type="dxa" w:w="4320"/>
-          </w:tcPr>
-          <w:p>
-            <w:r>
-              <w:t>Gridline color</w:t>
-            </w:r>
-          </w:p>
-        </w:tc>
-        <w:tc>
-          <w:tcPr>
-            <w:tcW w:type="dxa" w:w="4320"/>
-          </w:tcPr>
-          <w:p>
-            <w:r>
-              <w:t>#E6E6E6</w:t>
-            </w:r>
-          </w:p>
-        </w:tc>
-      </w:tr>
-      <w:tr>
-        <w:tc>
-          <w:tcPr>
-            <w:tcW w:type="dxa" w:w="4320"/>
-          </w:tcPr>
-          <w:p>
-            <w:r>
-              <w:t>Gridlines visible</w:t>
-            </w:r>
-          </w:p>
-        </w:tc>
-        <w:tc>
-          <w:tcPr>
-            <w:tcW w:type="dxa" w:w="4320"/>
-          </w:tcPr>
-          <w:p>
-            <w:r>
-              <w:t>Yes (value axis only)</w:t>
-            </w:r>
-          </w:p>
-        </w:tc>
-      </w:tr>
-      <w:tr>
-        <w:tc>
-          <w:tcPr>
-            <w:tcW w:type="dxa" w:w="4320"/>
-          </w:tcPr>
-          <w:p>
-            <w:r>
-              <w:t>Legend text</w:t>
-            </w:r>
-          </w:p>
-        </w:tc>
-        <w:tc>
-          <w:tcPr>
-            <w:tcW w:type="dxa" w:w="4320"/>
-          </w:tcPr>
-          <w:p>
-            <w:r>
-              <w:t>Arial Regular 10px, #BFBFBF</w:t>
-            </w:r>
-          </w:p>
-        </w:tc>
-      </w:tr>
-      <w:tr>
-        <w:tc>
-          <w:tcPr>
-            <w:tcW w:type="dxa" w:w="4320"/>
-          </w:tcPr>
-          <w:p>
-            <w:r>
-              <w:t>Data label text</w:t>
-            </w:r>
-          </w:p>
-        </w:tc>
-        <w:tc>
-          <w:tcPr>
-            <w:tcW w:type="dxa" w:w="4320"/>
-          </w:tcPr>
-          <w:p>
-            <w:r>
-              <w:t>Arial Regular 10px, #BFBFBF</w:t>
-            </w:r>
-          </w:p>
-        </w:tc>
-      </w:tr>
-      <w:tr>
-        <w:tc>
-          <w:tcPr>
-            <w:tcW w:type="dxa" w:w="4320"/>
-          </w:tcPr>
-          <w:p>
-            <w:r>
-              <w:t>Line stroke width</w:t>
-            </w:r>
-          </w:p>
-        </w:tc>
-        <w:tc>
-          <w:tcPr>
-            <w:tcW w:type="dxa" w:w="4320"/>
-          </w:tcPr>
-          <w:p>
-            <w:r>
-              <w:t>2px</w:t>
-            </w:r>
-          </w:p>
-        </w:tc>
-      </w:tr>
-      <w:tr>
-        <w:tc>
-          <w:tcPr>
-            <w:tcW w:type="dxa" w:w="4320"/>
-          </w:tcPr>
-          <w:p>
-            <w:r>
-              <w:t>Background</w:t>
-            </w:r>
-          </w:p>
-        </w:tc>
-        <w:tc>
-          <w:tcPr>
-            <w:tcW w:type="dxa" w:w="4320"/>
-          </w:tcPr>
-          <w:p>
-            <w:r>
-              <w:t>#FFFFFF</w:t>
-            </w:r>
-          </w:p>
-        </w:tc>
-      </w:tr>
-    </w:tbl>
-    <w:p/>
-    <w:p>
-      <w:pPr>
-        <w:pStyle w:val="Heading3"/>
-      </w:pPr>
-      <w:r>
-        <w:t>4.5 Slicers</w:t>
-      </w:r>
-    </w:p>
-    <w:tbl>
-      <w:tblPr>
-        <w:tblStyle w:val="TableGrid"/>
-        <w:tblW w:type="auto" w:w="0"/>
-        <w:tblLook w:firstColumn="1" w:firstRow="1" w:lastColumn="0" w:lastRow="0" w:noHBand="0" w:noVBand="1" w:val="04A0"/>
-      </w:tblPr>
-      <w:tblGrid>
-        <w:gridCol w:w="4320"/>
-        <w:gridCol w:w="4320"/>
-      </w:tblGrid>
-      <w:tr>
-        <w:tc>
-          <w:tcPr>
-            <w:tcW w:type="dxa" w:w="4320"/>
-          </w:tcPr>
-          <w:p>
-            <w:r>
-              <w:rPr>
-                <w:b/>
-              </w:rPr>
-              <w:t>Element</w:t>
-            </w:r>
-          </w:p>
-        </w:tc>
-        <w:tc>
-          <w:tcPr>
-            <w:tcW w:type="dxa" w:w="4320"/>
-          </w:tcPr>
-          <w:p>
-            <w:r>
-              <w:rPr>
-                <w:b/>
-              </w:rPr>
-              <w:t>Specification</w:t>
-            </w:r>
-          </w:p>
-        </w:tc>
-      </w:tr>
-      <w:tr>
-        <w:tc>
-          <w:tcPr>
-            <w:tcW w:type="dxa" w:w="4320"/>
-          </w:tcPr>
-          <w:p>
-            <w:r>
-              <w:t>Header text</w:t>
-            </w:r>
-          </w:p>
-        </w:tc>
-        <w:tc>
-          <w:tcPr>
-            <w:tcW w:type="dxa" w:w="4320"/>
-          </w:tcPr>
-          <w:p>
-            <w:r>
-              <w:t>Arial Bold 11px, #1282C6</w:t>
-            </w:r>
-          </w:p>
-        </w:tc>
-      </w:tr>
-      <w:tr>
-        <w:tc>
-          <w:tcPr>
-            <w:tcW w:type="dxa" w:w="4320"/>
-          </w:tcPr>
-          <w:p>
-            <w:r>
-              <w:t>Header outline</w:t>
-            </w:r>
-          </w:p>
-        </w:tc>
-        <w:tc>
-          <w:tcPr>
-            <w:tcW w:type="dxa" w:w="4320"/>
-          </w:tcPr>
-          <w:p>
-            <w:r>
-              <w:t>Bottom only</w:t>
-            </w:r>
-          </w:p>
-        </w:tc>
-      </w:tr>
-      <w:tr>
-        <w:tc>
-          <w:tcPr>
-            <w:tcW w:type="dxa" w:w="4320"/>
-          </w:tcPr>
-          <w:p>
-            <w:r>
-              <w:t>Item text</w:t>
-            </w:r>
-          </w:p>
-        </w:tc>
-        <w:tc>
-          <w:tcPr>
-            <w:tcW w:type="dxa" w:w="4320"/>
-          </w:tcPr>
-          <w:p>
-            <w:r>
-              <w:t>Arial Regular 11px, #000000</w:t>
-            </w:r>
-          </w:p>
-        </w:tc>
-      </w:tr>
-      <w:tr>
-        <w:tc>
-          <w:tcPr>
-            <w:tcW w:type="dxa" w:w="4320"/>
-          </w:tcPr>
-          <w:p>
-            <w:r>
-              <w:t>Outline color</w:t>
-            </w:r>
-          </w:p>
-        </w:tc>
-        <w:tc>
-          <w:tcPr>
-            <w:tcW w:type="dxa" w:w="4320"/>
-          </w:tcPr>
-          <w:p>
-            <w:r>
-              <w:t>#1282C6, weight 1px</w:t>
-            </w:r>
-          </w:p>
-        </w:tc>
-      </w:tr>
-      <w:tr>
-        <w:tc>
-          <w:tcPr>
-            <w:tcW w:type="dxa" w:w="4320"/>
-          </w:tcPr>
-          <w:p>
-            <w:r>
-              <w:t>Background</w:t>
-            </w:r>
-          </w:p>
-        </w:tc>
-        <w:tc>
-          <w:tcPr>
-            <w:tcW w:type="dxa" w:w="4320"/>
-          </w:tcPr>
-          <w:p>
-            <w:r>
-              <w:t>#FFFFFF</w:t>
-            </w:r>
-          </w:p>
-        </w:tc>
-      </w:tr>
-    </w:tbl>
-    <w:p/>
-    <w:p>
-      <w:pPr>
-        <w:pStyle w:val="Heading3"/>
-      </w:pPr>
-      <w:r>
-        <w:t>4.6 Gauge</w:t>
-      </w:r>
-    </w:p>
-    <w:tbl>
-      <w:tblPr>
-        <w:tblStyle w:val="TableGrid"/>
-        <w:tblW w:type="auto" w:w="0"/>
-        <w:tblLook w:firstColumn="1" w:firstRow="1" w:lastColumn="0" w:lastRow="0" w:noHBand="0" w:noVBand="1" w:val="04A0"/>
-      </w:tblPr>
-      <w:tblGrid>
-        <w:gridCol w:w="4320"/>
-        <w:gridCol w:w="4320"/>
-      </w:tblGrid>
-      <w:tr>
-        <w:tc>
-          <w:tcPr>
-            <w:tcW w:type="dxa" w:w="4320"/>
-          </w:tcPr>
-          <w:p>
-            <w:r>
-              <w:rPr>
-                <w:b/>
-              </w:rPr>
-              <w:t>Element</w:t>
-            </w:r>
-          </w:p>
-        </w:tc>
-        <w:tc>
-          <w:tcPr>
-            <w:tcW w:type="dxa" w:w="4320"/>
-          </w:tcPr>
-          <w:p>
-            <w:r>
-              <w:rPr>
-                <w:b/>
-              </w:rPr>
-              <w:t>Specification</w:t>
-            </w:r>
-          </w:p>
-        </w:tc>
-      </w:tr>
-      <w:tr>
-        <w:tc>
-          <w:tcPr>
-            <w:tcW w:type="dxa" w:w="4320"/>
-          </w:tcPr>
-          <w:p>
-            <w:r>
-              <w:t>Fill arc</w:t>
-            </w:r>
-          </w:p>
-        </w:tc>
-        <w:tc>
-          <w:tcPr>
-            <w:tcW w:type="dxa" w:w="4320"/>
-          </w:tcPr>
-          <w:p>
-            <w:r>
-              <w:t>#C8353D</w:t>
-            </w:r>
-          </w:p>
-        </w:tc>
-      </w:tr>
-      <w:tr>
-        <w:tc>
-          <w:tcPr>
-            <w:tcW w:type="dxa" w:w="4320"/>
-          </w:tcPr>
-          <w:p>
-            <w:r>
-              <w:t>Target marker</w:t>
-            </w:r>
-          </w:p>
-        </w:tc>
-        <w:tc>
-          <w:tcPr>
-            <w:tcW w:type="dxa" w:w="4320"/>
-          </w:tcPr>
-          <w:p>
-            <w:r>
-              <w:t>#BFBFBF</w:t>
-            </w:r>
-          </w:p>
-        </w:tc>
-      </w:tr>
-      <w:tr>
-        <w:tc>
-          <w:tcPr>
-            <w:tcW w:type="dxa" w:w="4320"/>
-          </w:tcPr>
-          <w:p>
-            <w:r>
-              <w:t>Callout value</w:t>
-            </w:r>
-          </w:p>
-        </w:tc>
-        <w:tc>
-          <w:tcPr>
-            <w:tcW w:type="dxa" w:w="4320"/>
-          </w:tcPr>
-          <w:p>
-            <w:r>
-              <w:t>Arial Bold 20px, #000000</w:t>
-            </w:r>
-          </w:p>
-        </w:tc>
-      </w:tr>
-    </w:tbl>
-    <w:p/>
-    <w:p>
-      <w:pPr>
-        <w:pStyle w:val="Heading3"/>
-      </w:pPr>
-      <w:r>
-        <w:t>4.7 Navigation &amp; Buttons</w:t>
+        <w:t>8. Quick Reference - Color Codes</w:t>
       </w:r>
     </w:p>
     <w:tbl>
@@ -2867,10 +510,7 @@
           </w:tcPr>
           <w:p>
             <w:r>
-              <w:rPr>
-                <w:b/>
-              </w:rPr>
-              <w:t>State</w:t>
+              <w:t>Category</w:t>
             </w:r>
           </w:p>
         </w:tc>
@@ -2880,10 +520,7 @@
           </w:tcPr>
           <w:p>
             <w:r>
-              <w:rPr>
-                <w:b/>
-              </w:rPr>
-              <w:t>Background</w:t>
+              <w:t>Role</w:t>
             </w:r>
           </w:p>
         </w:tc>
@@ -2893,10 +530,7 @@
           </w:tcPr>
           <w:p>
             <w:r>
-              <w:rPr>
-                <w:b/>
-              </w:rPr>
-              <w:t>Text</w:t>
+              <w:t>Hex</w:t>
             </w:r>
           </w:p>
         </w:tc>
@@ -2906,10 +540,7 @@
           </w:tcPr>
           <w:p>
             <w:r>
-              <w:rPr>
-                <w:b/>
-              </w:rPr>
-              <w:t>Border</w:t>
+              <w:t>Sample</w:t>
             </w:r>
           </w:p>
         </w:tc>
@@ -2921,7 +552,17 @@
           </w:tcPr>
           <w:p>
             <w:r>
-              <w:t>Primary</w:t>
+              <w:t>Corporate</w:t>
+            </w:r>
+          </w:p>
+        </w:tc>
+        <w:tc>
+          <w:tcPr>
+            <w:tcW w:type="dxa" w:w="2160"/>
+          </w:tcPr>
+          <w:p>
+            <w:r>
+              <w:t>Red</w:t>
             </w:r>
           </w:p>
         </w:tc>
@@ -2938,10 +579,27 @@
         <w:tc>
           <w:tcPr>
             <w:tcW w:type="dxa" w:w="2160"/>
+            <w:shd w:fill="C8353D"/>
+          </w:tcPr>
+          <w:p/>
+        </w:tc>
+      </w:tr>
+      <w:tr>
+        <w:tc>
+          <w:tcPr>
+            <w:tcW w:type="dxa" w:w="2160"/>
+          </w:tcPr>
+          <w:p>
+            <w:r/>
+          </w:p>
+        </w:tc>
+        <w:tc>
+          <w:tcPr>
+            <w:tcW w:type="dxa" w:w="2160"/>
           </w:tcPr>
           <w:p>
             <w:r>
-              <w:t>#FFFFFF</w:t>
+              <w:t>Gray</w:t>
             </w:r>
           </w:p>
         </w:tc>
@@ -2951,9 +609,16 @@
           </w:tcPr>
           <w:p>
             <w:r>
-              <w:t>none</w:t>
+              <w:t>#BFBFBF</w:t>
             </w:r>
           </w:p>
+        </w:tc>
+        <w:tc>
+          <w:tcPr>
+            <w:tcW w:type="dxa" w:w="2160"/>
+            <w:shd w:fill="BFBFBF"/>
+          </w:tcPr>
+          <w:p/>
         </w:tc>
       </w:tr>
       <w:tr>
@@ -2963,7 +628,7 @@
           </w:tcPr>
           <w:p>
             <w:r>
-              <w:t>Primary Hover</w:t>
+              <w:t>Semantic</w:t>
             </w:r>
           </w:p>
         </w:tc>
@@ -2973,7 +638,7 @@
           </w:tcPr>
           <w:p>
             <w:r>
-              <w:t>#b01e24</w:t>
+              <w:t>Good</w:t>
             </w:r>
           </w:p>
         </w:tc>
@@ -2983,8 +648,25 @@
           </w:tcPr>
           <w:p>
             <w:r>
-              <w:t>#FFFFFF</w:t>
+              <w:t>#1C6B27</w:t>
             </w:r>
+          </w:p>
+        </w:tc>
+        <w:tc>
+          <w:tcPr>
+            <w:tcW w:type="dxa" w:w="2160"/>
+            <w:shd w:fill="1C6B27"/>
+          </w:tcPr>
+          <w:p/>
+        </w:tc>
+      </w:tr>
+      <w:tr>
+        <w:tc>
+          <w:tcPr>
+            <w:tcW w:type="dxa" w:w="2160"/>
+          </w:tcPr>
+          <w:p>
+            <w:r/>
           </w:p>
         </w:tc>
         <w:tc>
@@ -2993,29 +675,7 @@
           </w:tcPr>
           <w:p>
             <w:r>
-              <w:t>none</w:t>
-            </w:r>
-          </w:p>
-        </w:tc>
-      </w:tr>
-      <w:tr>
-        <w:tc>
-          <w:tcPr>
-            <w:tcW w:type="dxa" w:w="2160"/>
-          </w:tcPr>
-          <w:p>
-            <w:r>
-              <w:t>Secondary</w:t>
-            </w:r>
-          </w:p>
-        </w:tc>
-        <w:tc>
-          <w:tcPr>
-            <w:tcW w:type="dxa" w:w="2160"/>
-          </w:tcPr>
-          <w:p>
-            <w:r>
-              <w:t>#FFFFFF</w:t>
+              <w:t>Bad</w:t>
             </w:r>
           </w:p>
         </w:tc>
@@ -3032,1193 +692,30 @@
         <w:tc>
           <w:tcPr>
             <w:tcW w:type="dxa" w:w="2160"/>
+            <w:shd w:fill="C8353D"/>
           </w:tcPr>
-          <w:p>
-            <w:r>
-              <w:t>1px #C8353D</w:t>
-            </w:r>
-          </w:p>
-        </w:tc>
-      </w:tr>
-      <w:tr>
-        <w:tc>
-          <w:tcPr>
-            <w:tcW w:type="dxa" w:w="2160"/>
-          </w:tcPr>
-          <w:p>
-            <w:r>
-              <w:t>Secondary Hover</w:t>
-            </w:r>
-          </w:p>
-        </w:tc>
-        <w:tc>
-          <w:tcPr>
-            <w:tcW w:type="dxa" w:w="2160"/>
-          </w:tcPr>
-          <w:p>
-            <w:r>
-              <w:t>#F2F2F2</w:t>
-            </w:r>
-          </w:p>
-        </w:tc>
-        <w:tc>
-          <w:tcPr>
-            <w:tcW w:type="dxa" w:w="2160"/>
-          </w:tcPr>
-          <w:p>
-            <w:r>
-              <w:t>#C8353D</w:t>
-            </w:r>
-          </w:p>
-        </w:tc>
-        <w:tc>
-          <w:tcPr>
-            <w:tcW w:type="dxa" w:w="2160"/>
-          </w:tcPr>
-          <w:p>
-            <w:r>
-              <w:t>1px #C8353D</w:t>
-            </w:r>
-          </w:p>
-        </w:tc>
-      </w:tr>
-      <w:tr>
-        <w:tc>
-          <w:tcPr>
-            <w:tcW w:type="dxa" w:w="2160"/>
-          </w:tcPr>
-          <w:p>
-            <w:r>
-              <w:t>Disabled</w:t>
-            </w:r>
-          </w:p>
-        </w:tc>
-        <w:tc>
-          <w:tcPr>
-            <w:tcW w:type="dxa" w:w="2160"/>
-          </w:tcPr>
-          <w:p>
-            <w:r>
-              <w:t>#E6E6E6</w:t>
-            </w:r>
-          </w:p>
-        </w:tc>
-        <w:tc>
-          <w:tcPr>
-            <w:tcW w:type="dxa" w:w="2160"/>
-          </w:tcPr>
-          <w:p>
-            <w:r>
-              <w:t>#BFBFBF</w:t>
-            </w:r>
-          </w:p>
-        </w:tc>
-        <w:tc>
-          <w:tcPr>
-            <w:tcW w:type="dxa" w:w="2160"/>
-          </w:tcPr>
-          <w:p>
-            <w:r>
-              <w:t>none</w:t>
-            </w:r>
-          </w:p>
+          <w:p/>
         </w:tc>
       </w:tr>
     </w:tbl>
-    <w:p/>
     <w:p>
       <w:pPr>
-        <w:pStyle w:val="Heading2"/>
+        <w:pStyle w:val="Heading1"/>
       </w:pPr>
       <w:r>
-        <w:t>5. Spacing &amp; Layout</w:t>
-      </w:r>
-    </w:p>
-    <w:tbl>
-      <w:tblPr>
-        <w:tblStyle w:val="TableGrid"/>
-        <w:tblW w:type="auto" w:w="0"/>
-        <w:tblLook w:firstColumn="1" w:firstRow="1" w:lastColumn="0" w:lastRow="0" w:noHBand="0" w:noVBand="1" w:val="04A0"/>
-      </w:tblPr>
-      <w:tblGrid>
-        <w:gridCol w:w="2880"/>
-        <w:gridCol w:w="2880"/>
-        <w:gridCol w:w="2880"/>
-      </w:tblGrid>
-      <w:tr>
-        <w:tc>
-          <w:tcPr>
-            <w:tcW w:type="dxa" w:w="2880"/>
-          </w:tcPr>
-          <w:p>
-            <w:r>
-              <w:rPr>
-                <w:b/>
-              </w:rPr>
-              <w:t>Token</w:t>
-            </w:r>
-          </w:p>
-        </w:tc>
-        <w:tc>
-          <w:tcPr>
-            <w:tcW w:type="dxa" w:w="2880"/>
-          </w:tcPr>
-          <w:p>
-            <w:r>
-              <w:rPr>
-                <w:b/>
-              </w:rPr>
-              <w:t>Value</w:t>
-            </w:r>
-          </w:p>
-        </w:tc>
-        <w:tc>
-          <w:tcPr>
-            <w:tcW w:type="dxa" w:w="2880"/>
-          </w:tcPr>
-          <w:p>
-            <w:r>
-              <w:rPr>
-                <w:b/>
-              </w:rPr>
-              <w:t>Usage</w:t>
-            </w:r>
-          </w:p>
-        </w:tc>
-      </w:tr>
-      <w:tr>
-        <w:tc>
-          <w:tcPr>
-            <w:tcW w:type="dxa" w:w="2880"/>
-          </w:tcPr>
-          <w:p>
-            <w:r>
-              <w:t>padding-card</w:t>
-            </w:r>
-          </w:p>
-        </w:tc>
-        <w:tc>
-          <w:tcPr>
-            <w:tcW w:type="dxa" w:w="2880"/>
-          </w:tcPr>
-          <w:p>
-            <w:r>
-              <w:t>8px</w:t>
-            </w:r>
-          </w:p>
-        </w:tc>
-        <w:tc>
-          <w:tcPr>
-            <w:tcW w:type="dxa" w:w="2880"/>
-          </w:tcPr>
-          <w:p>
-            <w:r>
-              <w:t>Inner padding for card visuals</w:t>
-            </w:r>
-          </w:p>
-        </w:tc>
-      </w:tr>
-      <w:tr>
-        <w:tc>
-          <w:tcPr>
-            <w:tcW w:type="dxa" w:w="2880"/>
-          </w:tcPr>
-          <w:p>
-            <w:r>
-              <w:t>padding-page</w:t>
-            </w:r>
-          </w:p>
-        </w:tc>
-        <w:tc>
-          <w:tcPr>
-            <w:tcW w:type="dxa" w:w="2880"/>
-          </w:tcPr>
-          <w:p>
-            <w:r>
-              <w:t>16px</w:t>
-            </w:r>
-          </w:p>
-        </w:tc>
-        <w:tc>
-          <w:tcPr>
-            <w:tcW w:type="dxa" w:w="2880"/>
-          </w:tcPr>
-          <w:p>
-            <w:r>
-              <w:t>Page margin</w:t>
-            </w:r>
-          </w:p>
-        </w:tc>
-      </w:tr>
-      <w:tr>
-        <w:tc>
-          <w:tcPr>
-            <w:tcW w:type="dxa" w:w="2880"/>
-          </w:tcPr>
-          <w:p>
-            <w:r>
-              <w:t>gap-visual</w:t>
-            </w:r>
-          </w:p>
-        </w:tc>
-        <w:tc>
-          <w:tcPr>
-            <w:tcW w:type="dxa" w:w="2880"/>
-          </w:tcPr>
-          <w:p>
-            <w:r>
-              <w:t>8px</w:t>
-            </w:r>
-          </w:p>
-        </w:tc>
-        <w:tc>
-          <w:tcPr>
-            <w:tcW w:type="dxa" w:w="2880"/>
-          </w:tcPr>
-          <w:p>
-            <w:r>
-              <w:t>Space between visuals</w:t>
-            </w:r>
-          </w:p>
-        </w:tc>
-      </w:tr>
-      <w:tr>
-        <w:tc>
-          <w:tcPr>
-            <w:tcW w:type="dxa" w:w="2880"/>
-          </w:tcPr>
-          <w:p>
-            <w:r>
-              <w:t>border-radius</w:t>
-            </w:r>
-          </w:p>
-        </w:tc>
-        <w:tc>
-          <w:tcPr>
-            <w:tcW w:type="dxa" w:w="2880"/>
-          </w:tcPr>
-          <w:p>
-            <w:r>
-              <w:t>2–4px</w:t>
-            </w:r>
-          </w:p>
-        </w:tc>
-        <w:tc>
-          <w:tcPr>
-            <w:tcW w:type="dxa" w:w="2880"/>
-          </w:tcPr>
-          <w:p>
-            <w:r>
-              <w:t>Card corners</w:t>
-            </w:r>
-          </w:p>
-        </w:tc>
-      </w:tr>
-      <w:tr>
-        <w:tc>
-          <w:tcPr>
-            <w:tcW w:type="dxa" w:w="2880"/>
-          </w:tcPr>
-          <w:p>
-            <w:r>
-              <w:t>border-weight</w:t>
-            </w:r>
-          </w:p>
-        </w:tc>
-        <w:tc>
-          <w:tcPr>
-            <w:tcW w:type="dxa" w:w="2880"/>
-          </w:tcPr>
-          <w:p>
-            <w:r>
-              <w:t>none</w:t>
-            </w:r>
-          </w:p>
-        </w:tc>
-        <w:tc>
-          <w:tcPr>
-            <w:tcW w:type="dxa" w:w="2880"/>
-          </w:tcPr>
-          <w:p>
-            <w:r>
-              <w:t>Borders disabled globally</w:t>
-            </w:r>
-          </w:p>
-        </w:tc>
-      </w:tr>
-      <w:tr>
-        <w:tc>
-          <w:tcPr>
-            <w:tcW w:type="dxa" w:w="2880"/>
-          </w:tcPr>
-          <w:p>
-            <w:r>
-              <w:t>shadow</w:t>
-            </w:r>
-          </w:p>
-        </w:tc>
-        <w:tc>
-          <w:tcPr>
-            <w:tcW w:type="dxa" w:w="2880"/>
-          </w:tcPr>
-          <w:p>
-            <w:r>
-              <w:t>0 1px 3px #E6E6E6</w:t>
-            </w:r>
-          </w:p>
-        </w:tc>
-        <w:tc>
-          <w:tcPr>
-            <w:tcW w:type="dxa" w:w="2880"/>
-          </w:tcPr>
-          <w:p>
-            <w:r>
-              <w:t>Card drop shadows</w:t>
-            </w:r>
-          </w:p>
-        </w:tc>
-      </w:tr>
-    </w:tbl>
-    <w:p/>
-    <w:p>
-      <w:pPr>
-        <w:pStyle w:val="Heading2"/>
-      </w:pPr>
-      <w:r>
-        <w:t>6. Accessibility Notes</w:t>
-      </w:r>
-    </w:p>
-    <w:p>
-      <w:pPr>
-        <w:pStyle w:val="ListBullet"/>
-      </w:pPr>
-      <w:r>
-        <w:t xml:space="preserve">All body text must be </w:t>
-      </w:r>
-      <w:r>
-        <w:rPr>
-          <w:b/>
-        </w:rPr>
-        <w:t>Black</w:t>
-      </w:r>
-      <w:r>
-        <w:t xml:space="preserve"> (#000000) on white backgrounds for maximum contrast</w:t>
-      </w:r>
-    </w:p>
-    <w:p>
-      <w:pPr>
-        <w:pStyle w:val="ListBullet"/>
-      </w:pPr>
-      <w:r>
-        <w:t xml:space="preserve">White text on Red (#C8353D) and Blue (#1282C6) backgrounds meets </w:t>
-      </w:r>
-      <w:r>
-        <w:rPr>
-          <w:b/>
-        </w:rPr>
-        <w:t>WCAG AA</w:t>
-      </w:r>
-      <w:r>
-        <w:t xml:space="preserve"> contrast (4.5:1+)</w:t>
-      </w:r>
-    </w:p>
-    <w:p>
-      <w:pPr>
-        <w:pStyle w:val="ListBullet"/>
-      </w:pPr>
-      <w:r>
-        <w:t xml:space="preserve">Lime Green (#79BE2E) should only be used for filled shapes, </w:t>
-      </w:r>
-      <w:r>
-        <w:rPr>
-          <w:b/>
-        </w:rPr>
-        <w:t>not</w:t>
-      </w:r>
-      <w:r>
-        <w:t xml:space="preserve"> for text on white (fails contrast)</w:t>
-      </w:r>
-    </w:p>
-    <w:p>
-      <w:pPr>
-        <w:pStyle w:val="ListBullet"/>
-      </w:pPr>
-      <w:r>
-        <w:t>Avoid using color alone to convey meaning - always pair with labels or icons</w:t>
-      </w:r>
-    </w:p>
-    <w:p>
-      <w:pPr>
-        <w:pStyle w:val="ListBullet"/>
-      </w:pPr>
-      <w:r>
-        <w:t xml:space="preserve">Minimum font size: </w:t>
-      </w:r>
-      <w:r>
-        <w:rPr>
-          <w:b/>
-        </w:rPr>
-        <w:t>10px</w:t>
-      </w:r>
-      <w:r>
-        <w:t xml:space="preserve"> for any readable text</w:t>
-      </w:r>
-    </w:p>
-    <w:p>
-      <w:pPr>
-        <w:pStyle w:val="Heading2"/>
-      </w:pPr>
-      <w:r>
-        <w:t>7. Power BI Theme File</w:t>
+        <w:t>Document History</w:t>
       </w:r>
     </w:p>
     <w:p>
       <w:r>
-        <w:t>The companion Power BI theme JSON implementing this spec is available at:</w:t>
+        <w:t>v1.1 (March 20, 2026): Expanded semantic colors and formatting guidelines.</w:t>
       </w:r>
     </w:p>
     <w:p>
       <w:r>
-        <w:t>[CS_Wholesale_Theme.json](file:///C:/GIT/FUAM/themes/CS_Wholesale_Theme.json)</w:t>
+        <w:t>v1.0 (March 19, 2026): Initial UI design specification.</w:t>
       </w:r>
     </w:p>
-    <w:p>
-      <w:r>
-        <w:t>To apply: Power BI Desktop → View → Themes → Browse for themes → select CS_Wholesale_Theme.json</w:t>
-      </w:r>
-    </w:p>
-    <w:p>
-      <w:pPr>
-        <w:pStyle w:val="Heading2"/>
-      </w:pPr>
-      <w:r>
-        <w:t>8. Quick Reference - Color Codes</w:t>
-      </w:r>
-    </w:p>
-    <w:tbl>
-      <w:tblPr>
-        <w:tblStyle w:val="TableGrid"/>
-        <w:tblW w:type="auto" w:w="0"/>
-        <w:tblLook w:firstColumn="1" w:firstRow="1" w:lastColumn="0" w:lastRow="0" w:noHBand="0" w:noVBand="1" w:val="04A0"/>
-      </w:tblPr>
-      <w:tblGrid>
-        <w:gridCol w:w="2880"/>
-        <w:gridCol w:w="2880"/>
-        <w:gridCol w:w="2880"/>
-      </w:tblGrid>
-      <w:tr>
-        <w:tc>
-          <w:tcPr>
-            <w:tcW w:type="dxa" w:w="2880"/>
-          </w:tcPr>
-          <w:p>
-            <w:r>
-              <w:t>Category</w:t>
-            </w:r>
-          </w:p>
-        </w:tc>
-        <w:tc>
-          <w:tcPr>
-            <w:tcW w:type="dxa" w:w="2880"/>
-          </w:tcPr>
-          <w:p>
-            <w:r>
-              <w:t>Role / Element</w:t>
-            </w:r>
-          </w:p>
-        </w:tc>
-        <w:tc>
-          <w:tcPr>
-            <w:tcW w:type="dxa" w:w="2880"/>
-          </w:tcPr>
-          <w:p>
-            <w:r>
-              <w:t>Hex</w:t>
-            </w:r>
-          </w:p>
-        </w:tc>
-        <w:tc>
-          <w:p>
-            <w:r>
-              <w:t>Sample</w:t>
-            </w:r>
-          </w:p>
-        </w:tc>
-      </w:tr>
-      <w:tr>
-        <w:tc>
-          <w:tcPr>
-            <w:tcW w:type="dxa" w:w="2880"/>
-          </w:tcPr>
-          <w:p>
-            <w:r>
-              <w:t>Corporate</w:t>
-            </w:r>
-          </w:p>
-        </w:tc>
-        <w:tc>
-          <w:tcPr>
-            <w:tcW w:type="dxa" w:w="2880"/>
-          </w:tcPr>
-          <w:p>
-            <w:r>
-              <w:t>Red (Primary)</w:t>
-            </w:r>
-          </w:p>
-        </w:tc>
-        <w:tc>
-          <w:tcPr>
-            <w:tcW w:type="dxa" w:w="2880"/>
-          </w:tcPr>
-          <w:p>
-            <w:r>
-              <w:t>#C8353D</w:t>
-            </w:r>
-          </w:p>
-        </w:tc>
-        <w:tc>
-          <w:tcPr>
-            <w:shd w:fill="C8353D"/>
-          </w:tcPr>
-        </w:tc>
-      </w:tr>
-      <w:tr>
-        <w:tc>
-          <w:tcPr>
-            <w:tcW w:type="dxa" w:w="2880"/>
-          </w:tcPr>
-          <w:p>
-            <w:r/>
-          </w:p>
-        </w:tc>
-        <w:tc>
-          <w:tcPr>
-            <w:tcW w:type="dxa" w:w="2880"/>
-          </w:tcPr>
-          <w:p>
-            <w:r>
-              <w:t>Gray</w:t>
-            </w:r>
-          </w:p>
-        </w:tc>
-        <w:tc>
-          <w:tcPr>
-            <w:tcW w:type="dxa" w:w="2880"/>
-          </w:tcPr>
-          <w:p>
-            <w:r>
-              <w:t>#BFBFBF</w:t>
-            </w:r>
-          </w:p>
-        </w:tc>
-        <w:tc>
-          <w:tcPr>
-            <w:shd w:fill="BFBFBF"/>
-          </w:tcPr>
-        </w:tc>
-      </w:tr>
-      <w:tr>
-        <w:tc>
-          <w:tcPr>
-            <w:tcW w:type="dxa" w:w="2880"/>
-          </w:tcPr>
-          <w:p>
-            <w:r/>
-          </w:p>
-        </w:tc>
-        <w:tc>
-          <w:tcPr>
-            <w:tcW w:type="dxa" w:w="2880"/>
-          </w:tcPr>
-          <w:p>
-            <w:r>
-              <w:t>Black</w:t>
-            </w:r>
-          </w:p>
-        </w:tc>
-        <w:tc>
-          <w:tcPr>
-            <w:tcW w:type="dxa" w:w="2880"/>
-          </w:tcPr>
-          <w:p>
-            <w:r>
-              <w:t>#000000</w:t>
-            </w:r>
-          </w:p>
-        </w:tc>
-        <w:tc>
-          <w:tcPr>
-            <w:shd w:fill="000000"/>
-          </w:tcPr>
-        </w:tc>
-      </w:tr>
-      <w:tr>
-        <w:tc>
-          <w:tcPr>
-            <w:tcW w:type="dxa" w:w="2880"/>
-          </w:tcPr>
-          <w:p>
-            <w:r/>
-          </w:p>
-        </w:tc>
-        <w:tc>
-          <w:tcPr>
-            <w:tcW w:type="dxa" w:w="2880"/>
-          </w:tcPr>
-          <w:p>
-            <w:r>
-              <w:t>White</w:t>
-            </w:r>
-          </w:p>
-        </w:tc>
-        <w:tc>
-          <w:tcPr>
-            <w:tcW w:type="dxa" w:w="2880"/>
-          </w:tcPr>
-          <w:p>
-            <w:r>
-              <w:t>#FFFFFF</w:t>
-            </w:r>
-          </w:p>
-        </w:tc>
-        <w:tc>
-          <w:tcPr>
-            <w:shd w:fill="FFFFFF"/>
-          </w:tcPr>
-        </w:tc>
-      </w:tr>
-      <w:tr>
-        <w:tc>
-          <w:tcPr>
-            <w:tcW w:type="dxa" w:w="2880"/>
-          </w:tcPr>
-          <w:p>
-            <w:r>
-              <w:t>Surfaces</w:t>
-            </w:r>
-          </w:p>
-        </w:tc>
-        <w:tc>
-          <w:tcPr>
-            <w:tcW w:type="dxa" w:w="2880"/>
-          </w:tcPr>
-          <w:p>
-            <w:r>
-              <w:t>Page BG</w:t>
-            </w:r>
-          </w:p>
-        </w:tc>
-        <w:tc>
-          <w:tcPr>
-            <w:tcW w:type="dxa" w:w="2880"/>
-          </w:tcPr>
-          <w:p>
-            <w:r>
-              <w:t>#F2F2F2</w:t>
-            </w:r>
-          </w:p>
-        </w:tc>
-        <w:tc>
-          <w:tcPr>
-            <w:shd w:fill="F2F2F2"/>
-          </w:tcPr>
-        </w:tc>
-      </w:tr>
-      <w:tr>
-        <w:tc>
-          <w:tcPr>
-            <w:tcW w:type="dxa" w:w="2880"/>
-          </w:tcPr>
-          <w:p>
-            <w:r/>
-          </w:p>
-        </w:tc>
-        <w:tc>
-          <w:tcPr>
-            <w:tcW w:type="dxa" w:w="2880"/>
-          </w:tcPr>
-          <w:p>
-            <w:r>
-              <w:t>Borders</w:t>
-            </w:r>
-          </w:p>
-        </w:tc>
-        <w:tc>
-          <w:tcPr>
-            <w:tcW w:type="dxa" w:w="2880"/>
-          </w:tcPr>
-          <w:p>
-            <w:r>
-              <w:t>#E6E6E6</w:t>
-            </w:r>
-          </w:p>
-        </w:tc>
-        <w:tc>
-          <w:tcPr>
-            <w:shd w:fill="E6E6E6"/>
-          </w:tcPr>
-        </w:tc>
-      </w:tr>
-      <w:tr>
-        <w:tc>
-          <w:tcPr>
-            <w:tcW w:type="dxa" w:w="2880"/>
-          </w:tcPr>
-          <w:p>
-            <w:r/>
-          </w:p>
-        </w:tc>
-        <w:tc>
-          <w:tcPr>
-            <w:tcW w:type="dxa" w:w="2880"/>
-          </w:tcPr>
-          <w:p>
-            <w:r>
-              <w:t>Card BG</w:t>
-            </w:r>
-          </w:p>
-        </w:tc>
-        <w:tc>
-          <w:tcPr>
-            <w:tcW w:type="dxa" w:w="2880"/>
-          </w:tcPr>
-          <w:p>
-            <w:r>
-              <w:t>#FFFFFF</w:t>
-            </w:r>
-          </w:p>
-        </w:tc>
-        <w:tc>
-          <w:tcPr>
-            <w:shd w:fill="FFFFFF"/>
-          </w:tcPr>
-        </w:tc>
-      </w:tr>
-      <w:tr>
-        <w:tc>
-          <w:tcPr>
-            <w:tcW w:type="dxa" w:w="2880"/>
-          </w:tcPr>
-          <w:p>
-            <w:r>
-              <w:t>Splash Series</w:t>
-            </w:r>
-          </w:p>
-        </w:tc>
-        <w:tc>
-          <w:tcPr>
-            <w:tcW w:type="dxa" w:w="2880"/>
-          </w:tcPr>
-          <w:p>
-            <w:r>
-              <w:t>Series 1</w:t>
-            </w:r>
-          </w:p>
-        </w:tc>
-        <w:tc>
-          <w:tcPr>
-            <w:tcW w:type="dxa" w:w="2880"/>
-          </w:tcPr>
-          <w:p>
-            <w:r>
-              <w:t>#C8353D</w:t>
-            </w:r>
-          </w:p>
-        </w:tc>
-        <w:tc>
-          <w:tcPr>
-            <w:shd w:fill="C8353D"/>
-          </w:tcPr>
-        </w:tc>
-      </w:tr>
-      <w:tr>
-        <w:tc>
-          <w:tcPr>
-            <w:tcW w:type="dxa" w:w="2880"/>
-          </w:tcPr>
-          <w:p>
-            <w:r/>
-          </w:p>
-        </w:tc>
-        <w:tc>
-          <w:tcPr>
-            <w:tcW w:type="dxa" w:w="2880"/>
-          </w:tcPr>
-          <w:p>
-            <w:r>
-              <w:t>Series 2</w:t>
-            </w:r>
-          </w:p>
-        </w:tc>
-        <w:tc>
-          <w:tcPr>
-            <w:tcW w:type="dxa" w:w="2880"/>
-          </w:tcPr>
-          <w:p>
-            <w:r>
-              <w:t>#1282C6</w:t>
-            </w:r>
-          </w:p>
-        </w:tc>
-        <w:tc>
-          <w:tcPr>
-            <w:shd w:fill="1282C6"/>
-          </w:tcPr>
-        </w:tc>
-      </w:tr>
-      <w:tr>
-        <w:tc>
-          <w:tcPr>
-            <w:tcW w:type="dxa" w:w="2880"/>
-          </w:tcPr>
-          <w:p>
-            <w:r/>
-          </w:p>
-        </w:tc>
-        <w:tc>
-          <w:tcPr>
-            <w:tcW w:type="dxa" w:w="2880"/>
-          </w:tcPr>
-          <w:p>
-            <w:r>
-              <w:t>Series 3</w:t>
-            </w:r>
-          </w:p>
-        </w:tc>
-        <w:tc>
-          <w:tcPr>
-            <w:tcW w:type="dxa" w:w="2880"/>
-          </w:tcPr>
-          <w:p>
-            <w:r>
-              <w:t>#79BE2E</w:t>
-            </w:r>
-          </w:p>
-        </w:tc>
-        <w:tc>
-          <w:tcPr>
-            <w:shd w:fill="79BE2E"/>
-          </w:tcPr>
-        </w:tc>
-      </w:tr>
-      <w:tr>
-        <w:tc>
-          <w:tcPr>
-            <w:tcW w:type="dxa" w:w="2880"/>
-          </w:tcPr>
-          <w:p>
-            <w:r/>
-          </w:p>
-        </w:tc>
-        <w:tc>
-          <w:tcPr>
-            <w:tcW w:type="dxa" w:w="2880"/>
-          </w:tcPr>
-          <w:p>
-            <w:r>
-              <w:t>Series 4</w:t>
-            </w:r>
-          </w:p>
-        </w:tc>
-        <w:tc>
-          <w:tcPr>
-            <w:tcW w:type="dxa" w:w="2880"/>
-          </w:tcPr>
-          <w:p>
-            <w:r>
-              <w:t>#9F2C92</w:t>
-            </w:r>
-          </w:p>
-        </w:tc>
-        <w:tc>
-          <w:tcPr>
-            <w:shd w:fill="9F2C92"/>
-          </w:tcPr>
-        </w:tc>
-      </w:tr>
-      <w:tr>
-        <w:tc>
-          <w:tcPr>
-            <w:tcW w:type="dxa" w:w="2880"/>
-          </w:tcPr>
-          <w:p>
-            <w:r/>
-          </w:p>
-        </w:tc>
-        <w:tc>
-          <w:tcPr>
-            <w:tcW w:type="dxa" w:w="2880"/>
-          </w:tcPr>
-          <w:p>
-            <w:r>
-              <w:t>Series 5</w:t>
-            </w:r>
-          </w:p>
-        </w:tc>
-        <w:tc>
-          <w:tcPr>
-            <w:tcW w:type="dxa" w:w="2880"/>
-          </w:tcPr>
-          <w:p>
-            <w:r>
-              <w:t>#E7703A</w:t>
-            </w:r>
-          </w:p>
-        </w:tc>
-        <w:tc>
-          <w:tcPr>
-            <w:shd w:fill="E7703A"/>
-          </w:tcPr>
-        </w:tc>
-      </w:tr>
-      <w:tr>
-        <w:tc>
-          <w:tcPr>
-            <w:tcW w:type="dxa" w:w="2880"/>
-          </w:tcPr>
-          <w:p>
-            <w:r/>
-          </w:p>
-        </w:tc>
-        <w:tc>
-          <w:tcPr>
-            <w:tcW w:type="dxa" w:w="2880"/>
-          </w:tcPr>
-          <w:p>
-            <w:r>
-              <w:t>Series 6</w:t>
-            </w:r>
-          </w:p>
-        </w:tc>
-        <w:tc>
-          <w:tcPr>
-            <w:tcW w:type="dxa" w:w="2880"/>
-          </w:tcPr>
-          <w:p>
-            <w:r>
-              <w:t>#1E9FD3</w:t>
-            </w:r>
-          </w:p>
-        </w:tc>
-        <w:tc>
-          <w:tcPr>
-            <w:shd w:fill="1E9FD3"/>
-          </w:tcPr>
-        </w:tc>
-      </w:tr>
-      <w:tr>
-        <w:tc>
-          <w:tcPr>
-            <w:tcW w:type="dxa" w:w="2880"/>
-          </w:tcPr>
-          <w:p>
-            <w:r/>
-          </w:p>
-        </w:tc>
-        <w:tc>
-          <w:tcPr>
-            <w:tcW w:type="dxa" w:w="2880"/>
-          </w:tcPr>
-          <w:p>
-            <w:r>
-              <w:t>Series 7</w:t>
-            </w:r>
-          </w:p>
-        </w:tc>
-        <w:tc>
-          <w:tcPr>
-            <w:tcW w:type="dxa" w:w="2880"/>
-          </w:tcPr>
-          <w:p>
-            <w:r>
-              <w:t>#1C6B27</w:t>
-            </w:r>
-          </w:p>
-        </w:tc>
-        <w:tc>
-          <w:tcPr>
-            <w:shd w:fill="1C6B27"/>
-          </w:tcPr>
-        </w:tc>
-      </w:tr>
-      <w:tr>
-        <w:tc>
-          <w:tcPr>
-            <w:tcW w:type="dxa" w:w="2880"/>
-          </w:tcPr>
-          <w:p>
-            <w:r/>
-          </w:p>
-        </w:tc>
-        <w:tc>
-          <w:tcPr>
-            <w:tcW w:type="dxa" w:w="2880"/>
-          </w:tcPr>
-          <w:p>
-            <w:r>
-              <w:t>Series 8</w:t>
-            </w:r>
-          </w:p>
-        </w:tc>
-        <w:tc>
-          <w:tcPr>
-            <w:tcW w:type="dxa" w:w="2880"/>
-          </w:tcPr>
-          <w:p>
-            <w:r>
-              <w:t>#BFBFBF</w:t>
-            </w:r>
-          </w:p>
-        </w:tc>
-        <w:tc>
-          <w:tcPr>
-            <w:shd w:fill="BFBFBF"/>
-          </w:tcPr>
-        </w:tc>
-      </w:tr>
-      <w:tr>
-        <w:tc>
-          <w:tcPr>
-            <w:tcW w:type="dxa" w:w="2880"/>
-          </w:tcPr>
-          <w:p>
-            <w:r>
-              <w:t>Semantic</w:t>
-            </w:r>
-          </w:p>
-        </w:tc>
-        <w:tc>
-          <w:tcPr>
-            <w:tcW w:type="dxa" w:w="2880"/>
-          </w:tcPr>
-          <w:p>
-            <w:r>
-              <w:t>Good / Increase</w:t>
-            </w:r>
-          </w:p>
-        </w:tc>
-        <w:tc>
-          <w:tcPr>
-            <w:tcW w:type="dxa" w:w="2880"/>
-          </w:tcPr>
-          <w:p>
-            <w:r>
-              <w:t>#1C6B27</w:t>
-            </w:r>
-          </w:p>
-        </w:tc>
-        <w:tc>
-          <w:tcPr>
-            <w:shd w:fill="1C6B27"/>
-          </w:tcPr>
-        </w:tc>
-      </w:tr>
-      <w:tr>
-        <w:tc>
-          <w:tcPr>
-            <w:tcW w:type="dxa" w:w="2880"/>
-          </w:tcPr>
-          <w:p>
-            <w:r/>
-          </w:p>
-        </w:tc>
-        <w:tc>
-          <w:tcPr>
-            <w:tcW w:type="dxa" w:w="2880"/>
-          </w:tcPr>
-          <w:p>
-            <w:r>
-              <w:t>Neutral</w:t>
-            </w:r>
-          </w:p>
-        </w:tc>
-        <w:tc>
-          <w:tcPr>
-            <w:tcW w:type="dxa" w:w="2880"/>
-          </w:tcPr>
-          <w:p>
-            <w:r>
-              <w:t>#BFBFBF</w:t>
-            </w:r>
-          </w:p>
-        </w:tc>
-        <w:tc>
-          <w:tcPr>
-            <w:shd w:fill="BFBFBF"/>
-          </w:tcPr>
-        </w:tc>
-      </w:tr>
-      <w:tr>
-        <w:tc>
-          <w:tcPr>
-            <w:tcW w:type="dxa" w:w="2880"/>
-          </w:tcPr>
-          <w:p>
-            <w:r/>
-          </w:p>
-        </w:tc>
-        <w:tc>
-          <w:tcPr>
-            <w:tcW w:type="dxa" w:w="2880"/>
-          </w:tcPr>
-          <w:p>
-            <w:r>
-              <w:t>Total</w:t>
-            </w:r>
-          </w:p>
-        </w:tc>
-        <w:tc>
-          <w:tcPr>
-            <w:tcW w:type="dxa" w:w="2880"/>
-          </w:tcPr>
-          <w:p>
-            <w:r>
-              <w:t>#1282C6</w:t>
-            </w:r>
-          </w:p>
-        </w:tc>
-        <w:tc>
-          <w:tcPr>
-            <w:shd w:fill="1282C6"/>
-          </w:tcPr>
-        </w:tc>
-      </w:tr>
-      <w:tr>
-        <w:tc>
-          <w:tcPr>
-            <w:tcW w:type="dxa" w:w="2880"/>
-          </w:tcPr>
-          <w:p>
-            <w:r/>
-          </w:p>
-        </w:tc>
-        <w:tc>
-          <w:tcPr>
-            <w:tcW w:type="dxa" w:w="2880"/>
-          </w:tcPr>
-          <w:p>
-            <w:r>
-              <w:t>Bad / Decrease</w:t>
-            </w:r>
-          </w:p>
-        </w:tc>
-        <w:tc>
-          <w:tcPr>
-            <w:tcW w:type="dxa" w:w="2880"/>
-          </w:tcPr>
-          <w:p>
-            <w:r>
-              <w:t>#C8353D</w:t>
-            </w:r>
-          </w:p>
-        </w:tc>
-        <w:tc>
-          <w:tcPr>
-            <w:shd w:fill="C8353D"/>
-          </w:tcPr>
-        </w:tc>
-      </w:tr>
-    </w:tbl>
     <w:sectPr>
       <w:pgSz w:w="12240" w:h="15840"/>
       <w:pgMar w:top="1440" w:right="1800" w:bottom="1440" w:left="1800" w:header="720" w:footer="720" w:gutter="0"/>
@@ -4592,10 +1089,6 @@
     <w:name w:val="Normal"/>
     <w:qFormat/>
     <w:rsid w:val="00FC693F"/>
-    <w:rPr>
-      <w:rFonts w:ascii="Arial" w:hAnsi="Arial"/>
-      <w:sz w:val="22"/>
-    </w:rPr>
   </w:style>
   <w:style w:type="paragraph" w:styleId="Header">
     <w:name w:val="header"/>
@@ -4656,11 +1149,11 @@
       <w:outlineLvl w:val="0"/>
     </w:pPr>
     <w:rPr>
-      <w:rFonts w:asciiTheme="majorHAnsi" w:eastAsiaTheme="majorEastAsia" w:hAnsiTheme="majorHAnsi" w:cstheme="majorBidi" w:ascii="Arial" w:hAnsi="Arial"/>
+      <w:rFonts w:asciiTheme="majorHAnsi" w:eastAsiaTheme="majorEastAsia" w:hAnsiTheme="majorHAnsi" w:cstheme="majorBidi"/>
       <w:b/>
       <w:bCs/>
-      <w:color w:val="C8353D"/>
-      <w:sz w:val="48"/>
+      <w:color w:val="365F91" w:themeColor="accent1" w:themeShade="BF"/>
+      <w:sz w:val="28"/>
       <w:szCs w:val="28"/>
     </w:rPr>
   </w:style>
@@ -4680,11 +1173,11 @@
       <w:outlineLvl w:val="1"/>
     </w:pPr>
     <w:rPr>
-      <w:rFonts w:asciiTheme="majorHAnsi" w:eastAsiaTheme="majorEastAsia" w:hAnsiTheme="majorHAnsi" w:cstheme="majorBidi" w:ascii="Arial" w:hAnsi="Arial"/>
+      <w:rFonts w:asciiTheme="majorHAnsi" w:eastAsiaTheme="majorEastAsia" w:hAnsiTheme="majorHAnsi" w:cstheme="majorBidi"/>
       <w:b/>
       <w:bCs/>
-      <w:color w:val="1282C6"/>
-      <w:sz w:val="36"/>
+      <w:color w:val="4F81BD" w:themeColor="accent1"/>
+      <w:sz w:val="26"/>
       <w:szCs w:val="26"/>
     </w:rPr>
   </w:style>
@@ -4704,11 +1197,10 @@
       <w:outlineLvl w:val="2"/>
     </w:pPr>
     <w:rPr>
-      <w:rFonts w:asciiTheme="majorHAnsi" w:eastAsiaTheme="majorEastAsia" w:hAnsiTheme="majorHAnsi" w:cstheme="majorBidi" w:ascii="Arial" w:hAnsi="Arial"/>
+      <w:rFonts w:asciiTheme="majorHAnsi" w:eastAsiaTheme="majorEastAsia" w:hAnsiTheme="majorHAnsi" w:cstheme="majorBidi"/>
       <w:b/>
       <w:bCs/>
-      <w:color w:val="1282C6"/>
-      <w:sz w:val="28"/>
+      <w:color w:val="4F81BD" w:themeColor="accent1"/>
     </w:rPr>
   </w:style>
   <w:style w:type="paragraph" w:styleId="Heading4">

</xml_diff>

<commit_message>
update MD to DOCX conversion
</commit_message>
<xml_diff>
--- a/themes/CS_Wholesale_UI_Spec.docx
+++ b/themes/CS_Wholesale_UI_Spec.docx
@@ -11,15 +11,27 @@
       </w:r>
     </w:p>
     <w:p>
+      <w:pPr>
+        <w:pStyle w:val="Quote"/>
+      </w:pPr>
       <w:r>
-        <w:rPr>
-          <w:b/>
-        </w:rPr>
         <w:t>Version: 1.1</w:t>
-        <w:br/>
+      </w:r>
+    </w:p>
+    <w:p>
+      <w:pPr>
+        <w:pStyle w:val="Quote"/>
+      </w:pPr>
+      <w:r>
         <w:t>Date: March 20, 2026</w:t>
-        <w:br/>
-        <w:t>Purpose: Developer reference for C&amp;S Wholesale Grocers branding.</w:t>
+      </w:r>
+    </w:p>
+    <w:p>
+      <w:pPr>
+        <w:pStyle w:val="Quote"/>
+      </w:pPr>
+      <w:r>
+        <w:t>Purpose: Developer reference for building applications, dashboards, and reports aligned with the C&amp;S Wholesale Grocers brand identity.</w:t>
       </w:r>
     </w:p>
     <w:p>
@@ -28,6 +40,11 @@
       </w:pPr>
       <w:r>
         <w:t>1. Corporate Color Palette</w:t>
+      </w:r>
+    </w:p>
+    <w:p>
+      <w:r>
+        <w:t>These are the primary brand colors used for UI chrome, headers, navigation, logos, and body text.</w:t>
       </w:r>
     </w:p>
     <w:tbl>
@@ -121,7 +138,7 @@
           </w:tcPr>
           <w:p>
             <w:r>
-              <w:t>Logo, actions</w:t>
+              <w:t>Logo, primary actions, headers, active states, alerts</w:t>
             </w:r>
           </w:p>
         </w:tc>
@@ -163,7 +180,7 @@
           </w:tcPr>
           <w:p>
             <w:r>
-              <w:t>Body text</w:t>
+              <w:t>Body text, secondary elements, axis labels, borders</w:t>
             </w:r>
           </w:p>
         </w:tc>
@@ -205,7 +222,7 @@
           </w:tcPr>
           <w:p>
             <w:r>
-              <w:t>Readability</w:t>
+              <w:t>Body copy, data values, maximum readability contexts</w:t>
             </w:r>
           </w:p>
         </w:tc>
@@ -247,7 +264,187 @@
           </w:tcPr>
           <w:p>
             <w:r>
-              <w:t>Canvas</w:t>
+              <w:t>Page backgrounds, card surfaces, clean space</w:t>
+            </w:r>
+          </w:p>
+        </w:tc>
+      </w:tr>
+    </w:tbl>
+    <w:p>
+      <w:pPr>
+        <w:pStyle w:val="Heading2"/>
+      </w:pPr>
+      <w:r>
+        <w:t>Surface &amp; Neutral Colors</w:t>
+      </w:r>
+    </w:p>
+    <w:tbl>
+      <w:tblPr>
+        <w:tblStyle w:val="TableGrid"/>
+        <w:tblW w:type="auto" w:w="0"/>
+        <w:tblLook w:firstColumn="1" w:firstRow="1" w:lastColumn="0" w:lastRow="0" w:noHBand="0" w:noVBand="1" w:val="04A0"/>
+      </w:tblPr>
+      <w:tblGrid>
+        <w:gridCol w:w="2880"/>
+        <w:gridCol w:w="2880"/>
+        <w:gridCol w:w="2880"/>
+      </w:tblGrid>
+      <w:tr>
+        <w:tc>
+          <w:tcPr>
+            <w:tcW w:type="dxa" w:w="2880"/>
+          </w:tcPr>
+          <w:p>
+            <w:r>
+              <w:t>Name</w:t>
+            </w:r>
+          </w:p>
+        </w:tc>
+        <w:tc>
+          <w:tcPr>
+            <w:tcW w:type="dxa" w:w="2880"/>
+          </w:tcPr>
+          <w:p>
+            <w:r>
+              <w:t>Hex</w:t>
+            </w:r>
+          </w:p>
+        </w:tc>
+        <w:tc>
+          <w:tcPr>
+            <w:tcW w:type="dxa" w:w="2880"/>
+          </w:tcPr>
+          <w:p>
+            <w:r>
+              <w:t>Usage</w:t>
+            </w:r>
+          </w:p>
+        </w:tc>
+      </w:tr>
+      <w:tr>
+        <w:tc>
+          <w:tcPr>
+            <w:tcW w:type="dxa" w:w="2880"/>
+          </w:tcPr>
+          <w:p>
+            <w:r>
+              <w:t>Page Background</w:t>
+            </w:r>
+          </w:p>
+        </w:tc>
+        <w:tc>
+          <w:tcPr>
+            <w:tcW w:type="dxa" w:w="2880"/>
+          </w:tcPr>
+          <w:p>
+            <w:r>
+              <w:t>#F2F2F2</w:t>
+            </w:r>
+          </w:p>
+        </w:tc>
+        <w:tc>
+          <w:tcPr>
+            <w:tcW w:type="dxa" w:w="2880"/>
+          </w:tcPr>
+          <w:p>
+            <w:r>
+              <w:t>Canvas / outer page area behind cards</w:t>
+            </w:r>
+          </w:p>
+        </w:tc>
+      </w:tr>
+      <w:tr>
+        <w:tc>
+          <w:tcPr>
+            <w:tcW w:type="dxa" w:w="2880"/>
+          </w:tcPr>
+          <w:p>
+            <w:r>
+              <w:t>Card Surface</w:t>
+            </w:r>
+          </w:p>
+        </w:tc>
+        <w:tc>
+          <w:tcPr>
+            <w:tcW w:type="dxa" w:w="2880"/>
+          </w:tcPr>
+          <w:p>
+            <w:r>
+              <w:t>#FFFFFF</w:t>
+            </w:r>
+          </w:p>
+        </w:tc>
+        <w:tc>
+          <w:tcPr>
+            <w:tcW w:type="dxa" w:w="2880"/>
+          </w:tcPr>
+          <w:p>
+            <w:r>
+              <w:t>Visual container backgrounds</w:t>
+            </w:r>
+          </w:p>
+        </w:tc>
+      </w:tr>
+      <w:tr>
+        <w:tc>
+          <w:tcPr>
+            <w:tcW w:type="dxa" w:w="2880"/>
+          </w:tcPr>
+          <w:p>
+            <w:r>
+              <w:t>Divider / Grid</w:t>
+            </w:r>
+          </w:p>
+        </w:tc>
+        <w:tc>
+          <w:tcPr>
+            <w:tcW w:type="dxa" w:w="2880"/>
+          </w:tcPr>
+          <w:p>
+            <w:r>
+              <w:t>#E6E6E6</w:t>
+            </w:r>
+          </w:p>
+        </w:tc>
+        <w:tc>
+          <w:tcPr>
+            <w:tcW w:type="dxa" w:w="2880"/>
+          </w:tcPr>
+          <w:p>
+            <w:r>
+              <w:t>Table gridlines, borders, separators</w:t>
+            </w:r>
+          </w:p>
+        </w:tc>
+      </w:tr>
+      <w:tr>
+        <w:tc>
+          <w:tcPr>
+            <w:tcW w:type="dxa" w:w="2880"/>
+          </w:tcPr>
+          <w:p>
+            <w:r>
+              <w:t>Alternating Row</w:t>
+            </w:r>
+          </w:p>
+        </w:tc>
+        <w:tc>
+          <w:tcPr>
+            <w:tcW w:type="dxa" w:w="2880"/>
+          </w:tcPr>
+          <w:p>
+            <w:r>
+              <w:t>#F2F2F2</w:t>
+            </w:r>
+          </w:p>
+        </w:tc>
+        <w:tc>
+          <w:tcPr>
+            <w:tcW w:type="dxa" w:w="2880"/>
+          </w:tcPr>
+          <w:p>
+            <w:r>
+              <w:t>Banded table rows for readability</w:t>
             </w:r>
           </w:p>
         </w:tc>
@@ -256,6 +453,1720 @@
     <w:p>
       <w:pPr>
         <w:pStyle w:val="Heading1"/>
+      </w:pPr>
+      <w:r>
+        <w:t>2. Data Visualization Palette</w:t>
+      </w:r>
+    </w:p>
+    <w:p>
+      <w:r>
+        <w:t>The splash colors are reserved for charts, graphs, and any visual requiring multiple distinct data series.</w:t>
+      </w:r>
+    </w:p>
+    <w:tbl>
+      <w:tblPr>
+        <w:tblStyle w:val="TableGrid"/>
+        <w:tblW w:type="auto" w:w="0"/>
+        <w:tblLook w:firstColumn="1" w:firstRow="1" w:lastColumn="0" w:lastRow="0" w:noHBand="0" w:noVBand="1" w:val="04A0"/>
+      </w:tblPr>
+      <w:tblGrid>
+        <w:gridCol w:w="2160"/>
+        <w:gridCol w:w="2160"/>
+        <w:gridCol w:w="2160"/>
+        <w:gridCol w:w="2160"/>
+      </w:tblGrid>
+      <w:tr>
+        <w:tc>
+          <w:tcPr>
+            <w:tcW w:type="dxa" w:w="2160"/>
+          </w:tcPr>
+          <w:p>
+            <w:r>
+              <w:t>Order</w:t>
+            </w:r>
+          </w:p>
+        </w:tc>
+        <w:tc>
+          <w:tcPr>
+            <w:tcW w:type="dxa" w:w="2160"/>
+          </w:tcPr>
+          <w:p>
+            <w:r>
+              <w:t>Name</w:t>
+            </w:r>
+          </w:p>
+        </w:tc>
+        <w:tc>
+          <w:tcPr>
+            <w:tcW w:type="dxa" w:w="2160"/>
+          </w:tcPr>
+          <w:p>
+            <w:r>
+              <w:t>Hex</w:t>
+            </w:r>
+          </w:p>
+        </w:tc>
+        <w:tc>
+          <w:tcPr>
+            <w:tcW w:type="dxa" w:w="2160"/>
+          </w:tcPr>
+          <w:p>
+            <w:r>
+              <w:t>Primary Use</w:t>
+            </w:r>
+          </w:p>
+        </w:tc>
+      </w:tr>
+      <w:tr>
+        <w:tc>
+          <w:tcPr>
+            <w:tcW w:type="dxa" w:w="2160"/>
+          </w:tcPr>
+          <w:p>
+            <w:r>
+              <w:t>1</w:t>
+            </w:r>
+          </w:p>
+        </w:tc>
+        <w:tc>
+          <w:tcPr>
+            <w:tcW w:type="dxa" w:w="2160"/>
+          </w:tcPr>
+          <w:p>
+            <w:r>
+              <w:t>Red</w:t>
+            </w:r>
+          </w:p>
+        </w:tc>
+        <w:tc>
+          <w:tcPr>
+            <w:tcW w:type="dxa" w:w="2160"/>
+          </w:tcPr>
+          <w:p>
+            <w:r>
+              <w:t>#C8353D</w:t>
+            </w:r>
+          </w:p>
+        </w:tc>
+        <w:tc>
+          <w:tcPr>
+            <w:tcW w:type="dxa" w:w="2160"/>
+          </w:tcPr>
+          <w:p>
+            <w:r>
+              <w:t>Default / first series</w:t>
+            </w:r>
+          </w:p>
+        </w:tc>
+      </w:tr>
+      <w:tr>
+        <w:tc>
+          <w:tcPr>
+            <w:tcW w:type="dxa" w:w="2160"/>
+          </w:tcPr>
+          <w:p>
+            <w:r>
+              <w:t>2</w:t>
+            </w:r>
+          </w:p>
+        </w:tc>
+        <w:tc>
+          <w:tcPr>
+            <w:tcW w:type="dxa" w:w="2160"/>
+          </w:tcPr>
+          <w:p>
+            <w:r>
+              <w:t>Dark Blue</w:t>
+            </w:r>
+          </w:p>
+        </w:tc>
+        <w:tc>
+          <w:tcPr>
+            <w:tcW w:type="dxa" w:w="2160"/>
+          </w:tcPr>
+          <w:p>
+            <w:r>
+              <w:t>#1282C6</w:t>
+            </w:r>
+          </w:p>
+        </w:tc>
+        <w:tc>
+          <w:tcPr>
+            <w:tcW w:type="dxa" w:w="2160"/>
+          </w:tcPr>
+          <w:p>
+            <w:r>
+              <w:t>Second series, totals, secondary KPIs</w:t>
+            </w:r>
+          </w:p>
+        </w:tc>
+      </w:tr>
+      <w:tr>
+        <w:tc>
+          <w:tcPr>
+            <w:tcW w:type="dxa" w:w="2160"/>
+          </w:tcPr>
+          <w:p>
+            <w:r>
+              <w:t>3</w:t>
+            </w:r>
+          </w:p>
+        </w:tc>
+        <w:tc>
+          <w:tcPr>
+            <w:tcW w:type="dxa" w:w="2160"/>
+          </w:tcPr>
+          <w:p>
+            <w:r>
+              <w:t>Lime Green</w:t>
+            </w:r>
+          </w:p>
+        </w:tc>
+        <w:tc>
+          <w:tcPr>
+            <w:tcW w:type="dxa" w:w="2160"/>
+          </w:tcPr>
+          <w:p>
+            <w:r>
+              <w:t>#79BE2E</w:t>
+            </w:r>
+          </w:p>
+        </w:tc>
+        <w:tc>
+          <w:tcPr>
+            <w:tcW w:type="dxa" w:w="2160"/>
+          </w:tcPr>
+          <w:p>
+            <w:r>
+              <w:t>Third series, positive indicators</w:t>
+            </w:r>
+          </w:p>
+        </w:tc>
+      </w:tr>
+      <w:tr>
+        <w:tc>
+          <w:tcPr>
+            <w:tcW w:type="dxa" w:w="2160"/>
+          </w:tcPr>
+          <w:p>
+            <w:r>
+              <w:t>4</w:t>
+            </w:r>
+          </w:p>
+        </w:tc>
+        <w:tc>
+          <w:tcPr>
+            <w:tcW w:type="dxa" w:w="2160"/>
+          </w:tcPr>
+          <w:p>
+            <w:r>
+              <w:t>Magenta</w:t>
+            </w:r>
+          </w:p>
+        </w:tc>
+        <w:tc>
+          <w:tcPr>
+            <w:tcW w:type="dxa" w:w="2160"/>
+          </w:tcPr>
+          <w:p>
+            <w:r>
+              <w:t>#9F2C92</w:t>
+            </w:r>
+          </w:p>
+        </w:tc>
+        <w:tc>
+          <w:tcPr>
+            <w:tcW w:type="dxa" w:w="2160"/>
+          </w:tcPr>
+          <w:p>
+            <w:r>
+              <w:t>Fourth series, categorical contrast</w:t>
+            </w:r>
+          </w:p>
+        </w:tc>
+      </w:tr>
+      <w:tr>
+        <w:tc>
+          <w:tcPr>
+            <w:tcW w:type="dxa" w:w="2160"/>
+          </w:tcPr>
+          <w:p>
+            <w:r>
+              <w:t>5</w:t>
+            </w:r>
+          </w:p>
+        </w:tc>
+        <w:tc>
+          <w:tcPr>
+            <w:tcW w:type="dxa" w:w="2160"/>
+          </w:tcPr>
+          <w:p>
+            <w:r>
+              <w:t>Orange</w:t>
+            </w:r>
+          </w:p>
+        </w:tc>
+        <w:tc>
+          <w:tcPr>
+            <w:tcW w:type="dxa" w:w="2160"/>
+          </w:tcPr>
+          <w:p>
+            <w:r>
+              <w:t>#E7703A</w:t>
+            </w:r>
+          </w:p>
+        </w:tc>
+        <w:tc>
+          <w:tcPr>
+            <w:tcW w:type="dxa" w:w="2160"/>
+          </w:tcPr>
+          <w:p>
+            <w:r>
+              <w:t>Fifth series, warnings</w:t>
+            </w:r>
+          </w:p>
+        </w:tc>
+      </w:tr>
+      <w:tr>
+        <w:tc>
+          <w:tcPr>
+            <w:tcW w:type="dxa" w:w="2160"/>
+          </w:tcPr>
+          <w:p>
+            <w:r>
+              <w:t>6</w:t>
+            </w:r>
+          </w:p>
+        </w:tc>
+        <w:tc>
+          <w:tcPr>
+            <w:tcW w:type="dxa" w:w="2160"/>
+          </w:tcPr>
+          <w:p>
+            <w:r>
+              <w:t>Light Blue</w:t>
+            </w:r>
+          </w:p>
+        </w:tc>
+        <w:tc>
+          <w:tcPr>
+            <w:tcW w:type="dxa" w:w="2160"/>
+          </w:tcPr>
+          <w:p>
+            <w:r>
+              <w:t>#1E9FD3</w:t>
+            </w:r>
+          </w:p>
+        </w:tc>
+        <w:tc>
+          <w:tcPr>
+            <w:tcW w:type="dxa" w:w="2160"/>
+          </w:tcPr>
+          <w:p>
+            <w:r>
+              <w:t>Sixth series, informational</w:t>
+            </w:r>
+          </w:p>
+        </w:tc>
+      </w:tr>
+      <w:tr>
+        <w:tc>
+          <w:tcPr>
+            <w:tcW w:type="dxa" w:w="2160"/>
+          </w:tcPr>
+          <w:p>
+            <w:r>
+              <w:t>7</w:t>
+            </w:r>
+          </w:p>
+        </w:tc>
+        <w:tc>
+          <w:tcPr>
+            <w:tcW w:type="dxa" w:w="2160"/>
+          </w:tcPr>
+          <w:p>
+            <w:r>
+              <w:t>Dark Green</w:t>
+            </w:r>
+          </w:p>
+        </w:tc>
+        <w:tc>
+          <w:tcPr>
+            <w:tcW w:type="dxa" w:w="2160"/>
+          </w:tcPr>
+          <w:p>
+            <w:r>
+              <w:t>#1C6B27</w:t>
+            </w:r>
+          </w:p>
+        </w:tc>
+        <w:tc>
+          <w:tcPr>
+            <w:tcW w:type="dxa" w:w="2160"/>
+          </w:tcPr>
+          <w:p>
+            <w:r>
+              <w:t>Seventh series, success states</w:t>
+            </w:r>
+          </w:p>
+        </w:tc>
+      </w:tr>
+      <w:tr>
+        <w:tc>
+          <w:tcPr>
+            <w:tcW w:type="dxa" w:w="2160"/>
+          </w:tcPr>
+          <w:p>
+            <w:r>
+              <w:t>8</w:t>
+            </w:r>
+          </w:p>
+        </w:tc>
+        <w:tc>
+          <w:tcPr>
+            <w:tcW w:type="dxa" w:w="2160"/>
+          </w:tcPr>
+          <w:p>
+            <w:r>
+              <w:t>Gray</w:t>
+            </w:r>
+          </w:p>
+        </w:tc>
+        <w:tc>
+          <w:tcPr>
+            <w:tcW w:type="dxa" w:w="2160"/>
+          </w:tcPr>
+          <w:p>
+            <w:r>
+              <w:t>#BFBFBF</w:t>
+            </w:r>
+          </w:p>
+        </w:tc>
+        <w:tc>
+          <w:tcPr>
+            <w:tcW w:type="dxa" w:w="2160"/>
+          </w:tcPr>
+          <w:p>
+            <w:r>
+              <w:t>Eighth series, neutral/baseline</w:t>
+            </w:r>
+          </w:p>
+        </w:tc>
+      </w:tr>
+    </w:tbl>
+    <w:p>
+      <w:pPr>
+        <w:pStyle w:val="Heading2"/>
+      </w:pPr>
+      <w:r>
+        <w:t>Semantic Colors &amp; Conditional Formatting</w:t>
+      </w:r>
+    </w:p>
+    <w:tbl>
+      <w:tblPr>
+        <w:tblStyle w:val="TableGrid"/>
+        <w:tblW w:type="auto" w:w="0"/>
+        <w:tblLook w:firstColumn="1" w:firstRow="1" w:lastColumn="0" w:lastRow="0" w:noHBand="0" w:noVBand="1" w:val="04A0"/>
+      </w:tblPr>
+      <w:tblGrid>
+        <w:gridCol w:w="2160"/>
+        <w:gridCol w:w="2160"/>
+        <w:gridCol w:w="2160"/>
+        <w:gridCol w:w="2160"/>
+      </w:tblGrid>
+      <w:tr>
+        <w:tc>
+          <w:tcPr>
+            <w:tcW w:type="dxa" w:w="2160"/>
+          </w:tcPr>
+          <w:p>
+            <w:r>
+              <w:t>Context</w:t>
+            </w:r>
+          </w:p>
+        </w:tc>
+        <w:tc>
+          <w:tcPr>
+            <w:tcW w:type="dxa" w:w="2160"/>
+          </w:tcPr>
+          <w:p>
+            <w:r>
+              <w:t>Color</w:t>
+            </w:r>
+          </w:p>
+        </w:tc>
+        <w:tc>
+          <w:tcPr>
+            <w:tcW w:type="dxa" w:w="2160"/>
+          </w:tcPr>
+          <w:p>
+            <w:r>
+              <w:t>Hex</w:t>
+            </w:r>
+          </w:p>
+        </w:tc>
+        <w:tc>
+          <w:tcPr>
+            <w:tcW w:type="dxa" w:w="2160"/>
+          </w:tcPr>
+          <w:p>
+            <w:r>
+              <w:t>Usage Notes</w:t>
+            </w:r>
+          </w:p>
+        </w:tc>
+      </w:tr>
+      <w:tr>
+        <w:tc>
+          <w:tcPr>
+            <w:tcW w:type="dxa" w:w="2160"/>
+          </w:tcPr>
+          <w:p>
+            <w:r>
+              <w:t>✅ Good / Positive</w:t>
+            </w:r>
+          </w:p>
+        </w:tc>
+        <w:tc>
+          <w:tcPr>
+            <w:tcW w:type="dxa" w:w="2160"/>
+          </w:tcPr>
+          <w:p>
+            <w:r>
+              <w:t>Dark Green</w:t>
+            </w:r>
+          </w:p>
+        </w:tc>
+        <w:tc>
+          <w:tcPr>
+            <w:tcW w:type="dxa" w:w="2160"/>
+          </w:tcPr>
+          <w:p>
+            <w:r>
+              <w:t>#1C6B27</w:t>
+            </w:r>
+          </w:p>
+        </w:tc>
+        <w:tc>
+          <w:tcPr>
+            <w:tcW w:type="dxa" w:w="2160"/>
+          </w:tcPr>
+          <w:p>
+            <w:r>
+              <w:t>KPIs hitting target, success states, positive variance. Safe for text on white.</w:t>
+            </w:r>
+          </w:p>
+        </w:tc>
+      </w:tr>
+      <w:tr>
+        <w:tc>
+          <w:tcPr>
+            <w:tcW w:type="dxa" w:w="2160"/>
+          </w:tcPr>
+          <w:p>
+            <w:r>
+              <w:t>⚠️ Neutral / Info</w:t>
+            </w:r>
+          </w:p>
+        </w:tc>
+        <w:tc>
+          <w:tcPr>
+            <w:tcW w:type="dxa" w:w="2160"/>
+          </w:tcPr>
+          <w:p>
+            <w:r>
+              <w:t>Gray</w:t>
+            </w:r>
+          </w:p>
+        </w:tc>
+        <w:tc>
+          <w:tcPr>
+            <w:tcW w:type="dxa" w:w="2160"/>
+          </w:tcPr>
+          <w:p>
+            <w:r>
+              <w:t>#BFBFBF</w:t>
+            </w:r>
+          </w:p>
+        </w:tc>
+        <w:tc>
+          <w:tcPr>
+            <w:tcW w:type="dxa" w:w="2160"/>
+          </w:tcPr>
+          <w:p>
+            <w:r>
+              <w:t>Informational callouts, baseline metrics, unchanged values.</w:t>
+            </w:r>
+          </w:p>
+        </w:tc>
+      </w:tr>
+      <w:tr>
+        <w:tc>
+          <w:tcPr>
+            <w:tcW w:type="dxa" w:w="2160"/>
+          </w:tcPr>
+          <w:p>
+            <w:r>
+              <w:t>❌ Bad / Negative</w:t>
+            </w:r>
+          </w:p>
+        </w:tc>
+        <w:tc>
+          <w:tcPr>
+            <w:tcW w:type="dxa" w:w="2160"/>
+          </w:tcPr>
+          <w:p>
+            <w:r>
+              <w:t>Red</w:t>
+            </w:r>
+          </w:p>
+        </w:tc>
+        <w:tc>
+          <w:tcPr>
+            <w:tcW w:type="dxa" w:w="2160"/>
+          </w:tcPr>
+          <w:p>
+            <w:r>
+              <w:t>#C8353D</w:t>
+            </w:r>
+          </w:p>
+        </w:tc>
+        <w:tc>
+          <w:tcPr>
+            <w:tcW w:type="dxa" w:w="2160"/>
+          </w:tcPr>
+          <w:p>
+            <w:r>
+              <w:t>Missing targets, errors, negative variance, critical alerts.</w:t>
+            </w:r>
+          </w:p>
+        </w:tc>
+      </w:tr>
+      <w:tr>
+        <w:tc>
+          <w:tcPr>
+            <w:tcW w:type="dxa" w:w="2160"/>
+          </w:tcPr>
+          <w:p>
+            <w:r>
+              <w:t>▲ Increase (waterfall)</w:t>
+            </w:r>
+          </w:p>
+        </w:tc>
+        <w:tc>
+          <w:tcPr>
+            <w:tcW w:type="dxa" w:w="2160"/>
+          </w:tcPr>
+          <w:p>
+            <w:r>
+              <w:t>Dark Green</w:t>
+            </w:r>
+          </w:p>
+        </w:tc>
+        <w:tc>
+          <w:tcPr>
+            <w:tcW w:type="dxa" w:w="2160"/>
+          </w:tcPr>
+          <w:p>
+            <w:r>
+              <w:t>#1C6B27</w:t>
+            </w:r>
+          </w:p>
+        </w:tc>
+        <w:tc>
+          <w:tcPr>
+            <w:tcW w:type="dxa" w:w="2160"/>
+          </w:tcPr>
+          <w:p>
+            <w:r>
+              <w:t>Positive flow.</w:t>
+            </w:r>
+          </w:p>
+        </w:tc>
+      </w:tr>
+      <w:tr>
+        <w:tc>
+          <w:tcPr>
+            <w:tcW w:type="dxa" w:w="2160"/>
+          </w:tcPr>
+          <w:p>
+            <w:r>
+              <w:t>▼ Decrease (waterfall)</w:t>
+            </w:r>
+          </w:p>
+        </w:tc>
+        <w:tc>
+          <w:tcPr>
+            <w:tcW w:type="dxa" w:w="2160"/>
+          </w:tcPr>
+          <w:p>
+            <w:r>
+              <w:t>Red</w:t>
+            </w:r>
+          </w:p>
+        </w:tc>
+        <w:tc>
+          <w:tcPr>
+            <w:tcW w:type="dxa" w:w="2160"/>
+          </w:tcPr>
+          <w:p>
+            <w:r>
+              <w:t>#C8353D</w:t>
+            </w:r>
+          </w:p>
+        </w:tc>
+        <w:tc>
+          <w:tcPr>
+            <w:tcW w:type="dxa" w:w="2160"/>
+          </w:tcPr>
+          <w:p>
+            <w:r>
+              <w:t>Negative flow.</w:t>
+            </w:r>
+          </w:p>
+        </w:tc>
+      </w:tr>
+      <w:tr>
+        <w:tc>
+          <w:tcPr>
+            <w:tcW w:type="dxa" w:w="2160"/>
+          </w:tcPr>
+          <w:p>
+            <w:r>
+              <w:t>■ Total (waterfall)</w:t>
+            </w:r>
+          </w:p>
+        </w:tc>
+        <w:tc>
+          <w:tcPr>
+            <w:tcW w:type="dxa" w:w="2160"/>
+          </w:tcPr>
+          <w:p>
+            <w:r>
+              <w:t>Dark Blue</w:t>
+            </w:r>
+          </w:p>
+        </w:tc>
+        <w:tc>
+          <w:tcPr>
+            <w:tcW w:type="dxa" w:w="2160"/>
+          </w:tcPr>
+          <w:p>
+            <w:r>
+              <w:t>#1282C6</w:t>
+            </w:r>
+          </w:p>
+        </w:tc>
+        <w:tc>
+          <w:tcPr>
+            <w:tcW w:type="dxa" w:w="2160"/>
+          </w:tcPr>
+          <w:p>
+            <w:r>
+              <w:t>Neutral aggregation.</w:t>
+            </w:r>
+          </w:p>
+        </w:tc>
+      </w:tr>
+    </w:tbl>
+    <w:p>
+      <w:pPr>
+        <w:pStyle w:val="Heading3"/>
+      </w:pPr>
+      <w:r>
+        <w:t>Conditional Formatting Guidelines</w:t>
+      </w:r>
+    </w:p>
+    <w:p>
+      <w:pPr>
+        <w:pStyle w:val="ListBullet"/>
+      </w:pPr>
+      <w:r>
+        <w:t>Do not use Lime Green (#79BE2E) for text. Use Dark Green (#1C6B27) to maintain WCAG text contrast on white backgrounds. Lime Green is reserved for filled shapes only.</w:t>
+      </w:r>
+    </w:p>
+    <w:p>
+      <w:pPr>
+        <w:pStyle w:val="ListBullet"/>
+      </w:pPr>
+      <w:r>
+        <w:t>Diverging/Gradient Scales: When using background color conditionally on a continuous metric (e.g., heatmaps or matrix backgrounds), use the following 3-color scale:</w:t>
+      </w:r>
+    </w:p>
+    <w:p>
+      <w:pPr>
+        <w:pStyle w:val="ListBullet"/>
+      </w:pPr>
+      <w:r>
+        <w:t>Minimum / Bad: Red (#C8353D)</w:t>
+      </w:r>
+    </w:p>
+    <w:p>
+      <w:pPr>
+        <w:pStyle w:val="ListBullet"/>
+      </w:pPr>
+      <w:r>
+        <w:t>Center / Neutral: White (#FFFFFF)</w:t>
+      </w:r>
+    </w:p>
+    <w:p>
+      <w:pPr>
+        <w:pStyle w:val="ListBullet"/>
+      </w:pPr>
+      <w:r>
+        <w:t>Maximum / Good: Dark Green (#1C6B27)</w:t>
+      </w:r>
+    </w:p>
+    <w:p>
+      <w:pPr>
+        <w:pStyle w:val="Heading1"/>
+      </w:pPr>
+      <w:r>
+        <w:t>3. Typography</w:t>
+      </w:r>
+    </w:p>
+    <w:p>
+      <w:pPr>
+        <w:pStyle w:val="Quote"/>
+      </w:pPr>
+      <w:r>
+        <w:t>[!IMPORTANT]</w:t>
+      </w:r>
+    </w:p>
+    <w:p>
+      <w:pPr>
+        <w:pStyle w:val="Quote"/>
+      </w:pPr>
+      <w:r>
+        <w:t>Arial is the sole approved font family across all deliverables. Do not use specialty or decorative fonts. This ensures cross-platform consistency between Windows and macOS.</w:t>
+      </w:r>
+    </w:p>
+    <w:tbl>
+      <w:tblPr>
+        <w:tblStyle w:val="TableGrid"/>
+        <w:tblW w:type="auto" w:w="0"/>
+        <w:tblLook w:firstColumn="1" w:firstRow="1" w:lastColumn="0" w:lastRow="0" w:noHBand="0" w:noVBand="1" w:val="04A0"/>
+      </w:tblPr>
+      <w:tblGrid>
+        <w:gridCol w:w="1728"/>
+        <w:gridCol w:w="1728"/>
+        <w:gridCol w:w="1728"/>
+        <w:gridCol w:w="1728"/>
+        <w:gridCol w:w="1728"/>
+      </w:tblGrid>
+      <w:tr>
+        <w:tc>
+          <w:tcPr>
+            <w:tcW w:type="dxa" w:w="1728"/>
+          </w:tcPr>
+          <w:p>
+            <w:r>
+              <w:t>Element</w:t>
+            </w:r>
+          </w:p>
+        </w:tc>
+        <w:tc>
+          <w:tcPr>
+            <w:tcW w:type="dxa" w:w="1728"/>
+          </w:tcPr>
+          <w:p>
+            <w:r>
+              <w:t>Font</w:t>
+            </w:r>
+          </w:p>
+        </w:tc>
+        <w:tc>
+          <w:tcPr>
+            <w:tcW w:type="dxa" w:w="1728"/>
+          </w:tcPr>
+          <w:p>
+            <w:r>
+              <w:t>Weight</w:t>
+            </w:r>
+          </w:p>
+        </w:tc>
+        <w:tc>
+          <w:tcPr>
+            <w:tcW w:type="dxa" w:w="1728"/>
+          </w:tcPr>
+          <w:p>
+            <w:r>
+              <w:t>Size</w:t>
+            </w:r>
+          </w:p>
+        </w:tc>
+        <w:tc>
+          <w:tcPr>
+            <w:tcW w:type="dxa" w:w="1728"/>
+          </w:tcPr>
+          <w:p>
+            <w:r>
+              <w:t>Color</w:t>
+            </w:r>
+          </w:p>
+        </w:tc>
+      </w:tr>
+      <w:tr>
+        <w:tc>
+          <w:tcPr>
+            <w:tcW w:type="dxa" w:w="1728"/>
+          </w:tcPr>
+          <w:p>
+            <w:r>
+              <w:t>Page Title</w:t>
+            </w:r>
+          </w:p>
+        </w:tc>
+        <w:tc>
+          <w:tcPr>
+            <w:tcW w:type="dxa" w:w="1728"/>
+          </w:tcPr>
+          <w:p>
+            <w:r>
+              <w:t>Arial</w:t>
+            </w:r>
+          </w:p>
+        </w:tc>
+        <w:tc>
+          <w:tcPr>
+            <w:tcW w:type="dxa" w:w="1728"/>
+          </w:tcPr>
+          <w:p>
+            <w:r>
+              <w:t>Bold</w:t>
+            </w:r>
+          </w:p>
+        </w:tc>
+        <w:tc>
+          <w:tcPr>
+            <w:tcW w:type="dxa" w:w="1728"/>
+          </w:tcPr>
+          <w:p>
+            <w:r>
+              <w:t>16–20px</w:t>
+            </w:r>
+          </w:p>
+        </w:tc>
+        <w:tc>
+          <w:tcPr>
+            <w:tcW w:type="dxa" w:w="1728"/>
+          </w:tcPr>
+          <w:p>
+            <w:r>
+              <w:t>#C8353D</w:t>
+            </w:r>
+          </w:p>
+        </w:tc>
+      </w:tr>
+      <w:tr>
+        <w:tc>
+          <w:tcPr>
+            <w:tcW w:type="dxa" w:w="1728"/>
+          </w:tcPr>
+          <w:p>
+            <w:r>
+              <w:t>Visual Title</w:t>
+            </w:r>
+          </w:p>
+        </w:tc>
+        <w:tc>
+          <w:tcPr>
+            <w:tcW w:type="dxa" w:w="1728"/>
+          </w:tcPr>
+          <w:p>
+            <w:r>
+              <w:t>Arial</w:t>
+            </w:r>
+          </w:p>
+        </w:tc>
+        <w:tc>
+          <w:tcPr>
+            <w:tcW w:type="dxa" w:w="1728"/>
+          </w:tcPr>
+          <w:p>
+            <w:r>
+              <w:t>Bold</w:t>
+            </w:r>
+          </w:p>
+        </w:tc>
+        <w:tc>
+          <w:tcPr>
+            <w:tcW w:type="dxa" w:w="1728"/>
+          </w:tcPr>
+          <w:p>
+            <w:r>
+              <w:t>12–14px</w:t>
+            </w:r>
+          </w:p>
+        </w:tc>
+        <w:tc>
+          <w:tcPr>
+            <w:tcW w:type="dxa" w:w="1728"/>
+          </w:tcPr>
+          <w:p>
+            <w:r>
+              <w:t>#1282C6</w:t>
+            </w:r>
+          </w:p>
+        </w:tc>
+      </w:tr>
+      <w:tr>
+        <w:tc>
+          <w:tcPr>
+            <w:tcW w:type="dxa" w:w="1728"/>
+          </w:tcPr>
+          <w:p>
+            <w:r>
+              <w:t>Section Header</w:t>
+            </w:r>
+          </w:p>
+        </w:tc>
+        <w:tc>
+          <w:tcPr>
+            <w:tcW w:type="dxa" w:w="1728"/>
+          </w:tcPr>
+          <w:p>
+            <w:r>
+              <w:t>Arial</w:t>
+            </w:r>
+          </w:p>
+        </w:tc>
+        <w:tc>
+          <w:tcPr>
+            <w:tcW w:type="dxa" w:w="1728"/>
+          </w:tcPr>
+          <w:p>
+            <w:r>
+              <w:t>Bold</w:t>
+            </w:r>
+          </w:p>
+        </w:tc>
+        <w:tc>
+          <w:tcPr>
+            <w:tcW w:type="dxa" w:w="1728"/>
+          </w:tcPr>
+          <w:p>
+            <w:r>
+              <w:t>12px</w:t>
+            </w:r>
+          </w:p>
+        </w:tc>
+        <w:tc>
+          <w:tcPr>
+            <w:tcW w:type="dxa" w:w="1728"/>
+          </w:tcPr>
+          <w:p>
+            <w:r>
+              <w:t>#1282C6</w:t>
+            </w:r>
+          </w:p>
+        </w:tc>
+      </w:tr>
+      <w:tr>
+        <w:tc>
+          <w:tcPr>
+            <w:tcW w:type="dxa" w:w="1728"/>
+          </w:tcPr>
+          <w:p>
+            <w:r>
+              <w:t>Body Text</w:t>
+            </w:r>
+          </w:p>
+        </w:tc>
+        <w:tc>
+          <w:tcPr>
+            <w:tcW w:type="dxa" w:w="1728"/>
+          </w:tcPr>
+          <w:p>
+            <w:r>
+              <w:t>Arial</w:t>
+            </w:r>
+          </w:p>
+        </w:tc>
+        <w:tc>
+          <w:tcPr>
+            <w:tcW w:type="dxa" w:w="1728"/>
+          </w:tcPr>
+          <w:p>
+            <w:r>
+              <w:t>Regular</w:t>
+            </w:r>
+          </w:p>
+        </w:tc>
+        <w:tc>
+          <w:tcPr>
+            <w:tcW w:type="dxa" w:w="1728"/>
+          </w:tcPr>
+          <w:p>
+            <w:r>
+              <w:t>10–11px</w:t>
+            </w:r>
+          </w:p>
+        </w:tc>
+        <w:tc>
+          <w:tcPr>
+            <w:tcW w:type="dxa" w:w="1728"/>
+          </w:tcPr>
+          <w:p>
+            <w:r>
+              <w:t>#000000</w:t>
+            </w:r>
+          </w:p>
+        </w:tc>
+      </w:tr>
+      <w:tr>
+        <w:tc>
+          <w:tcPr>
+            <w:tcW w:type="dxa" w:w="1728"/>
+          </w:tcPr>
+          <w:p>
+            <w:r>
+              <w:t>Axis Labels</w:t>
+            </w:r>
+          </w:p>
+        </w:tc>
+        <w:tc>
+          <w:tcPr>
+            <w:tcW w:type="dxa" w:w="1728"/>
+          </w:tcPr>
+          <w:p>
+            <w:r>
+              <w:t>Arial</w:t>
+            </w:r>
+          </w:p>
+        </w:tc>
+        <w:tc>
+          <w:tcPr>
+            <w:tcW w:type="dxa" w:w="1728"/>
+          </w:tcPr>
+          <w:p>
+            <w:r>
+              <w:t>Regular</w:t>
+            </w:r>
+          </w:p>
+        </w:tc>
+        <w:tc>
+          <w:tcPr>
+            <w:tcW w:type="dxa" w:w="1728"/>
+          </w:tcPr>
+          <w:p>
+            <w:r>
+              <w:t>10px</w:t>
+            </w:r>
+          </w:p>
+        </w:tc>
+        <w:tc>
+          <w:tcPr>
+            <w:tcW w:type="dxa" w:w="1728"/>
+          </w:tcPr>
+          <w:p>
+            <w:r>
+              <w:t>#BFBFBF</w:t>
+            </w:r>
+          </w:p>
+        </w:tc>
+      </w:tr>
+      <w:tr>
+        <w:tc>
+          <w:tcPr>
+            <w:tcW w:type="dxa" w:w="1728"/>
+          </w:tcPr>
+          <w:p>
+            <w:r>
+              <w:t>Data Labels</w:t>
+            </w:r>
+          </w:p>
+        </w:tc>
+        <w:tc>
+          <w:tcPr>
+            <w:tcW w:type="dxa" w:w="1728"/>
+          </w:tcPr>
+          <w:p>
+            <w:r>
+              <w:t>Arial</w:t>
+            </w:r>
+          </w:p>
+        </w:tc>
+        <w:tc>
+          <w:tcPr>
+            <w:tcW w:type="dxa" w:w="1728"/>
+          </w:tcPr>
+          <w:p>
+            <w:r>
+              <w:t>Regular</w:t>
+            </w:r>
+          </w:p>
+        </w:tc>
+        <w:tc>
+          <w:tcPr>
+            <w:tcW w:type="dxa" w:w="1728"/>
+          </w:tcPr>
+          <w:p>
+            <w:r>
+              <w:t>10px</w:t>
+            </w:r>
+          </w:p>
+        </w:tc>
+        <w:tc>
+          <w:tcPr>
+            <w:tcW w:type="dxa" w:w="1728"/>
+          </w:tcPr>
+          <w:p>
+            <w:r>
+              <w:t>#BFBFBF</w:t>
+            </w:r>
+          </w:p>
+        </w:tc>
+      </w:tr>
+      <w:tr>
+        <w:tc>
+          <w:tcPr>
+            <w:tcW w:type="dxa" w:w="1728"/>
+          </w:tcPr>
+          <w:p>
+            <w:r>
+              <w:t>Table Headers</w:t>
+            </w:r>
+          </w:p>
+        </w:tc>
+        <w:tc>
+          <w:tcPr>
+            <w:tcW w:type="dxa" w:w="1728"/>
+          </w:tcPr>
+          <w:p>
+            <w:r>
+              <w:t>Arial</w:t>
+            </w:r>
+          </w:p>
+        </w:tc>
+        <w:tc>
+          <w:tcPr>
+            <w:tcW w:type="dxa" w:w="1728"/>
+          </w:tcPr>
+          <w:p>
+            <w:r>
+              <w:t>Bold</w:t>
+            </w:r>
+          </w:p>
+        </w:tc>
+        <w:tc>
+          <w:tcPr>
+            <w:tcW w:type="dxa" w:w="1728"/>
+          </w:tcPr>
+          <w:p>
+            <w:r>
+              <w:t>11px</w:t>
+            </w:r>
+          </w:p>
+        </w:tc>
+        <w:tc>
+          <w:tcPr>
+            <w:tcW w:type="dxa" w:w="1728"/>
+          </w:tcPr>
+          <w:p>
+            <w:r>
+              <w:t>#FFFFFF on #1282C6</w:t>
+            </w:r>
+          </w:p>
+        </w:tc>
+      </w:tr>
+      <w:tr>
+        <w:tc>
+          <w:tcPr>
+            <w:tcW w:type="dxa" w:w="1728"/>
+          </w:tcPr>
+          <w:p>
+            <w:r>
+              <w:t>Table Values</w:t>
+            </w:r>
+          </w:p>
+        </w:tc>
+        <w:tc>
+          <w:tcPr>
+            <w:tcW w:type="dxa" w:w="1728"/>
+          </w:tcPr>
+          <w:p>
+            <w:r>
+              <w:t>Arial</w:t>
+            </w:r>
+          </w:p>
+        </w:tc>
+        <w:tc>
+          <w:tcPr>
+            <w:tcW w:type="dxa" w:w="1728"/>
+          </w:tcPr>
+          <w:p>
+            <w:r>
+              <w:t>Regular</w:t>
+            </w:r>
+          </w:p>
+        </w:tc>
+        <w:tc>
+          <w:tcPr>
+            <w:tcW w:type="dxa" w:w="1728"/>
+          </w:tcPr>
+          <w:p>
+            <w:r>
+              <w:t>10px</w:t>
+            </w:r>
+          </w:p>
+        </w:tc>
+        <w:tc>
+          <w:tcPr>
+            <w:tcW w:type="dxa" w:w="1728"/>
+          </w:tcPr>
+          <w:p>
+            <w:r>
+              <w:t>#000000</w:t>
+            </w:r>
+          </w:p>
+        </w:tc>
+      </w:tr>
+      <w:tr>
+        <w:tc>
+          <w:tcPr>
+            <w:tcW w:type="dxa" w:w="1728"/>
+          </w:tcPr>
+          <w:p>
+            <w:r>
+              <w:t>Callout / KPI</w:t>
+            </w:r>
+          </w:p>
+        </w:tc>
+        <w:tc>
+          <w:tcPr>
+            <w:tcW w:type="dxa" w:w="1728"/>
+          </w:tcPr>
+          <w:p>
+            <w:r>
+              <w:t>Arial</w:t>
+            </w:r>
+          </w:p>
+        </w:tc>
+        <w:tc>
+          <w:tcPr>
+            <w:tcW w:type="dxa" w:w="1728"/>
+          </w:tcPr>
+          <w:p>
+            <w:r>
+              <w:t>Bold</w:t>
+            </w:r>
+          </w:p>
+        </w:tc>
+        <w:tc>
+          <w:tcPr>
+            <w:tcW w:type="dxa" w:w="1728"/>
+          </w:tcPr>
+          <w:p>
+            <w:r>
+              <w:t>28px</w:t>
+            </w:r>
+          </w:p>
+        </w:tc>
+        <w:tc>
+          <w:tcPr>
+            <w:tcW w:type="dxa" w:w="1728"/>
+          </w:tcPr>
+          <w:p>
+            <w:r>
+              <w:t>#C8353D</w:t>
+            </w:r>
+          </w:p>
+        </w:tc>
+      </w:tr>
+      <w:tr>
+        <w:tc>
+          <w:tcPr>
+            <w:tcW w:type="dxa" w:w="1728"/>
+          </w:tcPr>
+          <w:p>
+            <w:r>
+              <w:t>Category Label</w:t>
+            </w:r>
+          </w:p>
+        </w:tc>
+        <w:tc>
+          <w:tcPr>
+            <w:tcW w:type="dxa" w:w="1728"/>
+          </w:tcPr>
+          <w:p>
+            <w:r>
+              <w:t>Arial</w:t>
+            </w:r>
+          </w:p>
+        </w:tc>
+        <w:tc>
+          <w:tcPr>
+            <w:tcW w:type="dxa" w:w="1728"/>
+          </w:tcPr>
+          <w:p>
+            <w:r>
+              <w:t>Regular</w:t>
+            </w:r>
+          </w:p>
+        </w:tc>
+        <w:tc>
+          <w:tcPr>
+            <w:tcW w:type="dxa" w:w="1728"/>
+          </w:tcPr>
+          <w:p>
+            <w:r>
+              <w:t>11px</w:t>
+            </w:r>
+          </w:p>
+        </w:tc>
+        <w:tc>
+          <w:tcPr>
+            <w:tcW w:type="dxa" w:w="1728"/>
+          </w:tcPr>
+          <w:p>
+            <w:r>
+              <w:t>#BFBFBF</w:t>
+            </w:r>
+          </w:p>
+        </w:tc>
+      </w:tr>
+      <w:tr>
+        <w:tc>
+          <w:tcPr>
+            <w:tcW w:type="dxa" w:w="1728"/>
+          </w:tcPr>
+          <w:p>
+            <w:r>
+              <w:t>Legend</w:t>
+            </w:r>
+          </w:p>
+        </w:tc>
+        <w:tc>
+          <w:tcPr>
+            <w:tcW w:type="dxa" w:w="1728"/>
+          </w:tcPr>
+          <w:p>
+            <w:r>
+              <w:t>Arial</w:t>
+            </w:r>
+          </w:p>
+        </w:tc>
+        <w:tc>
+          <w:tcPr>
+            <w:tcW w:type="dxa" w:w="1728"/>
+          </w:tcPr>
+          <w:p>
+            <w:r>
+              <w:t>Regular</w:t>
+            </w:r>
+          </w:p>
+        </w:tc>
+        <w:tc>
+          <w:tcPr>
+            <w:tcW w:type="dxa" w:w="1728"/>
+          </w:tcPr>
+          <w:p>
+            <w:r>
+              <w:t>10px</w:t>
+            </w:r>
+          </w:p>
+        </w:tc>
+        <w:tc>
+          <w:tcPr>
+            <w:tcW w:type="dxa" w:w="1728"/>
+          </w:tcPr>
+          <w:p>
+            <w:r>
+              <w:t>#BFBFBF</w:t>
+            </w:r>
+          </w:p>
+        </w:tc>
+      </w:tr>
+      <w:tr>
+        <w:tc>
+          <w:tcPr>
+            <w:tcW w:type="dxa" w:w="1728"/>
+          </w:tcPr>
+          <w:p>
+            <w:r>
+              <w:t>Tooltip</w:t>
+            </w:r>
+          </w:p>
+        </w:tc>
+        <w:tc>
+          <w:tcPr>
+            <w:tcW w:type="dxa" w:w="1728"/>
+          </w:tcPr>
+          <w:p>
+            <w:r>
+              <w:t>Arial</w:t>
+            </w:r>
+          </w:p>
+        </w:tc>
+        <w:tc>
+          <w:tcPr>
+            <w:tcW w:type="dxa" w:w="1728"/>
+          </w:tcPr>
+          <w:p>
+            <w:r>
+              <w:t>Regular</w:t>
+            </w:r>
+          </w:p>
+        </w:tc>
+        <w:tc>
+          <w:tcPr>
+            <w:tcW w:type="dxa" w:w="1728"/>
+          </w:tcPr>
+          <w:p>
+            <w:r>
+              <w:t>10px</w:t>
+            </w:r>
+          </w:p>
+        </w:tc>
+        <w:tc>
+          <w:tcPr>
+            <w:tcW w:type="dxa" w:w="1728"/>
+          </w:tcPr>
+          <w:p>
+            <w:r>
+              <w:t>#000000</w:t>
+            </w:r>
+          </w:p>
+        </w:tc>
+      </w:tr>
+    </w:tbl>
+    <w:p>
+      <w:pPr>
+        <w:pStyle w:val="Heading1"/>
+      </w:pPr>
+      <w:r>
+        <w:t>4. Component Specifications</w:t>
+      </w:r>
+    </w:p>
+    <w:p>
+      <w:pPr>
+        <w:pStyle w:val="Heading2"/>
+      </w:pPr>
+      <w:r>
+        <w:t>4.1 Cards (KPI / Metric)</w:t>
+      </w:r>
+    </w:p>
+    <w:p/>
+    <w:p>
+      <w:r>
+        <w:rPr>
+          <w:rFonts w:ascii="Courier New" w:hAnsi="Courier New"/>
+          <w:sz w:val="18"/>
+        </w:rPr>
+        <w:t>┌──────────────────────────┐</w:t>
+      </w:r>
+    </w:p>
+    <w:p>
+      <w:r>
+        <w:rPr>
+          <w:rFonts w:ascii="Courier New" w:hAnsi="Courier New"/>
+          <w:sz w:val="18"/>
+        </w:rPr>
+        <w:t>│  [Visual Title]          │  Arial Bold 12px #1282C6</w:t>
+      </w:r>
+    </w:p>
+    <w:p>
+      <w:r>
+        <w:rPr>
+          <w:rFonts w:ascii="Courier New" w:hAnsi="Courier New"/>
+          <w:sz w:val="18"/>
+        </w:rPr>
+        <w:t>│                          │</w:t>
+      </w:r>
+    </w:p>
+    <w:p>
+      <w:r>
+        <w:rPr>
+          <w:rFonts w:ascii="Courier New" w:hAnsi="Courier New"/>
+          <w:sz w:val="18"/>
+        </w:rPr>
+        <w:t>│       1,234              │  Arial Bold 28px #C8353D</w:t>
+      </w:r>
+    </w:p>
+    <w:p>
+      <w:r>
+        <w:rPr>
+          <w:rFonts w:ascii="Courier New" w:hAnsi="Courier New"/>
+          <w:sz w:val="18"/>
+        </w:rPr>
+        <w:t>│    Total Revenue         │  Arial Regular 11px #BFBFBF</w:t>
+      </w:r>
+    </w:p>
+    <w:p>
+      <w:r>
+        <w:rPr>
+          <w:rFonts w:ascii="Courier New" w:hAnsi="Courier New"/>
+          <w:sz w:val="18"/>
+        </w:rPr>
+        <w:t>│                          │</w:t>
+      </w:r>
+    </w:p>
+    <w:p>
+      <w:r>
+        <w:rPr>
+          <w:rFonts w:ascii="Courier New" w:hAnsi="Courier New"/>
+          <w:sz w:val="18"/>
+        </w:rPr>
+        <w:t>└──────────────────────────┘</w:t>
+      </w:r>
+    </w:p>
+    <w:p>
+      <w:r>
+        <w:rPr>
+          <w:rFonts w:ascii="Courier New" w:hAnsi="Courier New"/>
+          <w:sz w:val="18"/>
+        </w:rPr>
+        <w:t xml:space="preserve">  Background: #F2F2F2</w:t>
+      </w:r>
+    </w:p>
+    <w:p>
+      <w:r>
+        <w:rPr>
+          <w:rFonts w:ascii="Courier New" w:hAnsi="Courier New"/>
+          <w:sz w:val="18"/>
+        </w:rPr>
+        <w:t xml:space="preserve">  Border: none</w:t>
+      </w:r>
+    </w:p>
+    <w:p>
+      <w:r>
+        <w:rPr>
+          <w:rFonts w:ascii="Courier New" w:hAnsi="Courier New"/>
+          <w:sz w:val="18"/>
+        </w:rPr>
+        <w:t xml:space="preserve">  Drop Shadow: subtle, #E6E6E6</w:t>
+      </w:r>
+    </w:p>
+    <w:p>
+      <w:r>
+        <w:rPr>
+          <w:rFonts w:ascii="Courier New" w:hAnsi="Courier New"/>
+          <w:sz w:val="18"/>
+        </w:rPr>
+        <w:t xml:space="preserve">  Padding: 8px</w:t>
+      </w:r>
+    </w:p>
+    <w:p>
+      <w:pPr>
+        <w:pStyle w:val="Heading2"/>
+      </w:pPr>
+      <w:r>
+        <w:t>4.2 Tables</w:t>
+      </w:r>
+    </w:p>
+    <w:p/>
+    <w:p>
+      <w:r>
+        <w:rPr>
+          <w:rFonts w:ascii="Courier New" w:hAnsi="Courier New"/>
+          <w:sz w:val="18"/>
+        </w:rPr>
+        <w:t>┌──────────────┬────────────┬───────────┐</w:t>
+      </w:r>
+    </w:p>
+    <w:p>
+      <w:r>
+        <w:rPr>
+          <w:rFonts w:ascii="Courier New" w:hAnsi="Courier New"/>
+          <w:sz w:val="18"/>
+        </w:rPr>
+        <w:t>│  Column A    │  Column B  │  Column C │  Header: #FFFFFF on #1282C6, Arial Bold 11px</w:t>
+      </w:r>
+    </w:p>
+    <w:p>
+      <w:r>
+        <w:rPr>
+          <w:rFonts w:ascii="Courier New" w:hAnsi="Courier New"/>
+          <w:sz w:val="18"/>
+        </w:rPr>
+        <w:t>├──────────────┼────────────┼───────────┤</w:t>
+      </w:r>
+    </w:p>
+    <w:p>
+      <w:r>
+        <w:rPr>
+          <w:rFonts w:ascii="Courier New" w:hAnsi="Courier New"/>
+          <w:sz w:val="18"/>
+        </w:rPr>
+        <w:t>│  Data Row 1  │  value     │  value    │  Row: #000000 on #FFFFFF, Arial 10px</w:t>
+      </w:r>
+    </w:p>
+    <w:p>
+      <w:r>
+        <w:rPr>
+          <w:rFonts w:ascii="Courier New" w:hAnsi="Courier New"/>
+          <w:sz w:val="18"/>
+        </w:rPr>
+        <w:t>│  Data Row 2  │  value     │  value    │  Alt Row: #000000 on #F2F2F2</w:t>
+      </w:r>
+    </w:p>
+    <w:p>
+      <w:r>
+        <w:rPr>
+          <w:rFonts w:ascii="Courier New" w:hAnsi="Courier New"/>
+          <w:sz w:val="18"/>
+        </w:rPr>
+        <w:t>│  Data Row 3  │  value     │  value    │</w:t>
+      </w:r>
+    </w:p>
+    <w:p>
+      <w:r>
+        <w:rPr>
+          <w:rFonts w:ascii="Courier New" w:hAnsi="Courier New"/>
+          <w:sz w:val="18"/>
+        </w:rPr>
+        <w:t>├──────────────┼────────────┼───────────┤</w:t>
+      </w:r>
+    </w:p>
+    <w:p>
+      <w:r>
+        <w:rPr>
+          <w:rFonts w:ascii="Courier New" w:hAnsi="Courier New"/>
+          <w:sz w:val="18"/>
+        </w:rPr>
+        <w:t>│  Total       │  value     │  value    │  Total: #FFFFFF on #1282C6, Arial Bold 11px</w:t>
+      </w:r>
+    </w:p>
+    <w:p>
+      <w:r>
+        <w:rPr>
+          <w:rFonts w:ascii="Courier New" w:hAnsi="Courier New"/>
+          <w:sz w:val="18"/>
+        </w:rPr>
+        <w:t>└──────────────┴────────────┴───────────┘</w:t>
+      </w:r>
+    </w:p>
+    <w:p>
+      <w:r>
+        <w:rPr>
+          <w:rFonts w:ascii="Courier New" w:hAnsi="Courier New"/>
+          <w:sz w:val="18"/>
+        </w:rPr>
+        <w:t xml:space="preserve">  Gridlines: #E6E6E6</w:t>
+      </w:r>
+    </w:p>
+    <w:p>
+      <w:r>
+        <w:rPr>
+          <w:rFonts w:ascii="Courier New" w:hAnsi="Courier New"/>
+          <w:sz w:val="18"/>
+        </w:rPr>
+        <w:t xml:space="preserve">  Outline: #BFBFBF</w:t>
+      </w:r>
+    </w:p>
+    <w:p>
+      <w:r>
+        <w:rPr>
+          <w:rFonts w:ascii="Courier New" w:hAnsi="Courier New"/>
+          <w:sz w:val="18"/>
+        </w:rPr>
+        <w:t xml:space="preserve">  Row Padding: 4px</w:t>
+      </w:r>
+    </w:p>
+    <w:p>
+      <w:pPr>
+        <w:pStyle w:val="Heading2"/>
       </w:pPr>
       <w:r>
         <w:t>4.3 Matrix (Pivot Table)</w:t>
@@ -311,7 +2222,7 @@
           </w:tcPr>
           <w:p>
             <w:r>
-              <w:t>FG</w:t>
+              <w:t>Foreground</w:t>
             </w:r>
           </w:p>
         </w:tc>
@@ -321,7 +2232,7 @@
           </w:tcPr>
           <w:p>
             <w:r>
-              <w:t>BG</w:t>
+              <w:t>Background</w:t>
             </w:r>
           </w:p>
         </w:tc>
@@ -333,7 +2244,7 @@
           </w:tcPr>
           <w:p>
             <w:r>
-              <w:t>Headers</w:t>
+              <w:t>Column Headers</w:t>
             </w:r>
           </w:p>
         </w:tc>
@@ -385,7 +2296,7 @@
           </w:tcPr>
           <w:p>
             <w:r>
-              <w:t>Subtotals</w:t>
+              <w:t>Row Headers</w:t>
             </w:r>
           </w:p>
         </w:tc>
@@ -405,7 +2316,7 @@
           </w:tcPr>
           <w:p>
             <w:r>
-              <w:t>10px</w:t>
+              <w:t>11px</w:t>
             </w:r>
           </w:p>
         </w:tc>
@@ -415,7 +2326,7 @@
           </w:tcPr>
           <w:p>
             <w:r>
-              <w:t>#000000</w:t>
+              <w:t>#FFFFFF</w:t>
             </w:r>
           </w:p>
         </w:tc>
@@ -425,7 +2336,7 @@
           </w:tcPr>
           <w:p>
             <w:r>
-              <w:t>#F2F2F2</w:t>
+              <w:t>#1282C6</w:t>
             </w:r>
           </w:p>
         </w:tc>
@@ -437,6 +2348,110 @@
           </w:tcPr>
           <w:p>
             <w:r>
+              <w:t>Values</w:t>
+            </w:r>
+          </w:p>
+        </w:tc>
+        <w:tc>
+          <w:tcPr>
+            <w:tcW w:type="dxa" w:w="1728"/>
+          </w:tcPr>
+          <w:p>
+            <w:r>
+              <w:t>Arial Regular</w:t>
+            </w:r>
+          </w:p>
+        </w:tc>
+        <w:tc>
+          <w:tcPr>
+            <w:tcW w:type="dxa" w:w="1728"/>
+          </w:tcPr>
+          <w:p>
+            <w:r>
+              <w:t>10px</w:t>
+            </w:r>
+          </w:p>
+        </w:tc>
+        <w:tc>
+          <w:tcPr>
+            <w:tcW w:type="dxa" w:w="1728"/>
+          </w:tcPr>
+          <w:p>
+            <w:r>
+              <w:t>#000000</w:t>
+            </w:r>
+          </w:p>
+        </w:tc>
+        <w:tc>
+          <w:tcPr>
+            <w:tcW w:type="dxa" w:w="1728"/>
+          </w:tcPr>
+          <w:p>
+            <w:r>
+              <w:t>#FFFFFF</w:t>
+            </w:r>
+          </w:p>
+        </w:tc>
+      </w:tr>
+      <w:tr>
+        <w:tc>
+          <w:tcPr>
+            <w:tcW w:type="dxa" w:w="1728"/>
+          </w:tcPr>
+          <w:p>
+            <w:r>
+              <w:t>Subtotals</w:t>
+            </w:r>
+          </w:p>
+        </w:tc>
+        <w:tc>
+          <w:tcPr>
+            <w:tcW w:type="dxa" w:w="1728"/>
+          </w:tcPr>
+          <w:p>
+            <w:r>
+              <w:t>Arial Bold</w:t>
+            </w:r>
+          </w:p>
+        </w:tc>
+        <w:tc>
+          <w:tcPr>
+            <w:tcW w:type="dxa" w:w="1728"/>
+          </w:tcPr>
+          <w:p>
+            <w:r>
+              <w:t>10px</w:t>
+            </w:r>
+          </w:p>
+        </w:tc>
+        <w:tc>
+          <w:tcPr>
+            <w:tcW w:type="dxa" w:w="1728"/>
+          </w:tcPr>
+          <w:p>
+            <w:r>
+              <w:t>#000000</w:t>
+            </w:r>
+          </w:p>
+        </w:tc>
+        <w:tc>
+          <w:tcPr>
+            <w:tcW w:type="dxa" w:w="1728"/>
+          </w:tcPr>
+          <w:p>
+            <w:r>
+              <w:t>#F2F2F2</w:t>
+            </w:r>
+          </w:p>
+        </w:tc>
+      </w:tr>
+      <w:tr>
+        <w:tc>
+          <w:tcPr>
+            <w:tcW w:type="dxa" w:w="1728"/>
+          </w:tcPr>
+          <w:p>
+            <w:r>
               <w:t>Grand Total</w:t>
             </w:r>
           </w:p>
@@ -483,6 +2498,1091 @@
         </w:tc>
       </w:tr>
     </w:tbl>
+    <w:p>
+      <w:pPr>
+        <w:pStyle w:val="Heading2"/>
+      </w:pPr>
+      <w:r>
+        <w:t>4.4 Charts (Bar, Column, Line, Area)</w:t>
+      </w:r>
+    </w:p>
+    <w:tbl>
+      <w:tblPr>
+        <w:tblStyle w:val="TableGrid"/>
+        <w:tblW w:type="auto" w:w="0"/>
+        <w:tblLook w:firstColumn="1" w:firstRow="1" w:lastColumn="0" w:lastRow="0" w:noHBand="0" w:noVBand="1" w:val="04A0"/>
+      </w:tblPr>
+      <w:tblGrid>
+        <w:gridCol w:w="4320"/>
+        <w:gridCol w:w="4320"/>
+      </w:tblGrid>
+      <w:tr>
+        <w:tc>
+          <w:tcPr>
+            <w:tcW w:type="dxa" w:w="4320"/>
+          </w:tcPr>
+          <w:p>
+            <w:r>
+              <w:t>Element</w:t>
+            </w:r>
+          </w:p>
+        </w:tc>
+        <w:tc>
+          <w:tcPr>
+            <w:tcW w:type="dxa" w:w="4320"/>
+          </w:tcPr>
+          <w:p>
+            <w:r>
+              <w:t>Specification</w:t>
+            </w:r>
+          </w:p>
+        </w:tc>
+      </w:tr>
+      <w:tr>
+        <w:tc>
+          <w:tcPr>
+            <w:tcW w:type="dxa" w:w="4320"/>
+          </w:tcPr>
+          <w:p>
+            <w:r>
+              <w:t>Default bar/column fill</w:t>
+            </w:r>
+          </w:p>
+        </w:tc>
+        <w:tc>
+          <w:tcPr>
+            <w:tcW w:type="dxa" w:w="4320"/>
+          </w:tcPr>
+          <w:p>
+            <w:r>
+              <w:t>#C8353D (cycles through dataColors for multi-series)</w:t>
+            </w:r>
+          </w:p>
+        </w:tc>
+      </w:tr>
+      <w:tr>
+        <w:tc>
+          <w:tcPr>
+            <w:tcW w:type="dxa" w:w="4320"/>
+          </w:tcPr>
+          <w:p>
+            <w:r>
+              <w:t>Axis label color</w:t>
+            </w:r>
+          </w:p>
+        </w:tc>
+        <w:tc>
+          <w:tcPr>
+            <w:tcW w:type="dxa" w:w="4320"/>
+          </w:tcPr>
+          <w:p>
+            <w:r>
+              <w:t>#BFBFBF</w:t>
+            </w:r>
+          </w:p>
+        </w:tc>
+      </w:tr>
+      <w:tr>
+        <w:tc>
+          <w:tcPr>
+            <w:tcW w:type="dxa" w:w="4320"/>
+          </w:tcPr>
+          <w:p>
+            <w:r>
+              <w:t>Axis label font</w:t>
+            </w:r>
+          </w:p>
+        </w:tc>
+        <w:tc>
+          <w:tcPr>
+            <w:tcW w:type="dxa" w:w="4320"/>
+          </w:tcPr>
+          <w:p>
+            <w:r>
+              <w:t>Arial Regular 10px</w:t>
+            </w:r>
+          </w:p>
+        </w:tc>
+      </w:tr>
+      <w:tr>
+        <w:tc>
+          <w:tcPr>
+            <w:tcW w:type="dxa" w:w="4320"/>
+          </w:tcPr>
+          <w:p>
+            <w:r>
+              <w:t>Gridline color</w:t>
+            </w:r>
+          </w:p>
+        </w:tc>
+        <w:tc>
+          <w:tcPr>
+            <w:tcW w:type="dxa" w:w="4320"/>
+          </w:tcPr>
+          <w:p>
+            <w:r>
+              <w:t>#E6E6E6</w:t>
+            </w:r>
+          </w:p>
+        </w:tc>
+      </w:tr>
+      <w:tr>
+        <w:tc>
+          <w:tcPr>
+            <w:tcW w:type="dxa" w:w="4320"/>
+          </w:tcPr>
+          <w:p>
+            <w:r>
+              <w:t>Gridlines visible</w:t>
+            </w:r>
+          </w:p>
+        </w:tc>
+        <w:tc>
+          <w:tcPr>
+            <w:tcW w:type="dxa" w:w="4320"/>
+          </w:tcPr>
+          <w:p>
+            <w:r>
+              <w:t>Yes (value axis only)</w:t>
+            </w:r>
+          </w:p>
+        </w:tc>
+      </w:tr>
+      <w:tr>
+        <w:tc>
+          <w:tcPr>
+            <w:tcW w:type="dxa" w:w="4320"/>
+          </w:tcPr>
+          <w:p>
+            <w:r>
+              <w:t>Legend text</w:t>
+            </w:r>
+          </w:p>
+        </w:tc>
+        <w:tc>
+          <w:tcPr>
+            <w:tcW w:type="dxa" w:w="4320"/>
+          </w:tcPr>
+          <w:p>
+            <w:r>
+              <w:t>Arial Regular 10px, #BFBFBF</w:t>
+            </w:r>
+          </w:p>
+        </w:tc>
+      </w:tr>
+      <w:tr>
+        <w:tc>
+          <w:tcPr>
+            <w:tcW w:type="dxa" w:w="4320"/>
+          </w:tcPr>
+          <w:p>
+            <w:r>
+              <w:t>Data label text</w:t>
+            </w:r>
+          </w:p>
+        </w:tc>
+        <w:tc>
+          <w:tcPr>
+            <w:tcW w:type="dxa" w:w="4320"/>
+          </w:tcPr>
+          <w:p>
+            <w:r>
+              <w:t>Arial Regular 10px, #BFBFBF</w:t>
+            </w:r>
+          </w:p>
+        </w:tc>
+      </w:tr>
+      <w:tr>
+        <w:tc>
+          <w:tcPr>
+            <w:tcW w:type="dxa" w:w="4320"/>
+          </w:tcPr>
+          <w:p>
+            <w:r>
+              <w:t>Line stroke width</w:t>
+            </w:r>
+          </w:p>
+        </w:tc>
+        <w:tc>
+          <w:tcPr>
+            <w:tcW w:type="dxa" w:w="4320"/>
+          </w:tcPr>
+          <w:p>
+            <w:r>
+              <w:t>2px</w:t>
+            </w:r>
+          </w:p>
+        </w:tc>
+      </w:tr>
+      <w:tr>
+        <w:tc>
+          <w:tcPr>
+            <w:tcW w:type="dxa" w:w="4320"/>
+          </w:tcPr>
+          <w:p>
+            <w:r>
+              <w:t>Background</w:t>
+            </w:r>
+          </w:p>
+        </w:tc>
+        <w:tc>
+          <w:tcPr>
+            <w:tcW w:type="dxa" w:w="4320"/>
+          </w:tcPr>
+          <w:p>
+            <w:r>
+              <w:t>#FFFFFF</w:t>
+            </w:r>
+          </w:p>
+        </w:tc>
+      </w:tr>
+    </w:tbl>
+    <w:p>
+      <w:pPr>
+        <w:pStyle w:val="Heading2"/>
+      </w:pPr>
+      <w:r>
+        <w:t>4.5 Slicers</w:t>
+      </w:r>
+    </w:p>
+    <w:tbl>
+      <w:tblPr>
+        <w:tblStyle w:val="TableGrid"/>
+        <w:tblW w:type="auto" w:w="0"/>
+        <w:tblLook w:firstColumn="1" w:firstRow="1" w:lastColumn="0" w:lastRow="0" w:noHBand="0" w:noVBand="1" w:val="04A0"/>
+      </w:tblPr>
+      <w:tblGrid>
+        <w:gridCol w:w="4320"/>
+        <w:gridCol w:w="4320"/>
+      </w:tblGrid>
+      <w:tr>
+        <w:tc>
+          <w:tcPr>
+            <w:tcW w:type="dxa" w:w="4320"/>
+          </w:tcPr>
+          <w:p>
+            <w:r>
+              <w:t>Element</w:t>
+            </w:r>
+          </w:p>
+        </w:tc>
+        <w:tc>
+          <w:tcPr>
+            <w:tcW w:type="dxa" w:w="4320"/>
+          </w:tcPr>
+          <w:p>
+            <w:r>
+              <w:t>Specification</w:t>
+            </w:r>
+          </w:p>
+        </w:tc>
+      </w:tr>
+      <w:tr>
+        <w:tc>
+          <w:tcPr>
+            <w:tcW w:type="dxa" w:w="4320"/>
+          </w:tcPr>
+          <w:p>
+            <w:r>
+              <w:t>Header text</w:t>
+            </w:r>
+          </w:p>
+        </w:tc>
+        <w:tc>
+          <w:tcPr>
+            <w:tcW w:type="dxa" w:w="4320"/>
+          </w:tcPr>
+          <w:p>
+            <w:r>
+              <w:t>Arial Bold 11px, #1282C6</w:t>
+            </w:r>
+          </w:p>
+        </w:tc>
+      </w:tr>
+      <w:tr>
+        <w:tc>
+          <w:tcPr>
+            <w:tcW w:type="dxa" w:w="4320"/>
+          </w:tcPr>
+          <w:p>
+            <w:r>
+              <w:t>Header outline</w:t>
+            </w:r>
+          </w:p>
+        </w:tc>
+        <w:tc>
+          <w:tcPr>
+            <w:tcW w:type="dxa" w:w="4320"/>
+          </w:tcPr>
+          <w:p>
+            <w:r>
+              <w:t>Bottom only</w:t>
+            </w:r>
+          </w:p>
+        </w:tc>
+      </w:tr>
+      <w:tr>
+        <w:tc>
+          <w:tcPr>
+            <w:tcW w:type="dxa" w:w="4320"/>
+          </w:tcPr>
+          <w:p>
+            <w:r>
+              <w:t>Item text</w:t>
+            </w:r>
+          </w:p>
+        </w:tc>
+        <w:tc>
+          <w:tcPr>
+            <w:tcW w:type="dxa" w:w="4320"/>
+          </w:tcPr>
+          <w:p>
+            <w:r>
+              <w:t>Arial Regular 11px, #000000</w:t>
+            </w:r>
+          </w:p>
+        </w:tc>
+      </w:tr>
+      <w:tr>
+        <w:tc>
+          <w:tcPr>
+            <w:tcW w:type="dxa" w:w="4320"/>
+          </w:tcPr>
+          <w:p>
+            <w:r>
+              <w:t>Outline color</w:t>
+            </w:r>
+          </w:p>
+        </w:tc>
+        <w:tc>
+          <w:tcPr>
+            <w:tcW w:type="dxa" w:w="4320"/>
+          </w:tcPr>
+          <w:p>
+            <w:r>
+              <w:t>#1282C6, weight 1px</w:t>
+            </w:r>
+          </w:p>
+        </w:tc>
+      </w:tr>
+      <w:tr>
+        <w:tc>
+          <w:tcPr>
+            <w:tcW w:type="dxa" w:w="4320"/>
+          </w:tcPr>
+          <w:p>
+            <w:r>
+              <w:t>Background</w:t>
+            </w:r>
+          </w:p>
+        </w:tc>
+        <w:tc>
+          <w:tcPr>
+            <w:tcW w:type="dxa" w:w="4320"/>
+          </w:tcPr>
+          <w:p>
+            <w:r>
+              <w:t>#FFFFFF</w:t>
+            </w:r>
+          </w:p>
+        </w:tc>
+      </w:tr>
+    </w:tbl>
+    <w:p>
+      <w:pPr>
+        <w:pStyle w:val="Heading2"/>
+      </w:pPr>
+      <w:r>
+        <w:t>4.6 Gauge</w:t>
+      </w:r>
+    </w:p>
+    <w:tbl>
+      <w:tblPr>
+        <w:tblStyle w:val="TableGrid"/>
+        <w:tblW w:type="auto" w:w="0"/>
+        <w:tblLook w:firstColumn="1" w:firstRow="1" w:lastColumn="0" w:lastRow="0" w:noHBand="0" w:noVBand="1" w:val="04A0"/>
+      </w:tblPr>
+      <w:tblGrid>
+        <w:gridCol w:w="4320"/>
+        <w:gridCol w:w="4320"/>
+      </w:tblGrid>
+      <w:tr>
+        <w:tc>
+          <w:tcPr>
+            <w:tcW w:type="dxa" w:w="4320"/>
+          </w:tcPr>
+          <w:p>
+            <w:r>
+              <w:t>Element</w:t>
+            </w:r>
+          </w:p>
+        </w:tc>
+        <w:tc>
+          <w:tcPr>
+            <w:tcW w:type="dxa" w:w="4320"/>
+          </w:tcPr>
+          <w:p>
+            <w:r>
+              <w:t>Specification</w:t>
+            </w:r>
+          </w:p>
+        </w:tc>
+      </w:tr>
+      <w:tr>
+        <w:tc>
+          <w:tcPr>
+            <w:tcW w:type="dxa" w:w="4320"/>
+          </w:tcPr>
+          <w:p>
+            <w:r>
+              <w:t>Fill arc</w:t>
+            </w:r>
+          </w:p>
+        </w:tc>
+        <w:tc>
+          <w:tcPr>
+            <w:tcW w:type="dxa" w:w="4320"/>
+          </w:tcPr>
+          <w:p>
+            <w:r>
+              <w:t>#C8353D</w:t>
+            </w:r>
+          </w:p>
+        </w:tc>
+      </w:tr>
+      <w:tr>
+        <w:tc>
+          <w:tcPr>
+            <w:tcW w:type="dxa" w:w="4320"/>
+          </w:tcPr>
+          <w:p>
+            <w:r>
+              <w:t>Target marker</w:t>
+            </w:r>
+          </w:p>
+        </w:tc>
+        <w:tc>
+          <w:tcPr>
+            <w:tcW w:type="dxa" w:w="4320"/>
+          </w:tcPr>
+          <w:p>
+            <w:r>
+              <w:t>#BFBFBF</w:t>
+            </w:r>
+          </w:p>
+        </w:tc>
+      </w:tr>
+      <w:tr>
+        <w:tc>
+          <w:tcPr>
+            <w:tcW w:type="dxa" w:w="4320"/>
+          </w:tcPr>
+          <w:p>
+            <w:r>
+              <w:t>Callout value</w:t>
+            </w:r>
+          </w:p>
+        </w:tc>
+        <w:tc>
+          <w:tcPr>
+            <w:tcW w:type="dxa" w:w="4320"/>
+          </w:tcPr>
+          <w:p>
+            <w:r>
+              <w:t>Arial Bold 20px, #000000</w:t>
+            </w:r>
+          </w:p>
+        </w:tc>
+      </w:tr>
+    </w:tbl>
+    <w:p>
+      <w:pPr>
+        <w:pStyle w:val="Heading2"/>
+      </w:pPr>
+      <w:r>
+        <w:t>4.7 Navigation &amp; Buttons</w:t>
+      </w:r>
+    </w:p>
+    <w:tbl>
+      <w:tblPr>
+        <w:tblStyle w:val="TableGrid"/>
+        <w:tblW w:type="auto" w:w="0"/>
+        <w:tblLook w:firstColumn="1" w:firstRow="1" w:lastColumn="0" w:lastRow="0" w:noHBand="0" w:noVBand="1" w:val="04A0"/>
+      </w:tblPr>
+      <w:tblGrid>
+        <w:gridCol w:w="2160"/>
+        <w:gridCol w:w="2160"/>
+        <w:gridCol w:w="2160"/>
+        <w:gridCol w:w="2160"/>
+      </w:tblGrid>
+      <w:tr>
+        <w:tc>
+          <w:tcPr>
+            <w:tcW w:type="dxa" w:w="2160"/>
+          </w:tcPr>
+          <w:p>
+            <w:r>
+              <w:t>State</w:t>
+            </w:r>
+          </w:p>
+        </w:tc>
+        <w:tc>
+          <w:tcPr>
+            <w:tcW w:type="dxa" w:w="2160"/>
+          </w:tcPr>
+          <w:p>
+            <w:r>
+              <w:t>Background</w:t>
+            </w:r>
+          </w:p>
+        </w:tc>
+        <w:tc>
+          <w:tcPr>
+            <w:tcW w:type="dxa" w:w="2160"/>
+          </w:tcPr>
+          <w:p>
+            <w:r>
+              <w:t>Text</w:t>
+            </w:r>
+          </w:p>
+        </w:tc>
+        <w:tc>
+          <w:tcPr>
+            <w:tcW w:type="dxa" w:w="2160"/>
+          </w:tcPr>
+          <w:p>
+            <w:r>
+              <w:t>Border</w:t>
+            </w:r>
+          </w:p>
+        </w:tc>
+      </w:tr>
+      <w:tr>
+        <w:tc>
+          <w:tcPr>
+            <w:tcW w:type="dxa" w:w="2160"/>
+          </w:tcPr>
+          <w:p>
+            <w:r>
+              <w:t>Primary</w:t>
+            </w:r>
+          </w:p>
+        </w:tc>
+        <w:tc>
+          <w:tcPr>
+            <w:tcW w:type="dxa" w:w="2160"/>
+          </w:tcPr>
+          <w:p>
+            <w:r>
+              <w:t>#C8353D</w:t>
+            </w:r>
+          </w:p>
+        </w:tc>
+        <w:tc>
+          <w:tcPr>
+            <w:tcW w:type="dxa" w:w="2160"/>
+          </w:tcPr>
+          <w:p>
+            <w:r>
+              <w:t>#FFFFFF</w:t>
+            </w:r>
+          </w:p>
+        </w:tc>
+        <w:tc>
+          <w:tcPr>
+            <w:tcW w:type="dxa" w:w="2160"/>
+          </w:tcPr>
+          <w:p>
+            <w:r>
+              <w:t>none</w:t>
+            </w:r>
+          </w:p>
+        </w:tc>
+      </w:tr>
+      <w:tr>
+        <w:tc>
+          <w:tcPr>
+            <w:tcW w:type="dxa" w:w="2160"/>
+          </w:tcPr>
+          <w:p>
+            <w:r>
+              <w:t>Primary Hover</w:t>
+            </w:r>
+          </w:p>
+        </w:tc>
+        <w:tc>
+          <w:tcPr>
+            <w:tcW w:type="dxa" w:w="2160"/>
+          </w:tcPr>
+          <w:p>
+            <w:r>
+              <w:t>#b01e24</w:t>
+            </w:r>
+          </w:p>
+        </w:tc>
+        <w:tc>
+          <w:tcPr>
+            <w:tcW w:type="dxa" w:w="2160"/>
+          </w:tcPr>
+          <w:p>
+            <w:r>
+              <w:t>#FFFFFF</w:t>
+            </w:r>
+          </w:p>
+        </w:tc>
+        <w:tc>
+          <w:tcPr>
+            <w:tcW w:type="dxa" w:w="2160"/>
+          </w:tcPr>
+          <w:p>
+            <w:r>
+              <w:t>none</w:t>
+            </w:r>
+          </w:p>
+        </w:tc>
+      </w:tr>
+      <w:tr>
+        <w:tc>
+          <w:tcPr>
+            <w:tcW w:type="dxa" w:w="2160"/>
+          </w:tcPr>
+          <w:p>
+            <w:r>
+              <w:t>Secondary</w:t>
+            </w:r>
+          </w:p>
+        </w:tc>
+        <w:tc>
+          <w:tcPr>
+            <w:tcW w:type="dxa" w:w="2160"/>
+          </w:tcPr>
+          <w:p>
+            <w:r>
+              <w:t>#FFFFFF</w:t>
+            </w:r>
+          </w:p>
+        </w:tc>
+        <w:tc>
+          <w:tcPr>
+            <w:tcW w:type="dxa" w:w="2160"/>
+          </w:tcPr>
+          <w:p>
+            <w:r>
+              <w:t>#C8353D</w:t>
+            </w:r>
+          </w:p>
+        </w:tc>
+        <w:tc>
+          <w:tcPr>
+            <w:tcW w:type="dxa" w:w="2160"/>
+          </w:tcPr>
+          <w:p>
+            <w:r>
+              <w:t>1px #C8353D</w:t>
+            </w:r>
+          </w:p>
+        </w:tc>
+      </w:tr>
+      <w:tr>
+        <w:tc>
+          <w:tcPr>
+            <w:tcW w:type="dxa" w:w="2160"/>
+          </w:tcPr>
+          <w:p>
+            <w:r>
+              <w:t>Secondary Hover</w:t>
+            </w:r>
+          </w:p>
+        </w:tc>
+        <w:tc>
+          <w:tcPr>
+            <w:tcW w:type="dxa" w:w="2160"/>
+          </w:tcPr>
+          <w:p>
+            <w:r>
+              <w:t>#F2F2F2</w:t>
+            </w:r>
+          </w:p>
+        </w:tc>
+        <w:tc>
+          <w:tcPr>
+            <w:tcW w:type="dxa" w:w="2160"/>
+          </w:tcPr>
+          <w:p>
+            <w:r>
+              <w:t>#C8353D</w:t>
+            </w:r>
+          </w:p>
+        </w:tc>
+        <w:tc>
+          <w:tcPr>
+            <w:tcW w:type="dxa" w:w="2160"/>
+          </w:tcPr>
+          <w:p>
+            <w:r>
+              <w:t>1px #C8353D</w:t>
+            </w:r>
+          </w:p>
+        </w:tc>
+      </w:tr>
+      <w:tr>
+        <w:tc>
+          <w:tcPr>
+            <w:tcW w:type="dxa" w:w="2160"/>
+          </w:tcPr>
+          <w:p>
+            <w:r>
+              <w:t>Disabled</w:t>
+            </w:r>
+          </w:p>
+        </w:tc>
+        <w:tc>
+          <w:tcPr>
+            <w:tcW w:type="dxa" w:w="2160"/>
+          </w:tcPr>
+          <w:p>
+            <w:r>
+              <w:t>#E6E6E6</w:t>
+            </w:r>
+          </w:p>
+        </w:tc>
+        <w:tc>
+          <w:tcPr>
+            <w:tcW w:type="dxa" w:w="2160"/>
+          </w:tcPr>
+          <w:p>
+            <w:r>
+              <w:t>#BFBFBF</w:t>
+            </w:r>
+          </w:p>
+        </w:tc>
+        <w:tc>
+          <w:tcPr>
+            <w:tcW w:type="dxa" w:w="2160"/>
+          </w:tcPr>
+          <w:p>
+            <w:r>
+              <w:t>none</w:t>
+            </w:r>
+          </w:p>
+        </w:tc>
+      </w:tr>
+    </w:tbl>
+    <w:p>
+      <w:pPr>
+        <w:pStyle w:val="Heading1"/>
+      </w:pPr>
+      <w:r>
+        <w:t>5. Spacing &amp; Layout</w:t>
+      </w:r>
+    </w:p>
+    <w:tbl>
+      <w:tblPr>
+        <w:tblStyle w:val="TableGrid"/>
+        <w:tblW w:type="auto" w:w="0"/>
+        <w:tblLook w:firstColumn="1" w:firstRow="1" w:lastColumn="0" w:lastRow="0" w:noHBand="0" w:noVBand="1" w:val="04A0"/>
+      </w:tblPr>
+      <w:tblGrid>
+        <w:gridCol w:w="2880"/>
+        <w:gridCol w:w="2880"/>
+        <w:gridCol w:w="2880"/>
+      </w:tblGrid>
+      <w:tr>
+        <w:tc>
+          <w:tcPr>
+            <w:tcW w:type="dxa" w:w="2880"/>
+          </w:tcPr>
+          <w:p>
+            <w:r>
+              <w:t>Token</w:t>
+            </w:r>
+          </w:p>
+        </w:tc>
+        <w:tc>
+          <w:tcPr>
+            <w:tcW w:type="dxa" w:w="2880"/>
+          </w:tcPr>
+          <w:p>
+            <w:r>
+              <w:t>Value</w:t>
+            </w:r>
+          </w:p>
+        </w:tc>
+        <w:tc>
+          <w:tcPr>
+            <w:tcW w:type="dxa" w:w="2880"/>
+          </w:tcPr>
+          <w:p>
+            <w:r>
+              <w:t>Usage</w:t>
+            </w:r>
+          </w:p>
+        </w:tc>
+      </w:tr>
+      <w:tr>
+        <w:tc>
+          <w:tcPr>
+            <w:tcW w:type="dxa" w:w="2880"/>
+          </w:tcPr>
+          <w:p>
+            <w:r>
+              <w:t>padding-card</w:t>
+            </w:r>
+          </w:p>
+        </w:tc>
+        <w:tc>
+          <w:tcPr>
+            <w:tcW w:type="dxa" w:w="2880"/>
+          </w:tcPr>
+          <w:p>
+            <w:r>
+              <w:t>8px</w:t>
+            </w:r>
+          </w:p>
+        </w:tc>
+        <w:tc>
+          <w:tcPr>
+            <w:tcW w:type="dxa" w:w="2880"/>
+          </w:tcPr>
+          <w:p>
+            <w:r>
+              <w:t>Inner padding for card visuals</w:t>
+            </w:r>
+          </w:p>
+        </w:tc>
+      </w:tr>
+      <w:tr>
+        <w:tc>
+          <w:tcPr>
+            <w:tcW w:type="dxa" w:w="2880"/>
+          </w:tcPr>
+          <w:p>
+            <w:r>
+              <w:t>padding-page</w:t>
+            </w:r>
+          </w:p>
+        </w:tc>
+        <w:tc>
+          <w:tcPr>
+            <w:tcW w:type="dxa" w:w="2880"/>
+          </w:tcPr>
+          <w:p>
+            <w:r>
+              <w:t>16px</w:t>
+            </w:r>
+          </w:p>
+        </w:tc>
+        <w:tc>
+          <w:tcPr>
+            <w:tcW w:type="dxa" w:w="2880"/>
+          </w:tcPr>
+          <w:p>
+            <w:r>
+              <w:t>Page margin</w:t>
+            </w:r>
+          </w:p>
+        </w:tc>
+      </w:tr>
+      <w:tr>
+        <w:tc>
+          <w:tcPr>
+            <w:tcW w:type="dxa" w:w="2880"/>
+          </w:tcPr>
+          <w:p>
+            <w:r>
+              <w:t>gap-visual</w:t>
+            </w:r>
+          </w:p>
+        </w:tc>
+        <w:tc>
+          <w:tcPr>
+            <w:tcW w:type="dxa" w:w="2880"/>
+          </w:tcPr>
+          <w:p>
+            <w:r>
+              <w:t>8px</w:t>
+            </w:r>
+          </w:p>
+        </w:tc>
+        <w:tc>
+          <w:tcPr>
+            <w:tcW w:type="dxa" w:w="2880"/>
+          </w:tcPr>
+          <w:p>
+            <w:r>
+              <w:t>Space between visuals</w:t>
+            </w:r>
+          </w:p>
+        </w:tc>
+      </w:tr>
+      <w:tr>
+        <w:tc>
+          <w:tcPr>
+            <w:tcW w:type="dxa" w:w="2880"/>
+          </w:tcPr>
+          <w:p>
+            <w:r>
+              <w:t>border-radius</w:t>
+            </w:r>
+          </w:p>
+        </w:tc>
+        <w:tc>
+          <w:tcPr>
+            <w:tcW w:type="dxa" w:w="2880"/>
+          </w:tcPr>
+          <w:p>
+            <w:r>
+              <w:t>2–4px</w:t>
+            </w:r>
+          </w:p>
+        </w:tc>
+        <w:tc>
+          <w:tcPr>
+            <w:tcW w:type="dxa" w:w="2880"/>
+          </w:tcPr>
+          <w:p>
+            <w:r>
+              <w:t>Card corners</w:t>
+            </w:r>
+          </w:p>
+        </w:tc>
+      </w:tr>
+      <w:tr>
+        <w:tc>
+          <w:tcPr>
+            <w:tcW w:type="dxa" w:w="2880"/>
+          </w:tcPr>
+          <w:p>
+            <w:r>
+              <w:t>border-weight</w:t>
+            </w:r>
+          </w:p>
+        </w:tc>
+        <w:tc>
+          <w:tcPr>
+            <w:tcW w:type="dxa" w:w="2880"/>
+          </w:tcPr>
+          <w:p>
+            <w:r>
+              <w:t>none</w:t>
+            </w:r>
+          </w:p>
+        </w:tc>
+        <w:tc>
+          <w:tcPr>
+            <w:tcW w:type="dxa" w:w="2880"/>
+          </w:tcPr>
+          <w:p>
+            <w:r>
+              <w:t>Borders disabled globally</w:t>
+            </w:r>
+          </w:p>
+        </w:tc>
+      </w:tr>
+      <w:tr>
+        <w:tc>
+          <w:tcPr>
+            <w:tcW w:type="dxa" w:w="2880"/>
+          </w:tcPr>
+          <w:p>
+            <w:r>
+              <w:t>shadow</w:t>
+            </w:r>
+          </w:p>
+        </w:tc>
+        <w:tc>
+          <w:tcPr>
+            <w:tcW w:type="dxa" w:w="2880"/>
+          </w:tcPr>
+          <w:p>
+            <w:r>
+              <w:t>0 1px 3px #E6E6E6</w:t>
+            </w:r>
+          </w:p>
+        </w:tc>
+        <w:tc>
+          <w:tcPr>
+            <w:tcW w:type="dxa" w:w="2880"/>
+          </w:tcPr>
+          <w:p>
+            <w:r>
+              <w:t>Card drop shadows</w:t>
+            </w:r>
+          </w:p>
+        </w:tc>
+      </w:tr>
+    </w:tbl>
+    <w:p>
+      <w:pPr>
+        <w:pStyle w:val="Heading1"/>
+      </w:pPr>
+      <w:r>
+        <w:t>6. Accessibility Notes</w:t>
+      </w:r>
+    </w:p>
+    <w:p>
+      <w:pPr>
+        <w:pStyle w:val="ListBullet"/>
+      </w:pPr>
+      <w:r>
+        <w:t>All body text must be Black (#000000) on white backgrounds for maximum contrast</w:t>
+      </w:r>
+    </w:p>
+    <w:p>
+      <w:pPr>
+        <w:pStyle w:val="ListBullet"/>
+      </w:pPr>
+      <w:r>
+        <w:t>White text on Red (#C8353D) and Blue (#1282C6) backgrounds meets WCAG AA contrast (4.5:1+)</w:t>
+      </w:r>
+    </w:p>
+    <w:p>
+      <w:pPr>
+        <w:pStyle w:val="ListBullet"/>
+      </w:pPr>
+      <w:r>
+        <w:t>Lime Green (#79BE2E) should only be used for filled shapes, not for text on white (fails contrast)</w:t>
+      </w:r>
+    </w:p>
+    <w:p>
+      <w:pPr>
+        <w:pStyle w:val="ListBullet"/>
+      </w:pPr>
+      <w:r>
+        <w:t>Avoid using color alone to convey meaning - always pair with labels or icons</w:t>
+      </w:r>
+    </w:p>
+    <w:p>
+      <w:pPr>
+        <w:pStyle w:val="ListBullet"/>
+      </w:pPr>
+      <w:r>
+        <w:t>Minimum font size: 10px for any readable text</w:t>
+      </w:r>
+    </w:p>
+    <w:p>
+      <w:pPr>
+        <w:pStyle w:val="Heading1"/>
+      </w:pPr>
+      <w:r>
+        <w:t>7. Power BI Theme File</w:t>
+      </w:r>
+    </w:p>
+    <w:p>
+      <w:r>
+        <w:t>The companion Power BI theme JSON implementing this spec is available at:</w:t>
+      </w:r>
+    </w:p>
+    <w:p>
+      <w:r>
+        <w:t>[CS_Wholesale_Theme.json](file:///C:/GIT/FUAM/themes/CS_Wholesale_Theme.json)</w:t>
+      </w:r>
+    </w:p>
+    <w:p>
+      <w:r>
+        <w:t>To apply: Power BI Desktop → View → Themes → Browse for themes → select CS_Wholesale_Theme.json</w:t>
+      </w:r>
+    </w:p>
     <w:p>
       <w:pPr>
         <w:pStyle w:val="Heading1"/>
@@ -520,7 +3620,7 @@
           </w:tcPr>
           <w:p>
             <w:r>
-              <w:t>Role</w:t>
+              <w:t>Role / Element</w:t>
             </w:r>
           </w:p>
         </w:tc>
@@ -562,7 +3662,7 @@
           </w:tcPr>
           <w:p>
             <w:r>
-              <w:t>Red</w:t>
+              <w:t>Red (Primary)</w:t>
             </w:r>
           </w:p>
         </w:tc>
@@ -627,9 +3727,7 @@
             <w:tcW w:type="dxa" w:w="2160"/>
           </w:tcPr>
           <w:p>
-            <w:r>
-              <w:t>Semantic</w:t>
-            </w:r>
+            <w:r/>
           </w:p>
         </w:tc>
         <w:tc>
@@ -638,7 +3736,418 @@
           </w:tcPr>
           <w:p>
             <w:r>
-              <w:t>Good</w:t>
+              <w:t>Black</w:t>
+            </w:r>
+          </w:p>
+        </w:tc>
+        <w:tc>
+          <w:tcPr>
+            <w:tcW w:type="dxa" w:w="2160"/>
+          </w:tcPr>
+          <w:p>
+            <w:r>
+              <w:t>#000000</w:t>
+            </w:r>
+          </w:p>
+        </w:tc>
+        <w:tc>
+          <w:tcPr>
+            <w:tcW w:type="dxa" w:w="2160"/>
+            <w:shd w:fill="000000"/>
+          </w:tcPr>
+          <w:p/>
+        </w:tc>
+      </w:tr>
+      <w:tr>
+        <w:tc>
+          <w:tcPr>
+            <w:tcW w:type="dxa" w:w="2160"/>
+          </w:tcPr>
+          <w:p>
+            <w:r/>
+          </w:p>
+        </w:tc>
+        <w:tc>
+          <w:tcPr>
+            <w:tcW w:type="dxa" w:w="2160"/>
+          </w:tcPr>
+          <w:p>
+            <w:r>
+              <w:t>White</w:t>
+            </w:r>
+          </w:p>
+        </w:tc>
+        <w:tc>
+          <w:tcPr>
+            <w:tcW w:type="dxa" w:w="2160"/>
+          </w:tcPr>
+          <w:p>
+            <w:r>
+              <w:t>#FFFFFF</w:t>
+            </w:r>
+          </w:p>
+        </w:tc>
+        <w:tc>
+          <w:tcPr>
+            <w:tcW w:type="dxa" w:w="2160"/>
+            <w:shd w:fill="FFFFFF"/>
+          </w:tcPr>
+          <w:p/>
+        </w:tc>
+      </w:tr>
+      <w:tr>
+        <w:tc>
+          <w:tcPr>
+            <w:tcW w:type="dxa" w:w="2160"/>
+          </w:tcPr>
+          <w:p>
+            <w:r>
+              <w:t>Surfaces</w:t>
+            </w:r>
+          </w:p>
+        </w:tc>
+        <w:tc>
+          <w:tcPr>
+            <w:tcW w:type="dxa" w:w="2160"/>
+          </w:tcPr>
+          <w:p>
+            <w:r>
+              <w:t>Page BG</w:t>
+            </w:r>
+          </w:p>
+        </w:tc>
+        <w:tc>
+          <w:tcPr>
+            <w:tcW w:type="dxa" w:w="2160"/>
+          </w:tcPr>
+          <w:p>
+            <w:r>
+              <w:t>#F2F2F2</w:t>
+            </w:r>
+          </w:p>
+        </w:tc>
+        <w:tc>
+          <w:tcPr>
+            <w:tcW w:type="dxa" w:w="2160"/>
+            <w:shd w:fill="F2F2F2"/>
+          </w:tcPr>
+          <w:p/>
+        </w:tc>
+      </w:tr>
+      <w:tr>
+        <w:tc>
+          <w:tcPr>
+            <w:tcW w:type="dxa" w:w="2160"/>
+          </w:tcPr>
+          <w:p>
+            <w:r/>
+          </w:p>
+        </w:tc>
+        <w:tc>
+          <w:tcPr>
+            <w:tcW w:type="dxa" w:w="2160"/>
+          </w:tcPr>
+          <w:p>
+            <w:r>
+              <w:t>Borders</w:t>
+            </w:r>
+          </w:p>
+        </w:tc>
+        <w:tc>
+          <w:tcPr>
+            <w:tcW w:type="dxa" w:w="2160"/>
+          </w:tcPr>
+          <w:p>
+            <w:r>
+              <w:t>#E6E6E6</w:t>
+            </w:r>
+          </w:p>
+        </w:tc>
+        <w:tc>
+          <w:tcPr>
+            <w:tcW w:type="dxa" w:w="2160"/>
+            <w:shd w:fill="E6E6E6"/>
+          </w:tcPr>
+          <w:p/>
+        </w:tc>
+      </w:tr>
+      <w:tr>
+        <w:tc>
+          <w:tcPr>
+            <w:tcW w:type="dxa" w:w="2160"/>
+          </w:tcPr>
+          <w:p>
+            <w:r/>
+          </w:p>
+        </w:tc>
+        <w:tc>
+          <w:tcPr>
+            <w:tcW w:type="dxa" w:w="2160"/>
+          </w:tcPr>
+          <w:p>
+            <w:r>
+              <w:t>Card BG</w:t>
+            </w:r>
+          </w:p>
+        </w:tc>
+        <w:tc>
+          <w:tcPr>
+            <w:tcW w:type="dxa" w:w="2160"/>
+          </w:tcPr>
+          <w:p>
+            <w:r>
+              <w:t>#FFFFFF</w:t>
+            </w:r>
+          </w:p>
+        </w:tc>
+        <w:tc>
+          <w:tcPr>
+            <w:tcW w:type="dxa" w:w="2160"/>
+            <w:shd w:fill="FFFFFF"/>
+          </w:tcPr>
+          <w:p/>
+        </w:tc>
+      </w:tr>
+      <w:tr>
+        <w:tc>
+          <w:tcPr>
+            <w:tcW w:type="dxa" w:w="2160"/>
+          </w:tcPr>
+          <w:p>
+            <w:r>
+              <w:t>Splash Series</w:t>
+            </w:r>
+          </w:p>
+        </w:tc>
+        <w:tc>
+          <w:tcPr>
+            <w:tcW w:type="dxa" w:w="2160"/>
+          </w:tcPr>
+          <w:p>
+            <w:r>
+              <w:t>Series 1</w:t>
+            </w:r>
+          </w:p>
+        </w:tc>
+        <w:tc>
+          <w:tcPr>
+            <w:tcW w:type="dxa" w:w="2160"/>
+          </w:tcPr>
+          <w:p>
+            <w:r>
+              <w:t>#C8353D</w:t>
+            </w:r>
+          </w:p>
+        </w:tc>
+        <w:tc>
+          <w:tcPr>
+            <w:tcW w:type="dxa" w:w="2160"/>
+            <w:shd w:fill="C8353D"/>
+          </w:tcPr>
+          <w:p/>
+        </w:tc>
+      </w:tr>
+      <w:tr>
+        <w:tc>
+          <w:tcPr>
+            <w:tcW w:type="dxa" w:w="2160"/>
+          </w:tcPr>
+          <w:p>
+            <w:r/>
+          </w:p>
+        </w:tc>
+        <w:tc>
+          <w:tcPr>
+            <w:tcW w:type="dxa" w:w="2160"/>
+          </w:tcPr>
+          <w:p>
+            <w:r>
+              <w:t>Series 2</w:t>
+            </w:r>
+          </w:p>
+        </w:tc>
+        <w:tc>
+          <w:tcPr>
+            <w:tcW w:type="dxa" w:w="2160"/>
+          </w:tcPr>
+          <w:p>
+            <w:r>
+              <w:t>#1282C6</w:t>
+            </w:r>
+          </w:p>
+        </w:tc>
+        <w:tc>
+          <w:tcPr>
+            <w:tcW w:type="dxa" w:w="2160"/>
+            <w:shd w:fill="1282C6"/>
+          </w:tcPr>
+          <w:p/>
+        </w:tc>
+      </w:tr>
+      <w:tr>
+        <w:tc>
+          <w:tcPr>
+            <w:tcW w:type="dxa" w:w="2160"/>
+          </w:tcPr>
+          <w:p>
+            <w:r/>
+          </w:p>
+        </w:tc>
+        <w:tc>
+          <w:tcPr>
+            <w:tcW w:type="dxa" w:w="2160"/>
+          </w:tcPr>
+          <w:p>
+            <w:r>
+              <w:t>Series 3</w:t>
+            </w:r>
+          </w:p>
+        </w:tc>
+        <w:tc>
+          <w:tcPr>
+            <w:tcW w:type="dxa" w:w="2160"/>
+          </w:tcPr>
+          <w:p>
+            <w:r>
+              <w:t>#79BE2E</w:t>
+            </w:r>
+          </w:p>
+        </w:tc>
+        <w:tc>
+          <w:tcPr>
+            <w:tcW w:type="dxa" w:w="2160"/>
+            <w:shd w:fill="79BE2E"/>
+          </w:tcPr>
+          <w:p/>
+        </w:tc>
+      </w:tr>
+      <w:tr>
+        <w:tc>
+          <w:tcPr>
+            <w:tcW w:type="dxa" w:w="2160"/>
+          </w:tcPr>
+          <w:p>
+            <w:r/>
+          </w:p>
+        </w:tc>
+        <w:tc>
+          <w:tcPr>
+            <w:tcW w:type="dxa" w:w="2160"/>
+          </w:tcPr>
+          <w:p>
+            <w:r>
+              <w:t>Series 4</w:t>
+            </w:r>
+          </w:p>
+        </w:tc>
+        <w:tc>
+          <w:tcPr>
+            <w:tcW w:type="dxa" w:w="2160"/>
+          </w:tcPr>
+          <w:p>
+            <w:r>
+              <w:t>#9F2C92</w:t>
+            </w:r>
+          </w:p>
+        </w:tc>
+        <w:tc>
+          <w:tcPr>
+            <w:tcW w:type="dxa" w:w="2160"/>
+            <w:shd w:fill="9F2C92"/>
+          </w:tcPr>
+          <w:p/>
+        </w:tc>
+      </w:tr>
+      <w:tr>
+        <w:tc>
+          <w:tcPr>
+            <w:tcW w:type="dxa" w:w="2160"/>
+          </w:tcPr>
+          <w:p>
+            <w:r/>
+          </w:p>
+        </w:tc>
+        <w:tc>
+          <w:tcPr>
+            <w:tcW w:type="dxa" w:w="2160"/>
+          </w:tcPr>
+          <w:p>
+            <w:r>
+              <w:t>Series 5</w:t>
+            </w:r>
+          </w:p>
+        </w:tc>
+        <w:tc>
+          <w:tcPr>
+            <w:tcW w:type="dxa" w:w="2160"/>
+          </w:tcPr>
+          <w:p>
+            <w:r>
+              <w:t>#E7703A</w:t>
+            </w:r>
+          </w:p>
+        </w:tc>
+        <w:tc>
+          <w:tcPr>
+            <w:tcW w:type="dxa" w:w="2160"/>
+            <w:shd w:fill="E7703A"/>
+          </w:tcPr>
+          <w:p/>
+        </w:tc>
+      </w:tr>
+      <w:tr>
+        <w:tc>
+          <w:tcPr>
+            <w:tcW w:type="dxa" w:w="2160"/>
+          </w:tcPr>
+          <w:p>
+            <w:r/>
+          </w:p>
+        </w:tc>
+        <w:tc>
+          <w:tcPr>
+            <w:tcW w:type="dxa" w:w="2160"/>
+          </w:tcPr>
+          <w:p>
+            <w:r>
+              <w:t>Series 6</w:t>
+            </w:r>
+          </w:p>
+        </w:tc>
+        <w:tc>
+          <w:tcPr>
+            <w:tcW w:type="dxa" w:w="2160"/>
+          </w:tcPr>
+          <w:p>
+            <w:r>
+              <w:t>#1E9FD3</w:t>
+            </w:r>
+          </w:p>
+        </w:tc>
+        <w:tc>
+          <w:tcPr>
+            <w:tcW w:type="dxa" w:w="2160"/>
+            <w:shd w:fill="1E9FD3"/>
+          </w:tcPr>
+          <w:p/>
+        </w:tc>
+      </w:tr>
+      <w:tr>
+        <w:tc>
+          <w:tcPr>
+            <w:tcW w:type="dxa" w:w="2160"/>
+          </w:tcPr>
+          <w:p>
+            <w:r/>
+          </w:p>
+        </w:tc>
+        <w:tc>
+          <w:tcPr>
+            <w:tcW w:type="dxa" w:w="2160"/>
+          </w:tcPr>
+          <w:p>
+            <w:r>
+              <w:t>Series 7</w:t>
             </w:r>
           </w:p>
         </w:tc>
@@ -675,7 +4184,157 @@
           </w:tcPr>
           <w:p>
             <w:r>
-              <w:t>Bad</w:t>
+              <w:t>Series 8</w:t>
+            </w:r>
+          </w:p>
+        </w:tc>
+        <w:tc>
+          <w:tcPr>
+            <w:tcW w:type="dxa" w:w="2160"/>
+          </w:tcPr>
+          <w:p>
+            <w:r>
+              <w:t>#BFBFBF</w:t>
+            </w:r>
+          </w:p>
+        </w:tc>
+        <w:tc>
+          <w:tcPr>
+            <w:tcW w:type="dxa" w:w="2160"/>
+            <w:shd w:fill="BFBFBF"/>
+          </w:tcPr>
+          <w:p/>
+        </w:tc>
+      </w:tr>
+      <w:tr>
+        <w:tc>
+          <w:tcPr>
+            <w:tcW w:type="dxa" w:w="2160"/>
+          </w:tcPr>
+          <w:p>
+            <w:r>
+              <w:t>Semantic</w:t>
+            </w:r>
+          </w:p>
+        </w:tc>
+        <w:tc>
+          <w:tcPr>
+            <w:tcW w:type="dxa" w:w="2160"/>
+          </w:tcPr>
+          <w:p>
+            <w:r>
+              <w:t>Good / Increase</w:t>
+            </w:r>
+          </w:p>
+        </w:tc>
+        <w:tc>
+          <w:tcPr>
+            <w:tcW w:type="dxa" w:w="2160"/>
+          </w:tcPr>
+          <w:p>
+            <w:r>
+              <w:t>#1C6B27</w:t>
+            </w:r>
+          </w:p>
+        </w:tc>
+        <w:tc>
+          <w:tcPr>
+            <w:tcW w:type="dxa" w:w="2160"/>
+            <w:shd w:fill="1C6B27"/>
+          </w:tcPr>
+          <w:p/>
+        </w:tc>
+      </w:tr>
+      <w:tr>
+        <w:tc>
+          <w:tcPr>
+            <w:tcW w:type="dxa" w:w="2160"/>
+          </w:tcPr>
+          <w:p>
+            <w:r/>
+          </w:p>
+        </w:tc>
+        <w:tc>
+          <w:tcPr>
+            <w:tcW w:type="dxa" w:w="2160"/>
+          </w:tcPr>
+          <w:p>
+            <w:r>
+              <w:t>Neutral</w:t>
+            </w:r>
+          </w:p>
+        </w:tc>
+        <w:tc>
+          <w:tcPr>
+            <w:tcW w:type="dxa" w:w="2160"/>
+          </w:tcPr>
+          <w:p>
+            <w:r>
+              <w:t>#BFBFBF</w:t>
+            </w:r>
+          </w:p>
+        </w:tc>
+        <w:tc>
+          <w:tcPr>
+            <w:tcW w:type="dxa" w:w="2160"/>
+            <w:shd w:fill="BFBFBF"/>
+          </w:tcPr>
+          <w:p/>
+        </w:tc>
+      </w:tr>
+      <w:tr>
+        <w:tc>
+          <w:tcPr>
+            <w:tcW w:type="dxa" w:w="2160"/>
+          </w:tcPr>
+          <w:p>
+            <w:r/>
+          </w:p>
+        </w:tc>
+        <w:tc>
+          <w:tcPr>
+            <w:tcW w:type="dxa" w:w="2160"/>
+          </w:tcPr>
+          <w:p>
+            <w:r>
+              <w:t>Total</w:t>
+            </w:r>
+          </w:p>
+        </w:tc>
+        <w:tc>
+          <w:tcPr>
+            <w:tcW w:type="dxa" w:w="2160"/>
+          </w:tcPr>
+          <w:p>
+            <w:r>
+              <w:t>#1282C6</w:t>
+            </w:r>
+          </w:p>
+        </w:tc>
+        <w:tc>
+          <w:tcPr>
+            <w:tcW w:type="dxa" w:w="2160"/>
+            <w:shd w:fill="1282C6"/>
+          </w:tcPr>
+          <w:p/>
+        </w:tc>
+      </w:tr>
+      <w:tr>
+        <w:tc>
+          <w:tcPr>
+            <w:tcW w:type="dxa" w:w="2160"/>
+          </w:tcPr>
+          <w:p>
+            <w:r/>
+          </w:p>
+        </w:tc>
+        <w:tc>
+          <w:tcPr>
+            <w:tcW w:type="dxa" w:w="2160"/>
+          </w:tcPr>
+          <w:p>
+            <w:r>
+              <w:t>Bad / Decrease</w:t>
             </w:r>
           </w:p>
         </w:tc>
@@ -707,11 +4366,17 @@
       </w:r>
     </w:p>
     <w:p>
+      <w:pPr>
+        <w:pStyle w:val="ListBullet"/>
+      </w:pPr>
       <w:r>
-        <w:t>v1.1 (March 20, 2026): Expanded semantic colors and formatting guidelines.</w:t>
+        <w:t>v1.1 (March 20, 2026): Expanded semantic colors and conditional formatting guidelines; corrected Good/Neutral indicators.</w:t>
       </w:r>
     </w:p>
     <w:p>
+      <w:pPr>
+        <w:pStyle w:val="ListBullet"/>
+      </w:pPr>
       <w:r>
         <w:t>v1.0 (March 19, 2026): Initial UI design specification.</w:t>
       </w:r>

</xml_diff>

<commit_message>
docs: Add UI specification documents for CS Wholesale and SpartanNash themes.
</commit_message>
<xml_diff>
--- a/themes/CS_Wholesale_UI_Spec.docx
+++ b/themes/CS_Wholesale_UI_Spec.docx
@@ -2838,7 +2838,7 @@
           </w:tcPr>
           <w:p>
             <w:r>
-              <w:t>Arial Regular 11px, #000000</w:t>
+              <w:t>Arial Regular 10px, #000000</w:t>
             </w:r>
           </w:p>
         </w:tc>
@@ -3263,6 +3263,91 @@
           <w:p>
             <w:r>
               <w:t>none</w:t>
+            </w:r>
+          </w:p>
+        </w:tc>
+      </w:tr>
+    </w:tbl>
+    <w:p>
+      <w:pPr>
+        <w:pStyle w:val="Heading2"/>
+      </w:pPr>
+      <w:r>
+        <w:t>4.8 Text Boxes</w:t>
+      </w:r>
+    </w:p>
+    <w:tbl>
+      <w:tblPr>
+        <w:tblStyle w:val="TableGrid"/>
+        <w:tblW w:type="auto" w:w="0"/>
+        <w:tblLook w:firstColumn="1" w:firstRow="1" w:lastColumn="0" w:lastRow="0" w:noHBand="0" w:noVBand="1" w:val="04A0"/>
+      </w:tblPr>
+      <w:tblGrid>
+        <w:gridCol w:w="4320"/>
+        <w:gridCol w:w="4320"/>
+      </w:tblGrid>
+      <w:tr>
+        <w:tc>
+          <w:tcPr>
+            <w:tcW w:type="dxa" w:w="4320"/>
+          </w:tcPr>
+          <w:p>
+            <w:r>
+              <w:t>Element</w:t>
+            </w:r>
+          </w:p>
+        </w:tc>
+        <w:tc>
+          <w:tcPr>
+            <w:tcW w:type="dxa" w:w="4320"/>
+          </w:tcPr>
+          <w:p>
+            <w:r>
+              <w:t>Specification</w:t>
+            </w:r>
+          </w:p>
+        </w:tc>
+      </w:tr>
+      <w:tr>
+        <w:tc>
+          <w:tcPr>
+            <w:tcW w:type="dxa" w:w="4320"/>
+          </w:tcPr>
+          <w:p>
+            <w:r>
+              <w:t>Background</w:t>
+            </w:r>
+          </w:p>
+        </w:tc>
+        <w:tc>
+          <w:tcPr>
+            <w:tcW w:type="dxa" w:w="4320"/>
+          </w:tcPr>
+          <w:p>
+            <w:r>
+              <w:t>#1282C6</w:t>
+            </w:r>
+          </w:p>
+        </w:tc>
+      </w:tr>
+      <w:tr>
+        <w:tc>
+          <w:tcPr>
+            <w:tcW w:type="dxa" w:w="4320"/>
+          </w:tcPr>
+          <w:p>
+            <w:r>
+              <w:t>Text Color</w:t>
+            </w:r>
+          </w:p>
+        </w:tc>
+        <w:tc>
+          <w:tcPr>
+            <w:tcW w:type="dxa" w:w="4320"/>
+          </w:tcPr>
+          <w:p>
+            <w:r>
+              <w:t>#FFFFFF</w:t>
             </w:r>
           </w:p>
         </w:tc>

</xml_diff>